<commit_message>
Rebuild PDF + DOCX with widened body text (responsible-ai)
Regenerates docs/Instats - Responsible AI in Academic Research.{pdf,docx}
and the corresponding index.instats.html + manifest from updated CSS
(commit d77c315). No content changes; layout only.
</commit_message>
<xml_diff>
--- a/docs/Instats - Responsible AI in Academic Research.docx
+++ b/docs/Instats - Responsible AI in Academic Research.docx
@@ -149,7 +149,7 @@
       </w:r>
       <w:r>
         <w:rPr/>
-        <w:t xml:space="preserve"> Instats Policy Series, v1.2.4. </w:t>
+        <w:t xml:space="preserve"> Instats Policy Series. </w:t>
       </w:r>
       <w:hyperlink r:id="rId4">
         <w:r>
@@ -174,6 +174,115 @@
       <w:r>
         <w:rPr/>
         <w:t>. DOI: 10.61700/t31oy23grr.</w:t>
+      </w:r>
+    </w:p>
+    <w:p>
+      <w:pPr>
+        <w:pStyle w:val="BodyText"/>
+        <w:rPr/>
+      </w:pPr>
+      <w:r>
+        <w:rPr>
+          <w:b/>
+          <w:bCs/>
+        </w:rPr>
+        <w:t>Available as</w:t>
+      </w:r>
+      <w:r>
+        <w:rPr/>
+        <w:t xml:space="preserve"> </w:t>
+      </w:r>
+      <w:r>
+        <w:rPr>
+          <w:b/>
+          <w:bCs/>
+        </w:rPr>
+        <w:t>HTML</w:t>
+      </w:r>
+      <w:r>
+        <w:rPr/>
+        <w:t xml:space="preserve"> (</w:t>
+      </w:r>
+      <w:hyperlink r:id="rId6">
+        <w:r>
+          <w:rPr>
+            <w:rStyle w:val="Hyperlink"/>
+          </w:rPr>
+          <w:t>Pages mirror</w:t>
+        </w:r>
+      </w:hyperlink>
+      <w:r>
+        <w:rPr/>
+        <w:t xml:space="preserve">), </w:t>
+      </w:r>
+      <w:r>
+        <w:rPr>
+          <w:b/>
+          <w:bCs/>
+        </w:rPr>
+        <w:t>PDF</w:t>
+      </w:r>
+      <w:r>
+        <w:rPr/>
+        <w:t xml:space="preserve"> (</w:t>
+      </w:r>
+      <w:hyperlink r:id="rId7">
+        <w:r>
+          <w:rPr>
+            <w:rStyle w:val="Hyperlink"/>
+          </w:rPr>
+          <w:t>direct download</w:t>
+        </w:r>
+      </w:hyperlink>
+      <w:r>
+        <w:rPr/>
+        <w:t xml:space="preserve">), </w:t>
+      </w:r>
+      <w:r>
+        <w:rPr>
+          <w:b/>
+          <w:bCs/>
+        </w:rPr>
+        <w:t>Word</w:t>
+      </w:r>
+      <w:r>
+        <w:rPr/>
+        <w:t xml:space="preserve"> (</w:t>
+      </w:r>
+      <w:hyperlink r:id="rId8">
+        <w:r>
+          <w:rPr>
+            <w:rStyle w:val="Hyperlink"/>
+          </w:rPr>
+          <w:t>direct download</w:t>
+        </w:r>
+      </w:hyperlink>
+      <w:r>
+        <w:rPr/>
+        <w:t xml:space="preserve">), and </w:t>
+      </w:r>
+      <w:r>
+        <w:rPr>
+          <w:b/>
+          <w:bCs/>
+        </w:rPr>
+        <w:t>source repository</w:t>
+      </w:r>
+      <w:r>
+        <w:rPr/>
+        <w:t xml:space="preserve"> (</w:t>
+      </w:r>
+      <w:hyperlink r:id="rId9">
+        <w:r>
+          <w:rPr>
+            <w:rStyle w:val="Hyperlink"/>
+          </w:rPr>
+          <w:t>GitHub</w:t>
+        </w:r>
+      </w:hyperlink>
+      <w:r>
+        <w:rPr/>
+        <w:t>).</w:t>
       </w:r>
     </w:p>
     <w:p>
@@ -368,7 +477,7 @@
                     </pic:cNvPicPr>
                   </pic:nvPicPr>
                   <pic:blipFill>
-                    <a:blip r:embed="rId6"/>
+                    <a:blip r:embed="rId10"/>
                     <a:stretch>
                       <a:fillRect/>
                     </a:stretch>
@@ -429,6 +538,602 @@
         <w:rPr/>
         <w:t>: publisher dossier (18 publishers + 3 preprint servers, snapshotted 2026-05-18); funder dossier (14 national research funders + the European Research Council); institutional dossier (38 top-tier doctoral universities in 15 countries and jurisdictions); Vitae RDF refresh date from vitae.ac.uk.</w:t>
       </w:r>
+      <w:bookmarkEnd w:id="0"/>
+      <w:bookmarkEnd w:id="2"/>
+    </w:p>
+    <w:p>
+      <w:pPr>
+        <w:pStyle w:val="Heading1"/>
+        <w:rPr/>
+      </w:pPr>
+      <w:bookmarkStart w:id="4" w:name="contents"/>
+      <w:r>
+        <w:rPr/>
+        <w:t>Contents</w:t>
+      </w:r>
+    </w:p>
+    <w:p>
+      <w:pPr>
+        <w:pStyle w:val="Heading4"/>
+        <w:rPr/>
+      </w:pPr>
+      <w:hyperlink w:anchor="the-finding">
+        <w:bookmarkStart w:id="5" w:name="executive-summary"/>
+        <w:r>
+          <w:rPr>
+            <w:rStyle w:val="Hyperlink"/>
+          </w:rPr>
+          <w:t>Executive summary</w:t>
+        </w:r>
+      </w:hyperlink>
+      <w:bookmarkEnd w:id="5"/>
+    </w:p>
+    <w:p>
+      <w:pPr>
+        <w:pStyle w:val="Heading4"/>
+        <w:rPr/>
+      </w:pPr>
+      <w:hyperlink w:anchor="part-1-the-factual-baseline_1">
+        <w:bookmarkStart w:id="6" w:name="part-1-the-factual-baseline"/>
+        <w:r>
+          <w:rPr>
+            <w:rStyle w:val="Hyperlink"/>
+          </w:rPr>
+          <w:t>Part 1 — The factual baseline</w:t>
+        </w:r>
+      </w:hyperlink>
+    </w:p>
+    <w:p>
+      <w:pPr>
+        <w:pStyle w:val="Compact"/>
+        <w:numPr>
+          <w:ilvl w:val="0"/>
+          <w:numId w:val="7"/>
+        </w:numPr>
+        <w:rPr/>
+      </w:pPr>
+      <w:hyperlink w:anchor="Xdf86be2fb4ae6983caa60f753da7a3b7585160b">
+        <w:r>
+          <w:rPr>
+            <w:rStyle w:val="Hyperlink"/>
+          </w:rPr>
+          <w:t>1.1   The shift in research practice, 2022 to 2026</w:t>
+        </w:r>
+      </w:hyperlink>
+    </w:p>
+    <w:p>
+      <w:pPr>
+        <w:pStyle w:val="Compact"/>
+        <w:numPr>
+          <w:ilvl w:val="0"/>
+          <w:numId w:val="7"/>
+        </w:numPr>
+        <w:rPr/>
+      </w:pPr>
+      <w:hyperlink w:anchor="Xef39ab72682dae84cefc71e63937706e29d01f9">
+        <w:r>
+          <w:rPr>
+            <w:rStyle w:val="Hyperlink"/>
+          </w:rPr>
+          <w:t>1.2   What “responsible AI use” still lacks a definition for</w:t>
+        </w:r>
+      </w:hyperlink>
+    </w:p>
+    <w:p>
+      <w:pPr>
+        <w:pStyle w:val="Compact"/>
+        <w:numPr>
+          <w:ilvl w:val="0"/>
+          <w:numId w:val="7"/>
+        </w:numPr>
+        <w:rPr/>
+      </w:pPr>
+      <w:hyperlink w:anchor="X0c4a3566b1b7587cf42a990d8449a1ff81a75dd">
+        <w:r>
+          <w:rPr>
+            <w:rStyle w:val="Hyperlink"/>
+          </w:rPr>
+          <w:t>1.3   The institutional baseline in 2026</w:t>
+        </w:r>
+      </w:hyperlink>
+      <w:bookmarkEnd w:id="6"/>
+    </w:p>
+    <w:p>
+      <w:pPr>
+        <w:pStyle w:val="Heading4"/>
+        <w:rPr/>
+      </w:pPr>
+      <w:hyperlink w:anchor="X4f9d66c4114ab910b08655494b03e6cc2bb0186">
+        <w:bookmarkStart w:id="7" w:name="X3bd643d343f2974ee01ac844e0357dfaba13ffe"/>
+        <w:r>
+          <w:rPr>
+            <w:rStyle w:val="Hyperlink"/>
+          </w:rPr>
+          <w:t>Part 2 — A five-dimension capability framework</w:t>
+        </w:r>
+      </w:hyperlink>
+    </w:p>
+    <w:p>
+      <w:pPr>
+        <w:pStyle w:val="Compact"/>
+        <w:numPr>
+          <w:ilvl w:val="0"/>
+          <w:numId w:val="7"/>
+        </w:numPr>
+        <w:rPr/>
+      </w:pPr>
+      <w:hyperlink w:anchor="Xb0410b896ac7ef6a6cbe20afd8440f8e2e34f1c">
+        <w:r>
+          <w:rPr>
+            <w:rStyle w:val="Hyperlink"/>
+          </w:rPr>
+          <w:t>2.1   Dimension 1 — Human-in-the-loop discipline</w:t>
+        </w:r>
+      </w:hyperlink>
+    </w:p>
+    <w:p>
+      <w:pPr>
+        <w:pStyle w:val="Compact"/>
+        <w:numPr>
+          <w:ilvl w:val="0"/>
+          <w:numId w:val="7"/>
+        </w:numPr>
+        <w:rPr/>
+      </w:pPr>
+      <w:hyperlink w:anchor="Xa2978b9e88e006a11ba7c882c810e9185f91c2e">
+        <w:r>
+          <w:rPr>
+            <w:rStyle w:val="Hyperlink"/>
+          </w:rPr>
+          <w:t>2.2   Dimension 2 — Responsible use in practice</w:t>
+        </w:r>
+      </w:hyperlink>
+    </w:p>
+    <w:p>
+      <w:pPr>
+        <w:pStyle w:val="Compact"/>
+        <w:numPr>
+          <w:ilvl w:val="0"/>
+          <w:numId w:val="7"/>
+        </w:numPr>
+        <w:rPr/>
+      </w:pPr>
+      <w:hyperlink w:anchor="Xf03f014728e057244187e34525d77c4ae36f76d">
+        <w:r>
+          <w:rPr>
+            <w:rStyle w:val="Hyperlink"/>
+          </w:rPr>
+          <w:t>2.3   Dimension 3 — Tooling that promotes responsible use</w:t>
+        </w:r>
+      </w:hyperlink>
+    </w:p>
+    <w:p>
+      <w:pPr>
+        <w:pStyle w:val="Compact"/>
+        <w:numPr>
+          <w:ilvl w:val="0"/>
+          <w:numId w:val="7"/>
+        </w:numPr>
+        <w:rPr/>
+      </w:pPr>
+      <w:hyperlink w:anchor="X9022f3b58da7204a1c5a692bcfe77fac557b070">
+        <w:r>
+          <w:rPr>
+            <w:rStyle w:val="Hyperlink"/>
+          </w:rPr>
+          <w:t>2.4   Dimension 4 — AI-literate humans</w:t>
+        </w:r>
+      </w:hyperlink>
+    </w:p>
+    <w:p>
+      <w:pPr>
+        <w:pStyle w:val="Compact"/>
+        <w:numPr>
+          <w:ilvl w:val="0"/>
+          <w:numId w:val="7"/>
+        </w:numPr>
+        <w:rPr/>
+      </w:pPr>
+      <w:hyperlink w:anchor="X5c66220ea38a998fd91f5afd0ef459d3a5d80b4">
+        <w:r>
+          <w:rPr>
+            <w:rStyle w:val="Hyperlink"/>
+          </w:rPr>
+          <w:t>2.5   Dimension 5 — Institutional benchmarking grid</w:t>
+        </w:r>
+      </w:hyperlink>
+      <w:bookmarkEnd w:id="7"/>
+    </w:p>
+    <w:p>
+      <w:pPr>
+        <w:pStyle w:val="Heading4"/>
+        <w:rPr/>
+      </w:pPr>
+      <w:hyperlink w:anchor="Xfaf275e331ed51ebecadb9345be19a0314acfc3">
+        <w:bookmarkStart w:id="8" w:name="Xdc77c75a62b621fcf7c8fe71c969742e2e32c4d"/>
+        <w:r>
+          <w:rPr>
+            <w:rStyle w:val="Hyperlink"/>
+          </w:rPr>
+          <w:t>Part 3 — What the international evidence shows</w:t>
+        </w:r>
+      </w:hyperlink>
+    </w:p>
+    <w:p>
+      <w:pPr>
+        <w:pStyle w:val="Compact"/>
+        <w:numPr>
+          <w:ilvl w:val="0"/>
+          <w:numId w:val="7"/>
+        </w:numPr>
+        <w:rPr/>
+      </w:pPr>
+      <w:hyperlink w:anchor="X67362a211dc18a32089bb5a92eae11abc44c983">
+        <w:r>
+          <w:rPr>
+            <w:rStyle w:val="Hyperlink"/>
+          </w:rPr>
+          <w:t>3.1   National research-funder positions</w:t>
+        </w:r>
+      </w:hyperlink>
+    </w:p>
+    <w:p>
+      <w:pPr>
+        <w:pStyle w:val="Compact"/>
+        <w:numPr>
+          <w:ilvl w:val="0"/>
+          <w:numId w:val="7"/>
+        </w:numPr>
+        <w:rPr/>
+      </w:pPr>
+      <w:hyperlink w:anchor="X409e526c0ea6449c8a9fb87a385fab88236ca99">
+        <w:r>
+          <w:rPr>
+            <w:rStyle w:val="Hyperlink"/>
+          </w:rPr>
+          <w:t>3.2   Top-tier university institutional policies</w:t>
+        </w:r>
+      </w:hyperlink>
+    </w:p>
+    <w:p>
+      <w:pPr>
+        <w:pStyle w:val="Compact"/>
+        <w:numPr>
+          <w:ilvl w:val="0"/>
+          <w:numId w:val="7"/>
+        </w:numPr>
+        <w:rPr/>
+      </w:pPr>
+      <w:hyperlink w:anchor="X58df4d38bc63fe6a1527f35cdd611f9af8daefa">
+        <w:r>
+          <w:rPr>
+            <w:rStyle w:val="Hyperlink"/>
+          </w:rPr>
+          <w:t>3.3   Publisher and journal policies</w:t>
+        </w:r>
+      </w:hyperlink>
+    </w:p>
+    <w:p>
+      <w:pPr>
+        <w:pStyle w:val="Compact"/>
+        <w:numPr>
+          <w:ilvl w:val="0"/>
+          <w:numId w:val="7"/>
+        </w:numPr>
+        <w:rPr/>
+      </w:pPr>
+      <w:hyperlink w:anchor="Xe77ed63e1e1dbfa81b73895cfdf812d8aaac6fa">
+        <w:r>
+          <w:rPr>
+            <w:rStyle w:val="Hyperlink"/>
+          </w:rPr>
+          <w:t>3.4   Existing AI-literacy and researcher-development frameworks</w:t>
+        </w:r>
+      </w:hyperlink>
+      <w:bookmarkEnd w:id="8"/>
+    </w:p>
+    <w:p>
+      <w:pPr>
+        <w:pStyle w:val="Heading4"/>
+        <w:rPr/>
+      </w:pPr>
+      <w:hyperlink w:anchor="part-4-the-maturity-grid_1">
+        <w:bookmarkStart w:id="9" w:name="part-4-the-maturity-grid"/>
+        <w:r>
+          <w:rPr>
+            <w:rStyle w:val="Hyperlink"/>
+          </w:rPr>
+          <w:t>Part 4 — The maturity grid</w:t>
+        </w:r>
+      </w:hyperlink>
+    </w:p>
+    <w:p>
+      <w:pPr>
+        <w:pStyle w:val="Compact"/>
+        <w:numPr>
+          <w:ilvl w:val="0"/>
+          <w:numId w:val="7"/>
+        </w:numPr>
+        <w:rPr/>
+      </w:pPr>
+      <w:hyperlink w:anchor="Xa2528ffc6271a3b7f8494c7574039782e296ef5">
+        <w:r>
+          <w:rPr>
+            <w:rStyle w:val="Hyperlink"/>
+          </w:rPr>
+          <w:t>4.1   The five-by-four grid</w:t>
+        </w:r>
+      </w:hyperlink>
+    </w:p>
+    <w:p>
+      <w:pPr>
+        <w:pStyle w:val="Compact"/>
+        <w:numPr>
+          <w:ilvl w:val="0"/>
+          <w:numId w:val="7"/>
+        </w:numPr>
+        <w:rPr/>
+      </w:pPr>
+      <w:hyperlink w:anchor="X2d830cf8cc8d1f050bc7fd5f5026d8fb6f7586e">
+        <w:r>
+          <w:rPr>
+            <w:rStyle w:val="Hyperlink"/>
+          </w:rPr>
+          <w:t>4.2   What “ready” looks like by dimension</w:t>
+        </w:r>
+      </w:hyperlink>
+    </w:p>
+    <w:p>
+      <w:pPr>
+        <w:pStyle w:val="Compact"/>
+        <w:numPr>
+          <w:ilvl w:val="0"/>
+          <w:numId w:val="7"/>
+        </w:numPr>
+        <w:rPr/>
+      </w:pPr>
+      <w:hyperlink w:anchor="X36abbbf7fa7a3c3143910f28c5505844b7e0b4f">
+        <w:r>
+          <w:rPr>
+            <w:rStyle w:val="Hyperlink"/>
+          </w:rPr>
+          <w:t>4.3   Worked institutional examples</w:t>
+        </w:r>
+      </w:hyperlink>
+      <w:bookmarkEnd w:id="9"/>
+    </w:p>
+    <w:p>
+      <w:pPr>
+        <w:pStyle w:val="Heading4"/>
+        <w:rPr/>
+      </w:pPr>
+      <w:hyperlink w:anchor="Xa1dfcb691ac0c1297bce0e5e7c4e1d6d6dc6ae7">
+        <w:bookmarkStart w:id="10" w:name="Xade74cb8c91f1bbf3902d8c6c15257bafa8604c"/>
+        <w:r>
+          <w:rPr>
+            <w:rStyle w:val="Hyperlink"/>
+          </w:rPr>
+          <w:t>Part 5 — Recommendations for university research leadership</w:t>
+        </w:r>
+      </w:hyperlink>
+    </w:p>
+    <w:p>
+      <w:pPr>
+        <w:pStyle w:val="Compact"/>
+        <w:numPr>
+          <w:ilvl w:val="0"/>
+          <w:numId w:val="7"/>
+        </w:numPr>
+        <w:rPr/>
+      </w:pPr>
+      <w:hyperlink w:anchor="X637bbf0db3ca7ba96c0636057322e2f0dd6c2b8">
+        <w:r>
+          <w:rPr>
+            <w:rStyle w:val="Hyperlink"/>
+          </w:rPr>
+          <w:t>5.1   For executive research leadership</w:t>
+        </w:r>
+      </w:hyperlink>
+    </w:p>
+    <w:p>
+      <w:pPr>
+        <w:pStyle w:val="Compact"/>
+        <w:numPr>
+          <w:ilvl w:val="0"/>
+          <w:numId w:val="7"/>
+        </w:numPr>
+        <w:rPr/>
+      </w:pPr>
+      <w:hyperlink w:anchor="X4df49f9c2fdee26b5106621f4e6bae7f77c10a2">
+        <w:r>
+          <w:rPr>
+            <w:rStyle w:val="Hyperlink"/>
+          </w:rPr>
+          <w:t>5.2   For faculty deans and associate deans of research</w:t>
+        </w:r>
+      </w:hyperlink>
+    </w:p>
+    <w:p>
+      <w:pPr>
+        <w:pStyle w:val="Compact"/>
+        <w:numPr>
+          <w:ilvl w:val="0"/>
+          <w:numId w:val="7"/>
+        </w:numPr>
+        <w:rPr/>
+      </w:pPr>
+      <w:hyperlink w:anchor="X01a7ced067d8590f8de445e51dcb8ba28790c83">
+        <w:r>
+          <w:rPr>
+            <w:rStyle w:val="Hyperlink"/>
+          </w:rPr>
+          <w:t>5.3   For deans of graduate schools and A/Deans of research training</w:t>
+        </w:r>
+      </w:hyperlink>
+    </w:p>
+    <w:p>
+      <w:pPr>
+        <w:pStyle w:val="Compact"/>
+        <w:numPr>
+          <w:ilvl w:val="0"/>
+          <w:numId w:val="7"/>
+        </w:numPr>
+        <w:rPr/>
+      </w:pPr>
+      <w:hyperlink w:anchor="Xaf1c59110ac2d2b00da69a4f26feb31fdf6efc6">
+        <w:r>
+          <w:rPr>
+            <w:rStyle w:val="Hyperlink"/>
+          </w:rPr>
+          <w:t>5.4   For higher-degrees committees and research-integrity committees</w:t>
+        </w:r>
+      </w:hyperlink>
+    </w:p>
+    <w:p>
+      <w:pPr>
+        <w:pStyle w:val="Compact"/>
+        <w:numPr>
+          <w:ilvl w:val="0"/>
+          <w:numId w:val="7"/>
+        </w:numPr>
+        <w:rPr/>
+      </w:pPr>
+      <w:hyperlink w:anchor="X3344b8117abe35e69dffb3d8223ef8b3371967a">
+        <w:r>
+          <w:rPr>
+            <w:rStyle w:val="Hyperlink"/>
+          </w:rPr>
+          <w:t>5.5   For peak bodies for graduate students</w:t>
+        </w:r>
+      </w:hyperlink>
+      <w:bookmarkEnd w:id="10"/>
+    </w:p>
+    <w:p>
+      <w:pPr>
+        <w:pStyle w:val="Heading4"/>
+        <w:rPr/>
+      </w:pPr>
+      <w:hyperlink w:anchor="conclusion_1">
+        <w:bookmarkStart w:id="11" w:name="conclusion"/>
+        <w:r>
+          <w:rPr>
+            <w:rStyle w:val="Hyperlink"/>
+          </w:rPr>
+          <w:t>Conclusion</w:t>
+        </w:r>
+      </w:hyperlink>
+      <w:bookmarkEnd w:id="11"/>
+    </w:p>
+    <w:p>
+      <w:pPr>
+        <w:pStyle w:val="Heading4"/>
+        <w:rPr/>
+      </w:pPr>
+      <w:hyperlink w:anchor="X58efa211c38677f6721adc2049a1ec624e0c3e5">
+        <w:bookmarkStart w:id="12" w:name="Xacafc5f6c5affb2bcbe0c710c92c025823d84b1"/>
+        <w:r>
+          <w:rPr>
+            <w:rStyle w:val="Hyperlink"/>
+          </w:rPr>
+          <w:t>Appendix A — The maturity grid, full version</w:t>
+        </w:r>
+      </w:hyperlink>
+      <w:bookmarkEnd w:id="12"/>
+    </w:p>
+    <w:p>
+      <w:pPr>
+        <w:pStyle w:val="Heading4"/>
+        <w:rPr/>
+      </w:pPr>
+      <w:hyperlink w:anchor="X30a15aa0718d80bdea4e1d3776a0ba9becb19b9">
+        <w:bookmarkStart w:id="13" w:name="Xa4fff6b6df5f7a3b09445c229bc4b09ed80ee37"/>
+        <w:r>
+          <w:rPr>
+            <w:rStyle w:val="Hyperlink"/>
+          </w:rPr>
+          <w:t>Appendix B — Country and institutional dossiers</w:t>
+        </w:r>
+      </w:hyperlink>
+      <w:bookmarkEnd w:id="13"/>
+    </w:p>
+    <w:p>
+      <w:pPr>
+        <w:pStyle w:val="Heading4"/>
+        <w:rPr/>
+      </w:pPr>
+      <w:hyperlink w:anchor="appendix-c-glossary-of-ai-tool-classes_1">
+        <w:bookmarkStart w:id="14" w:name="appendix-c-glossary-of-ai-tool-classes"/>
+        <w:r>
+          <w:rPr>
+            <w:rStyle w:val="Hyperlink"/>
+          </w:rPr>
+          <w:t>Appendix C — Glossary of AI tool classes</w:t>
+        </w:r>
+      </w:hyperlink>
+      <w:bookmarkEnd w:id="14"/>
+    </w:p>
+    <w:p>
+      <w:pPr>
+        <w:pStyle w:val="Heading4"/>
+        <w:rPr/>
+      </w:pPr>
+      <w:hyperlink w:anchor="appendix-d-about-this-report_1">
+        <w:bookmarkStart w:id="15" w:name="appendix-d-about-this-report"/>
+        <w:r>
+          <w:rPr>
+            <w:rStyle w:val="Hyperlink"/>
+          </w:rPr>
+          <w:t>Appendix D — About this report</w:t>
+        </w:r>
+      </w:hyperlink>
+      <w:bookmarkEnd w:id="15"/>
+    </w:p>
+    <w:p>
+      <w:pPr>
+        <w:pStyle w:val="Heading4"/>
+        <w:rPr/>
+      </w:pPr>
+      <w:hyperlink w:anchor="appendix-e-sources_1">
+        <w:bookmarkStart w:id="16" w:name="appendix-e-sources"/>
+        <w:r>
+          <w:rPr>
+            <w:rStyle w:val="Hyperlink"/>
+          </w:rPr>
+          <w:t>Appendix E — Sources</w:t>
+        </w:r>
+      </w:hyperlink>
+      <w:bookmarkEnd w:id="16"/>
+    </w:p>
+    <w:p>
+      <w:pPr>
+        <w:pStyle w:val="Heading4"/>
+        <w:rPr/>
+      </w:pPr>
+      <w:hyperlink w:anchor="appendix-f-regional-adaptation-note_1">
+        <w:bookmarkStart w:id="17" w:name="appendix-f-regional-adaptation-note"/>
+        <w:r>
+          <w:rPr>
+            <w:rStyle w:val="Hyperlink"/>
+          </w:rPr>
+          <w:t>Appendix F — Regional-adaptation note</w:t>
+        </w:r>
+      </w:hyperlink>
+      <w:bookmarkEnd w:id="17"/>
+    </w:p>
+    <w:p>
+      <w:pPr>
+        <w:pStyle w:val="Heading4"/>
+        <w:rPr/>
+      </w:pPr>
+      <w:hyperlink w:anchor="Xbed8346cde3d6a4651c2d5c0a174b243c58d415">
+        <w:bookmarkStart w:id="18" w:name="X62e7b9ee26ca01e0177273e17f9dc12e4526de9"/>
+        <w:r>
+          <w:rPr>
+            <w:rStyle w:val="Hyperlink"/>
+          </w:rPr>
+          <w:t>Appendix G — Labour-vs-judgement task taxonomy</w:t>
+        </w:r>
+      </w:hyperlink>
     </w:p>
     <w:p>
       <w:pPr>
@@ -490,50 +1195,485 @@
           </mc:Fallback>
         </mc:AlternateContent>
       </w:r>
-      <w:bookmarkEnd w:id="0"/>
-      <w:bookmarkEnd w:id="2"/>
-    </w:p>
-    <w:p>
-      <w:pPr>
-        <w:pStyle w:val="Heading1"/>
-        <w:rPr/>
-      </w:pPr>
-      <w:bookmarkStart w:id="4" w:name="contents"/>
-      <w:r>
-        <w:rPr/>
-        <w:t>Contents</w:t>
-      </w:r>
-    </w:p>
-    <w:p>
-      <w:pPr>
-        <w:pStyle w:val="Heading4"/>
-        <w:rPr/>
-      </w:pPr>
-      <w:hyperlink w:anchor="the-finding">
-        <w:bookmarkStart w:id="5" w:name="executive-summary"/>
-        <w:r>
-          <w:rPr>
-            <w:rStyle w:val="Hyperlink"/>
-          </w:rPr>
-          <w:t>Executive summary</w:t>
-        </w:r>
-      </w:hyperlink>
-      <w:bookmarkEnd w:id="5"/>
-    </w:p>
-    <w:p>
-      <w:pPr>
-        <w:pStyle w:val="Heading4"/>
-        <w:rPr/>
-      </w:pPr>
-      <w:hyperlink w:anchor="part-1-the-factual-baseline_1">
-        <w:bookmarkStart w:id="6" w:name="part-1-the-factual-baseline"/>
-        <w:r>
-          <w:rPr>
-            <w:rStyle w:val="Hyperlink"/>
-          </w:rPr>
-          <w:t>Part 1 — The factual baseline</w:t>
-        </w:r>
-      </w:hyperlink>
+      <w:bookmarkEnd w:id="18"/>
+    </w:p>
+    <w:p>
+      <w:pPr>
+        <w:pStyle w:val="Heading2"/>
+        <w:rPr/>
+      </w:pPr>
+      <w:bookmarkStart w:id="19" w:name="part-1-the-factual-baseline-1"/>
+      <w:r>
+        <w:rPr/>
+        <w:t>Part 1 — The factual baseline</w:t>
+      </w:r>
+    </w:p>
+    <w:p>
+      <w:pPr>
+        <w:pStyle w:val="Heading3"/>
+        <w:rPr/>
+      </w:pPr>
+      <w:bookmarkStart w:id="20" w:name="X25f912980d44fa8a235942a34c9340eb32a665f"/>
+      <w:r>
+        <w:rPr/>
+        <w:t>1.1 The shift in research practice, 2022 to 2026</w:t>
+      </w:r>
+    </w:p>
+    <w:p>
+      <w:pPr>
+        <w:pStyle w:val="FirstParagraph"/>
+        <w:rPr/>
+      </w:pPr>
+      <w:r>
+        <w:rPr/>
+        <w:t xml:space="preserve">ChatGPT-3.5 launched for broad public use on 30 November 2022. By the end of the first quarter of 2023, every major academic publisher had a position on AI co-authorship: Nature on 24 January, </w:t>
+      </w:r>
+      <w:r>
+        <w:rPr>
+          <w:i/>
+          <w:iCs/>
+        </w:rPr>
+        <w:t>Science</w:t>
+      </w:r>
+      <w:r>
+        <w:rPr/>
+        <w:t xml:space="preserve"> on 26 January, JAMA in February, arXiv on 31 January, Cambridge University Press on 14 March, Elsevier in March, ACM in April. The substantive rule was identical at all of them: AI cannot be listed as an author or co-author of a scholarly work, because it cannot bear responsibility for the work. Cambridge University Press’s managing director Mandy Hill captured the consensus at the time: “It’s obvious that tools like ChatGPT cannot and should not be treated as authors.”</w:t>
+      </w:r>
+      <w:r>
+        <w:rPr>
+          <w:rFonts w:ascii="Inter" w:hAnsi="Inter" w:cs="Inter"/>
+          <w:b/>
+          <w:color w:val="3092B1"/>
+          <w:position w:val="8"/>
+          <w:sz w:val="18"/>
+          <w:szCs w:val="18"/>
+          <w:vertAlign w:val="superscript"/>
+        </w:rPr>
+        <w:footnoteReference w:id="2"/>
+      </w:r>
+    </w:p>
+    <w:p>
+      <w:pPr>
+        <w:pStyle w:val="BodyText"/>
+        <w:rPr/>
+      </w:pPr>
+      <w:r>
+        <w:rPr/>
+        <w:t>The policy speed was unusually fast compared with the years-long convergence of prior publisher-policy adoptions on adjacent surfaces. Cross-publisher convergences (predatory-publishing rules, alignment with the International Committee of Medical Journal Editors authorship criteria, the Committee on Publication Ethics post-publication review protocols) typically take years to settle. The no-AI-co-authors convergence took ten weeks.</w:t>
+      </w:r>
+      <w:r>
+        <w:rPr>
+          <w:rFonts w:ascii="Inter" w:hAnsi="Inter" w:cs="Inter"/>
+          <w:b/>
+          <w:color w:val="3092B1"/>
+          <w:position w:val="8"/>
+          <w:sz w:val="18"/>
+          <w:szCs w:val="18"/>
+          <w:vertAlign w:val="superscript"/>
+        </w:rPr>
+        <w:footnoteReference w:id="3"/>
+      </w:r>
+    </w:p>
+    <w:p>
+      <w:pPr>
+        <w:pStyle w:val="BodyText"/>
+        <w:rPr/>
+      </w:pPr>
+      <w:r>
+        <w:rPr/>
+        <w:t>Funder responses followed more slowly. The German Research Foundation issued its executive-committee statement on 21 September 2023; UK Research and Innovation issued a joint funder statement in September 2023 and a formal policy on 23 September 2024; the National Science Foundation’s notice to the research community is dated 14 December 2023; the National Institutes of Health peer-review prohibition (NOT-OD-23-149) is dated 23 June 2023 and the applicant-side originality bar (NOT-OD-25-132) followed in mid-2025. The Netherlands Organisation for Scientific Research issued its policy on 20 January 2025. The European Research Council’s evaluation-side policy followed in March 2026. The Australian Research Council and the National Health and Medical Research Council issued the most recent of the major funder positions on 28 April 2026.</w:t>
+      </w:r>
+      <w:r>
+        <w:rPr>
+          <w:rFonts w:ascii="Inter" w:hAnsi="Inter" w:cs="Inter"/>
+          <w:b/>
+          <w:color w:val="3092B1"/>
+          <w:position w:val="8"/>
+          <w:sz w:val="18"/>
+          <w:szCs w:val="18"/>
+          <w:vertAlign w:val="superscript"/>
+        </w:rPr>
+        <w:footnoteReference w:id="4"/>
+      </w:r>
+    </w:p>
+    <w:p>
+      <w:pPr>
+        <w:pStyle w:val="BodyText"/>
+        <w:rPr/>
+      </w:pPr>
+      <w:r>
+        <w:rPr/>
+        <w:t>In the same window, the underlying research practice changed. Nature’s 2023 and 2024 surveys of researcher AI use, the AAU and APLU joint studies on graduate-student AI behaviour, and discipline-specific journal-wide reviews together describe a shift from a curiosity question in 2023 to an embedded-practice question by 2025. AI assistance is now part of literature review at scale, part of code-development at scale, part of drafting at scale, and increasingly part of statistical reasoning and methodological design at scale. The arXiv preprint server’s own moderation team reported a 72 per cent increase in arXiv submissions that may be partly AI-written between ChatGPT’s release and a 2025 internal study.</w:t>
+      </w:r>
+      <w:r>
+        <w:rPr>
+          <w:rFonts w:ascii="Inter" w:hAnsi="Inter" w:cs="Inter"/>
+          <w:b/>
+          <w:color w:val="3092B1"/>
+          <w:position w:val="8"/>
+          <w:sz w:val="18"/>
+          <w:szCs w:val="18"/>
+          <w:vertAlign w:val="superscript"/>
+        </w:rPr>
+        <w:footnoteReference w:id="5"/>
+      </w:r>
+      <w:r>
+        <w:rPr/>
+        <w:t xml:space="preserve"> The British Medical Journal’s structured submission-form disclosure field, introduced on 8 April 2024 as the first publisher to implement structured submission-form disclosure of this kind (publishers had used text-based disclosure-on-submission rules from January 2023 onwards), registered a 5.7 per cent disclosure rate across 25,114 submissions to 49 BMJ journals in the seven months that followed.</w:t>
+      </w:r>
+      <w:r>
+        <w:rPr>
+          <w:rFonts w:ascii="Inter" w:hAnsi="Inter" w:cs="Inter"/>
+          <w:b/>
+          <w:color w:val="3092B1"/>
+          <w:position w:val="8"/>
+          <w:sz w:val="18"/>
+          <w:szCs w:val="18"/>
+          <w:vertAlign w:val="superscript"/>
+        </w:rPr>
+        <w:footnoteReference w:id="6"/>
+      </w:r>
+      <w:r>
+        <w:rPr/>
+        <w:t xml:space="preserve"> The disclosure rate is low, but the trajectory is positive; the gap between use and disclosure is the structural signal.</w:t>
+      </w:r>
+    </w:p>
+    <w:p>
+      <w:pPr>
+        <w:pStyle w:val="BodyText"/>
+        <w:rPr/>
+      </w:pPr>
+      <w:r>
+        <w:rPr/>
+        <w:t>That is the gap this report addresses: research practice has changed faster than university policy has defined responsible AI use in PhD training.</w:t>
+      </w:r>
+      <w:bookmarkEnd w:id="20"/>
+    </w:p>
+    <w:p>
+      <w:pPr>
+        <w:pStyle w:val="Heading3"/>
+        <w:rPr/>
+      </w:pPr>
+      <w:bookmarkStart w:id="21" w:name="X249cd8f8d3611a5f7cf9a267ae9e027e6df62ea"/>
+      <w:r>
+        <w:rPr/>
+        <w:t>1.2 What “responsible AI use” still lacks a definition for</w:t>
+      </w:r>
+    </w:p>
+    <w:p>
+      <w:pPr>
+        <w:pStyle w:val="FirstParagraph"/>
+        <w:rPr/>
+      </w:pPr>
+      <w:r>
+        <w:rPr/>
+        <w:t>Five years into the modern AI era, the phrase “responsible AI use” is in every funder policy, every publisher policy, every institutional policy, and every capability framework. The phrase is not in serious dispute. Its operational meaning is.</w:t>
+      </w:r>
+    </w:p>
+    <w:p>
+      <w:pPr>
+        <w:pStyle w:val="BodyText"/>
+        <w:rPr/>
+      </w:pPr>
+      <w:r>
+        <w:rPr/>
+        <w:t>Across the fourteen national research funders surveyed, “responsible AI use” most often points outward, to host-institution policy and to umbrella research-integrity codes. The German Research Foundation, for instance, requires that researchers “must ensure that the use of generative models does not infringe anyone else’s intellectual property and does not result in scientific misconduct, for example in the form of plagiarism.”</w:t>
+      </w:r>
+      <w:r>
+        <w:rPr>
+          <w:rFonts w:ascii="Inter" w:hAnsi="Inter" w:cs="Inter"/>
+          <w:b/>
+          <w:color w:val="3092B1"/>
+          <w:position w:val="8"/>
+          <w:sz w:val="18"/>
+          <w:szCs w:val="18"/>
+          <w:vertAlign w:val="superscript"/>
+        </w:rPr>
+        <w:footnoteReference w:id="7"/>
+      </w:r>
+      <w:r>
+        <w:rPr/>
+        <w:t xml:space="preserve"> The Australian Research Council and the National Health and Medical Research Council, in their April 2026 joint policy, state that “AI-generated content must be verified and should not replace expert opinion or judgement.”</w:t>
+      </w:r>
+      <w:r>
+        <w:rPr>
+          <w:rFonts w:ascii="Inter" w:hAnsi="Inter" w:cs="Inter"/>
+          <w:b/>
+          <w:color w:val="3092B1"/>
+          <w:position w:val="8"/>
+          <w:sz w:val="18"/>
+          <w:szCs w:val="18"/>
+          <w:vertAlign w:val="superscript"/>
+        </w:rPr>
+        <w:footnoteReference w:id="8"/>
+      </w:r>
+      <w:r>
+        <w:rPr/>
+        <w:t xml:space="preserve"> Both formulations are unobjectionable. Neither tells a PhD candidate or a PhD supervisor what to do on Monday morning when an AI tool returns a plausible-looking citation list, a plausible-looking explanation of a statistical assumption, or a plausible-looking interpretation of an experimental result.</w:t>
+      </w:r>
+    </w:p>
+    <w:p>
+      <w:pPr>
+        <w:pStyle w:val="BodyText"/>
+        <w:rPr/>
+      </w:pPr>
+      <w:r>
+        <w:rPr/>
+        <w:t>Publisher policies converge on disclosure: where in the manuscript to acknowledge AI use, in what format, and with what specificity. Elsevier’s mandated section, “Declaration of Generative AI and AI-assisted technologies in the writing process,” sits “immediately above the references.”</w:t>
+      </w:r>
+      <w:r>
+        <w:rPr>
+          <w:rFonts w:ascii="Inter" w:hAnsi="Inter" w:cs="Inter"/>
+          <w:b/>
+          <w:color w:val="3092B1"/>
+          <w:position w:val="8"/>
+          <w:sz w:val="18"/>
+          <w:szCs w:val="18"/>
+          <w:vertAlign w:val="superscript"/>
+        </w:rPr>
+        <w:footnoteReference w:id="9"/>
+      </w:r>
+      <w:r>
+        <w:rPr/>
+        <w:t xml:space="preserve"> Cell Press places its analogous declaration “after the declaration of interests.”</w:t>
+      </w:r>
+      <w:r>
+        <w:rPr>
+          <w:rFonts w:ascii="Inter" w:hAnsi="Inter" w:cs="Inter"/>
+          <w:b/>
+          <w:color w:val="3092B1"/>
+          <w:position w:val="8"/>
+          <w:sz w:val="18"/>
+          <w:szCs w:val="18"/>
+          <w:vertAlign w:val="superscript"/>
+        </w:rPr>
+        <w:footnoteReference w:id="10"/>
+      </w:r>
+      <w:r>
+        <w:rPr/>
+        <w:t xml:space="preserve"> JAMA requires disclosure in three locations, an explicit author affirmation that AI “had no involvement in shaping the intellectual content,” and an acknowledgement of the AI tool’s “potential limitations.”</w:t>
+      </w:r>
+      <w:r>
+        <w:rPr>
+          <w:rFonts w:ascii="Inter" w:hAnsi="Inter" w:cs="Inter"/>
+          <w:b/>
+          <w:color w:val="3092B1"/>
+          <w:position w:val="8"/>
+          <w:sz w:val="18"/>
+          <w:szCs w:val="18"/>
+          <w:vertAlign w:val="superscript"/>
+        </w:rPr>
+        <w:footnoteReference w:id="11"/>
+      </w:r>
+      <w:r>
+        <w:rPr/>
+        <w:t xml:space="preserve"> The Public Library of Science’s policy is alone in mandating reviewer-to-author disclosure: a reviewer who used AI in preparing review comments must disclose that use “to authors in the review form,” not only to the editor.</w:t>
+      </w:r>
+      <w:r>
+        <w:rPr>
+          <w:rFonts w:ascii="Inter" w:hAnsi="Inter" w:cs="Inter"/>
+          <w:b/>
+          <w:color w:val="3092B1"/>
+          <w:position w:val="8"/>
+          <w:sz w:val="18"/>
+          <w:szCs w:val="18"/>
+          <w:vertAlign w:val="superscript"/>
+        </w:rPr>
+        <w:footnoteReference w:id="12"/>
+      </w:r>
+      <w:r>
+        <w:rPr/>
+        <w:t xml:space="preserve"> While the disclosure anchor is clear, the reader must still judge whether the disclosed AI use was responsible, valid, and ethically defensible.</w:t>
+      </w:r>
+    </w:p>
+    <w:p>
+      <w:pPr>
+        <w:pStyle w:val="BodyText"/>
+        <w:rPr/>
+      </w:pPr>
+      <w:r>
+        <w:rPr/>
+        <w:t>The existing AI-literacy literature frames responsibility as principle-based. UNESCO’s AI Competency Framework for Students names “Ethics of AI” as one of four dimensions and operationalises it as “ethical value judgements, embodied reflections, and social and emotional skills students require to navigate … principles and regulatory rules.”</w:t>
+      </w:r>
+      <w:r>
+        <w:rPr>
+          <w:rFonts w:ascii="Inter" w:hAnsi="Inter" w:cs="Inter"/>
+          <w:b/>
+          <w:color w:val="3092B1"/>
+          <w:position w:val="8"/>
+          <w:sz w:val="18"/>
+          <w:szCs w:val="18"/>
+          <w:vertAlign w:val="superscript"/>
+        </w:rPr>
+        <w:footnoteReference w:id="13"/>
+      </w:r>
+      <w:r>
+        <w:rPr/>
+        <w:t xml:space="preserve"> The Council of Graduate Schools and Institut national de la recherche scientifique Global Action Agenda, published November 2025, lists seven guiding principles, of which three carry the responsible-use weight: “Integrity,” “Transparency,” and “Responsibility and Accountability.”</w:t>
+      </w:r>
+      <w:r>
+        <w:rPr>
+          <w:rFonts w:ascii="Inter" w:hAnsi="Inter" w:cs="Inter"/>
+          <w:b/>
+          <w:color w:val="3092B1"/>
+          <w:position w:val="8"/>
+          <w:sz w:val="18"/>
+          <w:szCs w:val="18"/>
+          <w:vertAlign w:val="superscript"/>
+        </w:rPr>
+        <w:footnoteReference w:id="14"/>
+      </w:r>
+      <w:r>
+        <w:rPr/>
+        <w:t xml:space="preserve"> The Blau et al. PNAS editorial of May 2024, written for the broader scientific community by the US National Academies, names five principles: transparent disclosure and attribution; verification of AI-generated content and analyses; documentation of AI-generated data; ethics and equity; and continuous monitoring, oversight, and public engagement.</w:t>
+      </w:r>
+      <w:r>
+        <w:rPr>
+          <w:rFonts w:ascii="Inter" w:hAnsi="Inter" w:cs="Inter"/>
+          <w:b/>
+          <w:color w:val="3092B1"/>
+          <w:position w:val="8"/>
+          <w:sz w:val="18"/>
+          <w:szCs w:val="18"/>
+          <w:vertAlign w:val="superscript"/>
+        </w:rPr>
+        <w:footnoteReference w:id="15"/>
+      </w:r>
+      <w:r>
+        <w:rPr/>
+        <w:t xml:space="preserve"> All three frameworks specify what responsible AI use looks like in </w:t>
+      </w:r>
+      <w:r>
+        <w:rPr>
+          <w:i/>
+          <w:iCs/>
+        </w:rPr>
+        <w:t>principle</w:t>
+      </w:r>
+      <w:r>
+        <w:rPr/>
+        <w:t xml:space="preserve">. None specifies what it looks like in </w:t>
+      </w:r>
+      <w:r>
+        <w:rPr>
+          <w:i/>
+          <w:iCs/>
+        </w:rPr>
+        <w:t>practice</w:t>
+      </w:r>
+      <w:r>
+        <w:rPr/>
+        <w:t>: what a responsible literature-synthesis workflow consists of, what a methods-section disclosure should include for a specific class of AI tool, what an examiner should check during a viva voce, what a supervisor should ask a candidate to demonstrate before accepting an AI-augmented analysis chapter into a thesis.</w:t>
+      </w:r>
+    </w:p>
+    <w:p>
+      <w:pPr>
+        <w:pStyle w:val="BodyText"/>
+        <w:rPr/>
+      </w:pPr>
+      <w:r>
+        <w:rPr/>
+        <w:t>The vacuum is not the absence of principles. It is the absence of the operational specification between principle and practice. The five-dimension framework in Part 2 is built to be that operational specification.</w:t>
+      </w:r>
+    </w:p>
+    <w:p>
+      <w:pPr>
+        <w:pStyle w:val="BodyText"/>
+        <w:rPr/>
+      </w:pPr>
+      <w:r>
+        <w:rPr/>
+        <w:t xml:space="preserve">By “responsible,” this report means AI use that is </w:t>
+      </w:r>
+      <w:r>
+        <w:rPr>
+          <w:i/>
+          <w:iCs/>
+        </w:rPr>
+        <w:t>ethical, valid, reproducible, and transparent</w:t>
+      </w:r>
+      <w:r>
+        <w:rPr/>
+        <w:t xml:space="preserve">. These four are not arbitrary; they are the conditions under which AI-augmented research remains research. </w:t>
+      </w:r>
+      <w:r>
+        <w:rPr>
+          <w:i/>
+          <w:iCs/>
+        </w:rPr>
+        <w:t>Ethical</w:t>
+      </w:r>
+      <w:r>
+        <w:rPr/>
+        <w:t xml:space="preserve"> use does not harm research participants, affected communities, or third parties whose data is processed. </w:t>
+      </w:r>
+      <w:r>
+        <w:rPr>
+          <w:i/>
+          <w:iCs/>
+        </w:rPr>
+        <w:t>Valid</w:t>
+      </w:r>
+      <w:r>
+        <w:rPr/>
+        <w:t xml:space="preserve"> use means the inferences AI helps produce meet the same methodological and evidentiary standards as human-produced inferences, including assumption-checking, sensitivity analysis, and replication. </w:t>
+      </w:r>
+      <w:r>
+        <w:rPr>
+          <w:i/>
+          <w:iCs/>
+        </w:rPr>
+        <w:t>Reproducible</w:t>
+      </w:r>
+      <w:r>
+        <w:rPr/>
+        <w:t xml:space="preserve"> use means another researcher with access to the same inputs, prompts, parameters, and tool version can reproduce the output to a stated tolerance. </w:t>
+      </w:r>
+      <w:r>
+        <w:rPr>
+          <w:i/>
+          <w:iCs/>
+        </w:rPr>
+        <w:t>Transparent</w:t>
+      </w:r>
+      <w:r>
+        <w:rPr/>
+        <w:t xml:space="preserve"> use means AI’s role is disclosed with enough specificity for supervisors, examiners, reviewers, and readers to assess it. These four properties are necessary together; no three substitute for the fourth.</w:t>
+      </w:r>
+      <w:bookmarkEnd w:id="21"/>
+    </w:p>
+    <w:p>
+      <w:pPr>
+        <w:pStyle w:val="Heading3"/>
+        <w:rPr/>
+      </w:pPr>
+      <w:bookmarkStart w:id="22" w:name="the-institutional-baseline-in-2026"/>
+      <w:r>
+        <w:rPr/>
+        <w:t>1.3 The institutional baseline in 2026</w:t>
+      </w:r>
+    </w:p>
+    <w:p>
+      <w:pPr>
+        <w:pStyle w:val="FirstParagraph"/>
+        <w:rPr/>
+      </w:pPr>
+      <w:r>
+        <w:rPr/>
+        <w:t>Across thirty-eight top-tier doctoral universities in fifteen countries and jurisdictions, institutional AI policies fall into four maturity classes defined by capability scope: assessment-only rules, dedicated student-misconduct policies, research-integrity policies, and AI-literacy policies that reach supervision and examination. The sample classifies into four categories in ascending order of scope:</w:t>
+      </w:r>
+      <w:r>
+        <w:rPr>
+          <w:rFonts w:ascii="Inter" w:hAnsi="Inter" w:cs="Inter"/>
+          <w:b/>
+          <w:color w:val="3092B1"/>
+          <w:position w:val="8"/>
+          <w:sz w:val="18"/>
+          <w:szCs w:val="18"/>
+          <w:vertAlign w:val="superscript"/>
+        </w:rPr>
+        <w:footnoteReference w:id="16"/>
+      </w:r>
     </w:p>
     <w:p>
       <w:pPr>
@@ -544,14 +1684,17 @@
         </w:numPr>
         <w:rPr/>
       </w:pPr>
-      <w:hyperlink w:anchor="Xdf86be2fb4ae6983caa60f753da7a3b7585160b">
-        <w:r>
-          <w:rPr>
-            <w:rStyle w:val="Hyperlink"/>
-          </w:rPr>
-          <w:t>1.1   The shift in research practice, 2022 to 2026</w:t>
-        </w:r>
-      </w:hyperlink>
+      <w:r>
+        <w:rPr>
+          <w:i/>
+          <w:iCs/>
+        </w:rPr>
+        <w:t>Class A — Generic student-conduct policy with an AI clause appended.</w:t>
+      </w:r>
+      <w:r>
+        <w:rPr/>
+        <w:t xml:space="preserve"> Four of the thirty-eight universities (approximately 11 per cent) sit here. AI appears only inside the institution’s existing academic-integrity rules; there is no separate framing for the research and research-training side. Stanford, Yale, UC Berkeley, and Wisconsin-Madison cluster at this layer.</w:t>
+      </w:r>
     </w:p>
     <w:p>
       <w:pPr>
@@ -562,14 +1705,17 @@
         </w:numPr>
         <w:rPr/>
       </w:pPr>
-      <w:hyperlink w:anchor="Xef39ab72682dae84cefc71e63937706e29d01f9">
-        <w:r>
-          <w:rPr>
-            <w:rStyle w:val="Hyperlink"/>
-          </w:rPr>
-          <w:t>1.2   What “responsible AI use” still lacks a definition for</w:t>
-        </w:r>
-      </w:hyperlink>
+      <w:r>
+        <w:rPr>
+          <w:i/>
+          <w:iCs/>
+        </w:rPr>
+        <w:t>Class B — AI-specific policy on plagiarism only.</w:t>
+      </w:r>
+      <w:r>
+        <w:rPr/>
+        <w:t xml:space="preserve"> Eleven of the thirty-eight (approximately 29 per cent) sit here. A dedicated AI policy exists, but the policy’s substantive scope ends at student-misconduct framing, extended at most to a co-authorship rule that AI cannot be listed as an author of a scholarly work. Cambridge, Harvard, MIT, Princeton, Michigan, the University of Western Australia, Karolinska, Aarhus, the University of Tokyo, the National University of Singapore, and HKUST cluster at this layer.</w:t>
+      </w:r>
     </w:p>
     <w:p>
       <w:pPr>
@@ -580,30 +1726,17 @@
         </w:numPr>
         <w:rPr/>
       </w:pPr>
-      <w:hyperlink w:anchor="X0c4a3566b1b7587cf42a990d8449a1ff81a75dd">
-        <w:r>
-          <w:rPr>
-            <w:rStyle w:val="Hyperlink"/>
-          </w:rPr>
-          <w:t>1.3   The institutional baseline in 2026</w:t>
-        </w:r>
-      </w:hyperlink>
-      <w:bookmarkEnd w:id="6"/>
-    </w:p>
-    <w:p>
-      <w:pPr>
-        <w:pStyle w:val="Heading4"/>
-        <w:rPr/>
-      </w:pPr>
-      <w:hyperlink w:anchor="X4f9d66c4114ab910b08655494b03e6cc2bb0186">
-        <w:bookmarkStart w:id="7" w:name="X3bd643d343f2974ee01ac844e0357dfaba13ffe"/>
-        <w:r>
-          <w:rPr>
-            <w:rStyle w:val="Hyperlink"/>
-          </w:rPr>
-          <w:t>Part 2 — A five-dimension capability framework</w:t>
-        </w:r>
-      </w:hyperlink>
+      <w:r>
+        <w:rPr>
+          <w:i/>
+          <w:iCs/>
+        </w:rPr>
+        <w:t>Class C — AI-specific policy extending into research integrity and reproducibility.</w:t>
+      </w:r>
+      <w:r>
+        <w:rPr/>
+        <w:t xml:space="preserve"> Seventeen of the thirty-eight (approximately 45 per cent) sit here, the modal posture. These policies address validity, reproducibility, fabrication risk, validator-use of AI, and disclosure on research outputs. Oxford, Imperial, Edinburgh, five of the Australian Group of Eight (Melbourne, Sydney, ANU, Queensland, Monash), the German LMU, Humboldt-Berlin, and RWTH Aachen, ETH Zürich, EPFL, TU Delft, and the Canadian Toronto, McGill, and UBC cluster at this layer.</w:t>
+      </w:r>
     </w:p>
     <w:p>
       <w:pPr>
@@ -614,478 +1747,60 @@
         </w:numPr>
         <w:rPr/>
       </w:pPr>
-      <w:hyperlink w:anchor="Xb0410b896ac7ef6a6cbe20afd8440f8e2e34f1c">
-        <w:r>
-          <w:rPr>
-            <w:rStyle w:val="Hyperlink"/>
-          </w:rPr>
-          <w:t>2.1   Dimension 1 — Human-in-the-loop discipline</w:t>
-        </w:r>
-      </w:hyperlink>
-    </w:p>
-    <w:p>
-      <w:pPr>
-        <w:pStyle w:val="Compact"/>
-        <w:numPr>
-          <w:ilvl w:val="0"/>
-          <w:numId w:val="7"/>
-        </w:numPr>
-        <w:rPr/>
-      </w:pPr>
-      <w:hyperlink w:anchor="Xa2978b9e88e006a11ba7c882c810e9185f91c2e">
-        <w:r>
-          <w:rPr>
-            <w:rStyle w:val="Hyperlink"/>
-          </w:rPr>
-          <w:t>2.2   Dimension 2 — Responsible use in practice</w:t>
-        </w:r>
-      </w:hyperlink>
-    </w:p>
-    <w:p>
-      <w:pPr>
-        <w:pStyle w:val="Compact"/>
-        <w:numPr>
-          <w:ilvl w:val="0"/>
-          <w:numId w:val="7"/>
-        </w:numPr>
-        <w:rPr/>
-      </w:pPr>
-      <w:hyperlink w:anchor="Xf03f014728e057244187e34525d77c4ae36f76d">
-        <w:r>
-          <w:rPr>
-            <w:rStyle w:val="Hyperlink"/>
-          </w:rPr>
-          <w:t>2.3   Dimension 3 — Tooling that promotes responsible use</w:t>
-        </w:r>
-      </w:hyperlink>
-    </w:p>
-    <w:p>
-      <w:pPr>
-        <w:pStyle w:val="Compact"/>
-        <w:numPr>
-          <w:ilvl w:val="0"/>
-          <w:numId w:val="7"/>
-        </w:numPr>
-        <w:rPr/>
-      </w:pPr>
-      <w:hyperlink w:anchor="X9022f3b58da7204a1c5a692bcfe77fac557b070">
-        <w:r>
-          <w:rPr>
-            <w:rStyle w:val="Hyperlink"/>
-          </w:rPr>
-          <w:t>2.4   Dimension 4 — AI-literate humans</w:t>
-        </w:r>
-      </w:hyperlink>
-    </w:p>
-    <w:p>
-      <w:pPr>
-        <w:pStyle w:val="Compact"/>
-        <w:numPr>
-          <w:ilvl w:val="0"/>
-          <w:numId w:val="7"/>
-        </w:numPr>
-        <w:rPr/>
-      </w:pPr>
-      <w:hyperlink w:anchor="X5c66220ea38a998fd91f5afd0ef459d3a5d80b4">
-        <w:r>
-          <w:rPr>
-            <w:rStyle w:val="Hyperlink"/>
-          </w:rPr>
-          <w:t>2.5   Dimension 5 — Institutional benchmarking grid</w:t>
-        </w:r>
-      </w:hyperlink>
-      <w:bookmarkEnd w:id="7"/>
-    </w:p>
-    <w:p>
-      <w:pPr>
-        <w:pStyle w:val="Heading4"/>
-        <w:rPr/>
-      </w:pPr>
-      <w:hyperlink w:anchor="Xfaf275e331ed51ebecadb9345be19a0314acfc3">
-        <w:bookmarkStart w:id="8" w:name="Xdc77c75a62b621fcf7c8fe71c969742e2e32c4d"/>
-        <w:r>
-          <w:rPr>
-            <w:rStyle w:val="Hyperlink"/>
-          </w:rPr>
-          <w:t>Part 3 — What the international evidence shows</w:t>
-        </w:r>
-      </w:hyperlink>
-    </w:p>
-    <w:p>
-      <w:pPr>
-        <w:pStyle w:val="Compact"/>
-        <w:numPr>
-          <w:ilvl w:val="0"/>
-          <w:numId w:val="7"/>
-        </w:numPr>
-        <w:rPr/>
-      </w:pPr>
-      <w:hyperlink w:anchor="X67362a211dc18a32089bb5a92eae11abc44c983">
-        <w:r>
-          <w:rPr>
-            <w:rStyle w:val="Hyperlink"/>
-          </w:rPr>
-          <w:t>3.1   National research-funder positions</w:t>
-        </w:r>
-      </w:hyperlink>
-    </w:p>
-    <w:p>
-      <w:pPr>
-        <w:pStyle w:val="Compact"/>
-        <w:numPr>
-          <w:ilvl w:val="0"/>
-          <w:numId w:val="7"/>
-        </w:numPr>
-        <w:rPr/>
-      </w:pPr>
-      <w:hyperlink w:anchor="X409e526c0ea6449c8a9fb87a385fab88236ca99">
-        <w:r>
-          <w:rPr>
-            <w:rStyle w:val="Hyperlink"/>
-          </w:rPr>
-          <w:t>3.2   Top-tier university institutional policies</w:t>
-        </w:r>
-      </w:hyperlink>
-    </w:p>
-    <w:p>
-      <w:pPr>
-        <w:pStyle w:val="Compact"/>
-        <w:numPr>
-          <w:ilvl w:val="0"/>
-          <w:numId w:val="7"/>
-        </w:numPr>
-        <w:rPr/>
-      </w:pPr>
-      <w:hyperlink w:anchor="X58df4d38bc63fe6a1527f35cdd611f9af8daefa">
-        <w:r>
-          <w:rPr>
-            <w:rStyle w:val="Hyperlink"/>
-          </w:rPr>
-          <w:t>3.3   Publisher and journal policies</w:t>
-        </w:r>
-      </w:hyperlink>
-    </w:p>
-    <w:p>
-      <w:pPr>
-        <w:pStyle w:val="Compact"/>
-        <w:numPr>
-          <w:ilvl w:val="0"/>
-          <w:numId w:val="7"/>
-        </w:numPr>
-        <w:rPr/>
-      </w:pPr>
-      <w:hyperlink w:anchor="Xe77ed63e1e1dbfa81b73895cfdf812d8aaac6fa">
-        <w:r>
-          <w:rPr>
-            <w:rStyle w:val="Hyperlink"/>
-          </w:rPr>
-          <w:t>3.4   Existing AI-literacy and researcher-development frameworks</w:t>
-        </w:r>
-      </w:hyperlink>
-      <w:bookmarkEnd w:id="8"/>
-    </w:p>
-    <w:p>
-      <w:pPr>
-        <w:pStyle w:val="Heading4"/>
-        <w:rPr/>
-      </w:pPr>
-      <w:hyperlink w:anchor="part-4-the-maturity-grid_1">
-        <w:bookmarkStart w:id="9" w:name="part-4-the-maturity-grid"/>
-        <w:r>
-          <w:rPr>
-            <w:rStyle w:val="Hyperlink"/>
-          </w:rPr>
-          <w:t>Part 4 — The maturity grid</w:t>
-        </w:r>
-      </w:hyperlink>
-    </w:p>
-    <w:p>
-      <w:pPr>
-        <w:pStyle w:val="Compact"/>
-        <w:numPr>
-          <w:ilvl w:val="0"/>
-          <w:numId w:val="7"/>
-        </w:numPr>
-        <w:rPr/>
-      </w:pPr>
-      <w:hyperlink w:anchor="Xa2528ffc6271a3b7f8494c7574039782e296ef5">
-        <w:r>
-          <w:rPr>
-            <w:rStyle w:val="Hyperlink"/>
-          </w:rPr>
-          <w:t>4.1   The five-by-four grid</w:t>
-        </w:r>
-      </w:hyperlink>
-    </w:p>
-    <w:p>
-      <w:pPr>
-        <w:pStyle w:val="Compact"/>
-        <w:numPr>
-          <w:ilvl w:val="0"/>
-          <w:numId w:val="7"/>
-        </w:numPr>
-        <w:rPr/>
-      </w:pPr>
-      <w:hyperlink w:anchor="X2d830cf8cc8d1f050bc7fd5f5026d8fb6f7586e">
-        <w:r>
-          <w:rPr>
-            <w:rStyle w:val="Hyperlink"/>
-          </w:rPr>
-          <w:t>4.2   What “ready” looks like by dimension</w:t>
-        </w:r>
-      </w:hyperlink>
-    </w:p>
-    <w:p>
-      <w:pPr>
-        <w:pStyle w:val="Compact"/>
-        <w:numPr>
-          <w:ilvl w:val="0"/>
-          <w:numId w:val="7"/>
-        </w:numPr>
-        <w:rPr/>
-      </w:pPr>
-      <w:hyperlink w:anchor="X36abbbf7fa7a3c3143910f28c5505844b7e0b4f">
-        <w:r>
-          <w:rPr>
-            <w:rStyle w:val="Hyperlink"/>
-          </w:rPr>
-          <w:t>4.3   Worked institutional examples</w:t>
-        </w:r>
-      </w:hyperlink>
-      <w:bookmarkEnd w:id="9"/>
-    </w:p>
-    <w:p>
-      <w:pPr>
-        <w:pStyle w:val="Heading4"/>
-        <w:rPr/>
-      </w:pPr>
-      <w:hyperlink w:anchor="Xa1dfcb691ac0c1297bce0e5e7c4e1d6d6dc6ae7">
-        <w:bookmarkStart w:id="10" w:name="Xade74cb8c91f1bbf3902d8c6c15257bafa8604c"/>
-        <w:r>
-          <w:rPr>
-            <w:rStyle w:val="Hyperlink"/>
-          </w:rPr>
-          <w:t>Part 5 — Recommendations for university research leadership</w:t>
-        </w:r>
-      </w:hyperlink>
-    </w:p>
-    <w:p>
-      <w:pPr>
-        <w:pStyle w:val="Compact"/>
-        <w:numPr>
-          <w:ilvl w:val="0"/>
-          <w:numId w:val="7"/>
-        </w:numPr>
-        <w:rPr/>
-      </w:pPr>
-      <w:hyperlink w:anchor="X637bbf0db3ca7ba96c0636057322e2f0dd6c2b8">
-        <w:r>
-          <w:rPr>
-            <w:rStyle w:val="Hyperlink"/>
-          </w:rPr>
-          <w:t>5.1   For executive research leadership</w:t>
-        </w:r>
-      </w:hyperlink>
-    </w:p>
-    <w:p>
-      <w:pPr>
-        <w:pStyle w:val="Compact"/>
-        <w:numPr>
-          <w:ilvl w:val="0"/>
-          <w:numId w:val="7"/>
-        </w:numPr>
-        <w:rPr/>
-      </w:pPr>
-      <w:hyperlink w:anchor="X4df49f9c2fdee26b5106621f4e6bae7f77c10a2">
-        <w:r>
-          <w:rPr>
-            <w:rStyle w:val="Hyperlink"/>
-          </w:rPr>
-          <w:t>5.2   For faculty deans and associate deans of research</w:t>
-        </w:r>
-      </w:hyperlink>
-    </w:p>
-    <w:p>
-      <w:pPr>
-        <w:pStyle w:val="Compact"/>
-        <w:numPr>
-          <w:ilvl w:val="0"/>
-          <w:numId w:val="7"/>
-        </w:numPr>
-        <w:rPr/>
-      </w:pPr>
-      <w:hyperlink w:anchor="X01a7ced067d8590f8de445e51dcb8ba28790c83">
-        <w:r>
-          <w:rPr>
-            <w:rStyle w:val="Hyperlink"/>
-          </w:rPr>
-          <w:t>5.3   For deans of graduate schools and A/Deans of research training</w:t>
-        </w:r>
-      </w:hyperlink>
-    </w:p>
-    <w:p>
-      <w:pPr>
-        <w:pStyle w:val="Compact"/>
-        <w:numPr>
-          <w:ilvl w:val="0"/>
-          <w:numId w:val="7"/>
-        </w:numPr>
-        <w:rPr/>
-      </w:pPr>
-      <w:hyperlink w:anchor="Xaf1c59110ac2d2b00da69a4f26feb31fdf6efc6">
-        <w:r>
-          <w:rPr>
-            <w:rStyle w:val="Hyperlink"/>
-          </w:rPr>
-          <w:t>5.4   For higher-degrees committees and research-integrity committees</w:t>
-        </w:r>
-      </w:hyperlink>
-    </w:p>
-    <w:p>
-      <w:pPr>
-        <w:pStyle w:val="Compact"/>
-        <w:numPr>
-          <w:ilvl w:val="0"/>
-          <w:numId w:val="7"/>
-        </w:numPr>
-        <w:rPr/>
-      </w:pPr>
-      <w:hyperlink w:anchor="X3344b8117abe35e69dffb3d8223ef8b3371967a">
-        <w:r>
-          <w:rPr>
-            <w:rStyle w:val="Hyperlink"/>
-          </w:rPr>
-          <w:t>5.5   For peak bodies for graduate students</w:t>
-        </w:r>
-      </w:hyperlink>
-      <w:bookmarkEnd w:id="10"/>
-    </w:p>
-    <w:p>
-      <w:pPr>
-        <w:pStyle w:val="Heading4"/>
-        <w:rPr/>
-      </w:pPr>
-      <w:hyperlink w:anchor="conclusion_1">
-        <w:bookmarkStart w:id="11" w:name="conclusion"/>
-        <w:r>
-          <w:rPr>
-            <w:rStyle w:val="Hyperlink"/>
-          </w:rPr>
-          <w:t>Conclusion</w:t>
-        </w:r>
-      </w:hyperlink>
-      <w:bookmarkEnd w:id="11"/>
-    </w:p>
-    <w:p>
-      <w:pPr>
-        <w:pStyle w:val="Heading4"/>
-        <w:rPr/>
-      </w:pPr>
-      <w:hyperlink w:anchor="X58efa211c38677f6721adc2049a1ec624e0c3e5">
-        <w:bookmarkStart w:id="12" w:name="Xacafc5f6c5affb2bcbe0c710c92c025823d84b1"/>
-        <w:r>
-          <w:rPr>
-            <w:rStyle w:val="Hyperlink"/>
-          </w:rPr>
-          <w:t>Appendix A — The maturity grid, full version</w:t>
-        </w:r>
-      </w:hyperlink>
-      <w:bookmarkEnd w:id="12"/>
-    </w:p>
-    <w:p>
-      <w:pPr>
-        <w:pStyle w:val="Heading4"/>
-        <w:rPr/>
-      </w:pPr>
-      <w:hyperlink w:anchor="X30a15aa0718d80bdea4e1d3776a0ba9becb19b9">
-        <w:bookmarkStart w:id="13" w:name="Xa4fff6b6df5f7a3b09445c229bc4b09ed80ee37"/>
-        <w:r>
-          <w:rPr>
-            <w:rStyle w:val="Hyperlink"/>
-          </w:rPr>
-          <w:t>Appendix B — Country and institutional dossiers</w:t>
-        </w:r>
-      </w:hyperlink>
-      <w:bookmarkEnd w:id="13"/>
-    </w:p>
-    <w:p>
-      <w:pPr>
-        <w:pStyle w:val="Heading4"/>
-        <w:rPr/>
-      </w:pPr>
-      <w:hyperlink w:anchor="appendix-c-glossary-of-ai-tool-classes_1">
-        <w:bookmarkStart w:id="14" w:name="appendix-c-glossary-of-ai-tool-classes"/>
-        <w:r>
-          <w:rPr>
-            <w:rStyle w:val="Hyperlink"/>
-          </w:rPr>
-          <w:t>Appendix C — Glossary of AI tool classes</w:t>
-        </w:r>
-      </w:hyperlink>
-      <w:bookmarkEnd w:id="14"/>
-    </w:p>
-    <w:p>
-      <w:pPr>
-        <w:pStyle w:val="Heading4"/>
-        <w:rPr/>
-      </w:pPr>
-      <w:hyperlink w:anchor="appendix-d-about-this-report_1">
-        <w:bookmarkStart w:id="15" w:name="appendix-d-about-this-report"/>
-        <w:r>
-          <w:rPr>
-            <w:rStyle w:val="Hyperlink"/>
-          </w:rPr>
-          <w:t>Appendix D — About this report</w:t>
-        </w:r>
-      </w:hyperlink>
-      <w:bookmarkEnd w:id="15"/>
-    </w:p>
-    <w:p>
-      <w:pPr>
-        <w:pStyle w:val="Heading4"/>
-        <w:rPr/>
-      </w:pPr>
-      <w:hyperlink w:anchor="appendix-e-sources_1">
-        <w:bookmarkStart w:id="16" w:name="appendix-e-sources"/>
-        <w:r>
-          <w:rPr>
-            <w:rStyle w:val="Hyperlink"/>
-          </w:rPr>
-          <w:t>Appendix E — Sources</w:t>
-        </w:r>
-      </w:hyperlink>
-      <w:bookmarkEnd w:id="16"/>
-    </w:p>
-    <w:p>
-      <w:pPr>
-        <w:pStyle w:val="Heading4"/>
-        <w:rPr/>
-      </w:pPr>
-      <w:hyperlink w:anchor="appendix-f-regional-adaptation-note_1">
-        <w:bookmarkStart w:id="17" w:name="appendix-f-regional-adaptation-note"/>
-        <w:r>
-          <w:rPr>
-            <w:rStyle w:val="Hyperlink"/>
-          </w:rPr>
-          <w:t>Appendix F — Regional-adaptation note</w:t>
-        </w:r>
-      </w:hyperlink>
-      <w:bookmarkEnd w:id="17"/>
-    </w:p>
-    <w:p>
-      <w:pPr>
-        <w:pStyle w:val="Heading4"/>
-        <w:rPr/>
-      </w:pPr>
-      <w:hyperlink w:anchor="Xbed8346cde3d6a4651c2d5c0a174b243c58d415">
-        <w:bookmarkStart w:id="18" w:name="X62e7b9ee26ca01e0177273e17f9dc12e4526de9"/>
-        <w:r>
-          <w:rPr>
-            <w:rStyle w:val="Hyperlink"/>
-          </w:rPr>
-          <w:t>Appendix G — Labour-vs-judgement task taxonomy</w:t>
-        </w:r>
-      </w:hyperlink>
+      <w:r>
+        <w:rPr>
+          <w:i/>
+          <w:iCs/>
+        </w:rPr>
+        <w:t>Class D — AI-specific policy extending into AI literacy, competency, and examiner discipline.</w:t>
+      </w:r>
+      <w:r>
+        <w:rPr/>
+        <w:t xml:space="preserve"> Six of the thirty-eight (approximately 16 per cent) sit here. Class C plus an articulated competency expectation for graduate students and supervisors, plus references to curriculum content, plus examiner-side rules for the viva voce and the thesis declaration. University College London’s Doctoral School, King’s College London’s Centre for Education Studies, the German Heidelberg Graduate Academy, the Belgian KU Leuven, the Finnish University of Helsinki, and China’s Tsinghua University populate the Class D group.</w:t>
+      </w:r>
+      <w:r>
+        <w:rPr>
+          <w:rFonts w:ascii="Inter" w:hAnsi="Inter" w:cs="Inter"/>
+          <w:b/>
+          <w:color w:val="3092B1"/>
+          <w:position w:val="8"/>
+          <w:sz w:val="18"/>
+          <w:szCs w:val="18"/>
+          <w:vertAlign w:val="superscript"/>
+        </w:rPr>
+        <w:footnoteReference w:id="17"/>
+      </w:r>
+    </w:p>
+    <w:p>
+      <w:pPr>
+        <w:pStyle w:val="FirstParagraph"/>
+        <w:rPr/>
+      </w:pPr>
+      <w:r>
+        <w:rPr/>
+        <w:t xml:space="preserve">The cross-country picture is sharper than the within-country picture. The German U15 sample (LMU, Heidelberg, Humboldt-Berlin, RWTH Aachen) clusters tightly at Class C and D, anchored by the pre-existing </w:t>
+      </w:r>
+      <w:r>
+        <w:rPr>
+          <w:i/>
+          <w:iCs/>
+        </w:rPr>
+        <w:t>eidesstattliche Versicherung</w:t>
+      </w:r>
+      <w:r>
+        <w:rPr/>
+        <w:t xml:space="preserve"> tradition: every German doctoral candidate already signs a sworn declaration that the work was completed independently, and AI disclosure has been bolted onto that pre-existing instrument with native legal anchorage. The Australian Group of Eight sits five-of-six at Class C, anchored by the 2018 Australian Code for the Responsible Conduct of Research; the University of Western Australia is the Class B exception, with a principles-led University Executive posture rather than a codified doctoral-research-specific policy. The Code supplies a common research-integrity reference that institutional policy across the cluster can hang AI disclosure on, without each institution having to invent its own. The UK Russell Group is the most bimodal cluster: Cambridge sits at Class B, Imperial at Class C, while UCL and KCL are clear Class D and the sector’s policy leaders. The US Ivy-Plus and Association of American Universities sample is the lagging cluster despite hosting much of the AI research itself; central doctoral-research policy is thin, devolved to schools, faculties, and supervisors, and the modal posture is Class A or B. The continental European research-intensives are clustered at Class C with KU Leuven and Helsinki as Class D outliers. Asia is bimodal: Tsinghua leapfrogs to Class D with its December 2025 university-wide AI framework, the first institutional AI policy in the global sample to cover teaching, research, and theses in a single integrated document, while the University of Tokyo, the National University of Singapore, and HKUST sit at Class B.</w:t>
+      </w:r>
+    </w:p>
+    <w:p>
+      <w:pPr>
+        <w:pStyle w:val="BodyText"/>
+        <w:rPr/>
+      </w:pPr>
+      <w:r>
+        <w:rPr/>
+        <w:t>Approximately one in six of the world’s top-tier doctoral universities has an AI policy that extends past research integrity into AI literacy and valid research practices. Class C and Class D combined, the policies that go past plagiarism into research integrity, account for around three in five (twenty-three of thirty-eight); the remaining 40 per cent sit at the plagiarism-policy ceiling. The cover-table comparator of this report is the smaller leading number: only six of the thirty-eight institutions reach AI literacy and valid research practices. The operational difference between Class C and Class D is the difference between disclosure-and-verification rules that bind researchers’ own conduct (Class C) and the same rules plus codified competency expectations for graduate students and supervisors and examiner-side rules for the viva voce and the thesis declaration (Class D). The maturity grid in Part 4 is designed to make those capabilities reachable for institutions at any starting class.</w:t>
+      </w:r>
     </w:p>
     <w:p>
       <w:pPr>
@@ -1107,673 +1822,6 @@
                       <wps:cNvSpPr/>
                       <wps:nvSpPr>
                         <wps:cNvPr id="5" name=""/>
-                        <wps:cNvSpPr/>
-                      </wps:nvSpPr>
-                      <wps:spPr>
-                        <a:xfrm>
-                          <a:off x="0" y="0"/>
-                          <a:ext cx="5972760" cy="19080"/>
-                        </a:xfrm>
-                        <a:prstGeom prst="rect">
-                          <a:avLst/>
-                        </a:prstGeom>
-                        <a:solidFill>
-                          <a:srgbClr val="FFFFFF"/>
-                        </a:solidFill>
-                        <a:ln w="0">
-                          <a:solidFill>
-                            <a:srgbClr val="000000"/>
-                          </a:solidFill>
-                        </a:ln>
-                      </wps:spPr>
-                      <wps:bodyPr/>
-                    </wps:wsp>
-                  </a:graphicData>
-                </a:graphic>
-                <wp14:sizeRelH relativeFrom="page">
-                  <wp14:pctWidth>100000</wp14:pctWidth>
-                </wp14:sizeRelH>
-              </wp:inline>
-            </w:drawing>
-          </mc:Choice>
-          <mc:Fallback>
-            <w:pict>
-              <v:rect id="shape_0" fillcolor="white" stroked="t" o:allowincell="f" style="position:absolute;margin-left:0pt;margin-top:-1.55pt;width:470.25pt;height:1.45pt;mso-wrap-style:none;v-text-anchor:middle;mso-position-horizontal:center;mso-position-vertical:top">
-                <v:fill o:detectmouseclick="t" type="solid" color2="black"/>
-                <v:stroke color="black" joinstyle="round" endcap="flat"/>
-                <w10:wrap type="topAndBottom"/>
-              </v:rect>
-            </w:pict>
-          </mc:Fallback>
-        </mc:AlternateContent>
-      </w:r>
-      <w:bookmarkEnd w:id="18"/>
-    </w:p>
-    <w:p>
-      <w:pPr>
-        <w:pStyle w:val="Heading2"/>
-        <w:rPr/>
-      </w:pPr>
-      <w:bookmarkStart w:id="19" w:name="part-1-the-factual-baseline-1"/>
-      <w:r>
-        <w:rPr/>
-        <w:t>Part 1 — The factual baseline</w:t>
-      </w:r>
-    </w:p>
-    <w:p>
-      <w:pPr>
-        <w:pStyle w:val="Heading3"/>
-        <w:rPr/>
-      </w:pPr>
-      <w:bookmarkStart w:id="20" w:name="X25f912980d44fa8a235942a34c9340eb32a665f"/>
-      <w:r>
-        <w:rPr/>
-        <w:t>1.1 The shift in research practice, 2022 to 2026</w:t>
-      </w:r>
-    </w:p>
-    <w:p>
-      <w:pPr>
-        <w:pStyle w:val="FirstParagraph"/>
-        <w:rPr/>
-      </w:pPr>
-      <w:r>
-        <w:rPr/>
-        <w:t xml:space="preserve">ChatGPT-3.5 launched for broad public use on 30 November 2022. By the end of the first quarter of 2023, every major academic publisher had a position on AI co-authorship: Nature on 24 January, </w:t>
-      </w:r>
-      <w:r>
-        <w:rPr>
-          <w:i/>
-          <w:iCs/>
-        </w:rPr>
-        <w:t>Science</w:t>
-      </w:r>
-      <w:r>
-        <w:rPr/>
-        <w:t xml:space="preserve"> on 26 January, JAMA in February, arXiv on 31 January, Cambridge University Press on 14 March, Elsevier in March, ACM in April. The substantive rule was identical at all of them: AI cannot be listed as an author or co-author of a scholarly work, because it cannot bear responsibility for the work. Cambridge University Press’s managing director Mandy Hill captured the consensus at the time: “It’s obvious that tools like ChatGPT cannot and should not be treated as authors.”</w:t>
-      </w:r>
-      <w:r>
-        <w:rPr>
-          <w:rFonts w:ascii="Inter" w:hAnsi="Inter" w:cs="Inter"/>
-          <w:b/>
-          <w:color w:val="3092B1"/>
-          <w:position w:val="8"/>
-          <w:sz w:val="18"/>
-          <w:szCs w:val="18"/>
-          <w:vertAlign w:val="superscript"/>
-        </w:rPr>
-        <w:footnoteReference w:id="2"/>
-      </w:r>
-    </w:p>
-    <w:p>
-      <w:pPr>
-        <w:pStyle w:val="BodyText"/>
-        <w:rPr/>
-      </w:pPr>
-      <w:r>
-        <w:rPr/>
-        <w:t>The policy speed was unusually fast compared with the years-long convergence of prior publisher-policy adoptions on adjacent surfaces. Cross-publisher convergences (predatory-publishing rules, alignment with the International Committee of Medical Journal Editors authorship criteria, the Committee on Publication Ethics post-publication review protocols) typically take years to settle. The no-AI-co-authors convergence took ten weeks.</w:t>
-      </w:r>
-      <w:r>
-        <w:rPr>
-          <w:rFonts w:ascii="Inter" w:hAnsi="Inter" w:cs="Inter"/>
-          <w:b/>
-          <w:color w:val="3092B1"/>
-          <w:position w:val="8"/>
-          <w:sz w:val="18"/>
-          <w:szCs w:val="18"/>
-          <w:vertAlign w:val="superscript"/>
-        </w:rPr>
-        <w:footnoteReference w:id="3"/>
-      </w:r>
-    </w:p>
-    <w:p>
-      <w:pPr>
-        <w:pStyle w:val="BodyText"/>
-        <w:rPr/>
-      </w:pPr>
-      <w:r>
-        <w:rPr/>
-        <w:t>Funder responses followed more slowly. The German Research Foundation issued its executive-committee statement on 21 September 2023; UK Research and Innovation issued a joint funder statement in September 2023 and a formal policy on 23 September 2024; the National Science Foundation’s notice to the research community is dated 14 December 2023; the National Institutes of Health peer-review prohibition (NOT-OD-23-149) is dated 23 June 2023 and the applicant-side originality bar (NOT-OD-25-132) followed in mid-2025. The Netherlands Organisation for Scientific Research issued its policy on 20 January 2025. The European Research Council’s evaluation-side policy followed in March 2026. The Australian Research Council and the National Health and Medical Research Council issued the most recent of the major funder positions on 28 April 2026.</w:t>
-      </w:r>
-      <w:r>
-        <w:rPr>
-          <w:rFonts w:ascii="Inter" w:hAnsi="Inter" w:cs="Inter"/>
-          <w:b/>
-          <w:color w:val="3092B1"/>
-          <w:position w:val="8"/>
-          <w:sz w:val="18"/>
-          <w:szCs w:val="18"/>
-          <w:vertAlign w:val="superscript"/>
-        </w:rPr>
-        <w:footnoteReference w:id="4"/>
-      </w:r>
-    </w:p>
-    <w:p>
-      <w:pPr>
-        <w:pStyle w:val="BodyText"/>
-        <w:rPr/>
-      </w:pPr>
-      <w:r>
-        <w:rPr/>
-        <w:t>In the same window, the underlying research practice changed. Nature’s 2023 and 2024 surveys of researcher AI use, the AAU and APLU joint studies on graduate-student AI behaviour, and discipline-specific journal-wide reviews together describe a shift from a curiosity question in 2023 to an embedded-practice question by 2025. AI assistance is now part of literature review at scale, part of code-development at scale, part of drafting at scale, and increasingly part of statistical reasoning and methodological design at scale. The arXiv preprint server’s own moderation team reported a 72 per cent increase in arXiv submissions that may be partly AI-written between ChatGPT’s release and a 2025 internal study.</w:t>
-      </w:r>
-      <w:r>
-        <w:rPr>
-          <w:rFonts w:ascii="Inter" w:hAnsi="Inter" w:cs="Inter"/>
-          <w:b/>
-          <w:color w:val="3092B1"/>
-          <w:position w:val="8"/>
-          <w:sz w:val="18"/>
-          <w:szCs w:val="18"/>
-          <w:vertAlign w:val="superscript"/>
-        </w:rPr>
-        <w:footnoteReference w:id="5"/>
-      </w:r>
-      <w:r>
-        <w:rPr/>
-        <w:t xml:space="preserve"> The British Medical Journal’s structured submission-form disclosure field, introduced on 8 April 2024 as the first publisher to implement structured submission-form disclosure of this kind (publishers had used text-based disclosure-on-submission rules from January 2023 onwards), registered a 5.7 per cent disclosure rate across 25,114 submissions to 49 BMJ journals in the seven months that followed.</w:t>
-      </w:r>
-      <w:r>
-        <w:rPr>
-          <w:rFonts w:ascii="Inter" w:hAnsi="Inter" w:cs="Inter"/>
-          <w:b/>
-          <w:color w:val="3092B1"/>
-          <w:position w:val="8"/>
-          <w:sz w:val="18"/>
-          <w:szCs w:val="18"/>
-          <w:vertAlign w:val="superscript"/>
-        </w:rPr>
-        <w:footnoteReference w:id="6"/>
-      </w:r>
-      <w:r>
-        <w:rPr/>
-        <w:t xml:space="preserve"> The disclosure rate is low, but the trajectory is positive; the gap between use and disclosure is the structural signal.</w:t>
-      </w:r>
-    </w:p>
-    <w:p>
-      <w:pPr>
-        <w:pStyle w:val="BodyText"/>
-        <w:rPr/>
-      </w:pPr>
-      <w:r>
-        <w:rPr/>
-        <w:t>That is the gap this report addresses: research practice has changed faster than university policy has defined responsible AI use in PhD training.</w:t>
-      </w:r>
-      <w:bookmarkEnd w:id="20"/>
-    </w:p>
-    <w:p>
-      <w:pPr>
-        <w:pStyle w:val="Heading3"/>
-        <w:rPr/>
-      </w:pPr>
-      <w:bookmarkStart w:id="21" w:name="X249cd8f8d3611a5f7cf9a267ae9e027e6df62ea"/>
-      <w:r>
-        <w:rPr/>
-        <w:t>1.2 What “responsible AI use” still lacks a definition for</w:t>
-      </w:r>
-    </w:p>
-    <w:p>
-      <w:pPr>
-        <w:pStyle w:val="FirstParagraph"/>
-        <w:rPr/>
-      </w:pPr>
-      <w:r>
-        <w:rPr/>
-        <w:t>Five years into the modern AI era, the phrase “responsible AI use” is in every funder policy, every publisher policy, every institutional policy, and every capability framework. The phrase is not in serious dispute. Its operational meaning is.</w:t>
-      </w:r>
-    </w:p>
-    <w:p>
-      <w:pPr>
-        <w:pStyle w:val="BodyText"/>
-        <w:rPr/>
-      </w:pPr>
-      <w:r>
-        <w:rPr/>
-        <w:t>Across the fourteen national research funders surveyed, “responsible AI use” most often points outward, to host-institution policy and to umbrella research-integrity codes. The German Research Foundation, for instance, requires that researchers “must ensure that the use of generative models does not infringe anyone else’s intellectual property and does not result in scientific misconduct, for example in the form of plagiarism.”</w:t>
-      </w:r>
-      <w:r>
-        <w:rPr>
-          <w:rFonts w:ascii="Inter" w:hAnsi="Inter" w:cs="Inter"/>
-          <w:b/>
-          <w:color w:val="3092B1"/>
-          <w:position w:val="8"/>
-          <w:sz w:val="18"/>
-          <w:szCs w:val="18"/>
-          <w:vertAlign w:val="superscript"/>
-        </w:rPr>
-        <w:footnoteReference w:id="7"/>
-      </w:r>
-      <w:r>
-        <w:rPr/>
-        <w:t xml:space="preserve"> The Australian Research Council and the National Health and Medical Research Council, in their April 2026 joint policy, state that “AI-generated content must be verified and should not replace expert opinion or judgement.”</w:t>
-      </w:r>
-      <w:r>
-        <w:rPr>
-          <w:rFonts w:ascii="Inter" w:hAnsi="Inter" w:cs="Inter"/>
-          <w:b/>
-          <w:color w:val="3092B1"/>
-          <w:position w:val="8"/>
-          <w:sz w:val="18"/>
-          <w:szCs w:val="18"/>
-          <w:vertAlign w:val="superscript"/>
-        </w:rPr>
-        <w:footnoteReference w:id="8"/>
-      </w:r>
-      <w:r>
-        <w:rPr/>
-        <w:t xml:space="preserve"> Both formulations are unobjectionable. Neither tells a PhD candidate or a PhD supervisor what to do on Monday morning when an AI tool returns a plausible-looking citation list, a plausible-looking explanation of a statistical assumption, or a plausible-looking interpretation of an experimental result.</w:t>
-      </w:r>
-    </w:p>
-    <w:p>
-      <w:pPr>
-        <w:pStyle w:val="BodyText"/>
-        <w:rPr/>
-      </w:pPr>
-      <w:r>
-        <w:rPr/>
-        <w:t>Publisher policies converge on disclosure: where in the manuscript to acknowledge AI use, in what format, and with what specificity. Elsevier’s mandated section, “Declaration of Generative AI and AI-assisted technologies in the writing process,” sits “immediately above the references.”</w:t>
-      </w:r>
-      <w:r>
-        <w:rPr>
-          <w:rFonts w:ascii="Inter" w:hAnsi="Inter" w:cs="Inter"/>
-          <w:b/>
-          <w:color w:val="3092B1"/>
-          <w:position w:val="8"/>
-          <w:sz w:val="18"/>
-          <w:szCs w:val="18"/>
-          <w:vertAlign w:val="superscript"/>
-        </w:rPr>
-        <w:footnoteReference w:id="9"/>
-      </w:r>
-      <w:r>
-        <w:rPr/>
-        <w:t xml:space="preserve"> Cell Press places its analogous declaration “after the declaration of interests.”</w:t>
-      </w:r>
-      <w:r>
-        <w:rPr>
-          <w:rFonts w:ascii="Inter" w:hAnsi="Inter" w:cs="Inter"/>
-          <w:b/>
-          <w:color w:val="3092B1"/>
-          <w:position w:val="8"/>
-          <w:sz w:val="18"/>
-          <w:szCs w:val="18"/>
-          <w:vertAlign w:val="superscript"/>
-        </w:rPr>
-        <w:footnoteReference w:id="10"/>
-      </w:r>
-      <w:r>
-        <w:rPr/>
-        <w:t xml:space="preserve"> JAMA requires disclosure in three locations, an explicit author affirmation that AI “had no involvement in shaping the intellectual content,” and an acknowledgement of the AI tool’s “potential limitations.”</w:t>
-      </w:r>
-      <w:r>
-        <w:rPr>
-          <w:rFonts w:ascii="Inter" w:hAnsi="Inter" w:cs="Inter"/>
-          <w:b/>
-          <w:color w:val="3092B1"/>
-          <w:position w:val="8"/>
-          <w:sz w:val="18"/>
-          <w:szCs w:val="18"/>
-          <w:vertAlign w:val="superscript"/>
-        </w:rPr>
-        <w:footnoteReference w:id="11"/>
-      </w:r>
-      <w:r>
-        <w:rPr/>
-        <w:t xml:space="preserve"> The Public Library of Science’s policy is alone in mandating reviewer-to-author disclosure: a reviewer who used AI in preparing review comments must disclose that use “to authors in the review form,” not only to the editor.</w:t>
-      </w:r>
-      <w:r>
-        <w:rPr>
-          <w:rFonts w:ascii="Inter" w:hAnsi="Inter" w:cs="Inter"/>
-          <w:b/>
-          <w:color w:val="3092B1"/>
-          <w:position w:val="8"/>
-          <w:sz w:val="18"/>
-          <w:szCs w:val="18"/>
-          <w:vertAlign w:val="superscript"/>
-        </w:rPr>
-        <w:footnoteReference w:id="12"/>
-      </w:r>
-      <w:r>
-        <w:rPr/>
-        <w:t xml:space="preserve"> While the disclosure anchor is clear, the reader must still judge whether the disclosed AI use was responsible, valid, and ethically defensible.</w:t>
-      </w:r>
-    </w:p>
-    <w:p>
-      <w:pPr>
-        <w:pStyle w:val="BodyText"/>
-        <w:rPr/>
-      </w:pPr>
-      <w:r>
-        <w:rPr/>
-        <w:t>The existing AI-literacy literature frames responsibility as principle-based. UNESCO’s AI Competency Framework for Students names “Ethics of AI” as one of four dimensions and operationalises it as “ethical value judgements, embodied reflections, and social and emotional skills students require to navigate … principles and regulatory rules.”</w:t>
-      </w:r>
-      <w:r>
-        <w:rPr>
-          <w:rFonts w:ascii="Inter" w:hAnsi="Inter" w:cs="Inter"/>
-          <w:b/>
-          <w:color w:val="3092B1"/>
-          <w:position w:val="8"/>
-          <w:sz w:val="18"/>
-          <w:szCs w:val="18"/>
-          <w:vertAlign w:val="superscript"/>
-        </w:rPr>
-        <w:footnoteReference w:id="13"/>
-      </w:r>
-      <w:r>
-        <w:rPr/>
-        <w:t xml:space="preserve"> The Council of Graduate Schools and Institut national de la recherche scientifique Global Action Agenda, published November 2025, lists seven guiding principles, of which three carry the responsible-use weight: “Integrity,” “Transparency,” and “Responsibility and Accountability.”</w:t>
-      </w:r>
-      <w:r>
-        <w:rPr>
-          <w:rFonts w:ascii="Inter" w:hAnsi="Inter" w:cs="Inter"/>
-          <w:b/>
-          <w:color w:val="3092B1"/>
-          <w:position w:val="8"/>
-          <w:sz w:val="18"/>
-          <w:szCs w:val="18"/>
-          <w:vertAlign w:val="superscript"/>
-        </w:rPr>
-        <w:footnoteReference w:id="14"/>
-      </w:r>
-      <w:r>
-        <w:rPr/>
-        <w:t xml:space="preserve"> The Blau et al. PNAS editorial of May 2024, written for the broader scientific community by the US National Academies, names five principles: transparent disclosure and attribution; verification of AI-generated content and analyses; documentation of AI-generated data; ethics and equity; and continuous monitoring, oversight, and public engagement.</w:t>
-      </w:r>
-      <w:r>
-        <w:rPr>
-          <w:rFonts w:ascii="Inter" w:hAnsi="Inter" w:cs="Inter"/>
-          <w:b/>
-          <w:color w:val="3092B1"/>
-          <w:position w:val="8"/>
-          <w:sz w:val="18"/>
-          <w:szCs w:val="18"/>
-          <w:vertAlign w:val="superscript"/>
-        </w:rPr>
-        <w:footnoteReference w:id="15"/>
-      </w:r>
-      <w:r>
-        <w:rPr/>
-        <w:t xml:space="preserve"> All three frameworks specify what responsible AI use looks like in </w:t>
-      </w:r>
-      <w:r>
-        <w:rPr>
-          <w:i/>
-          <w:iCs/>
-        </w:rPr>
-        <w:t>principle</w:t>
-      </w:r>
-      <w:r>
-        <w:rPr/>
-        <w:t xml:space="preserve">. None specifies what it looks like in </w:t>
-      </w:r>
-      <w:r>
-        <w:rPr>
-          <w:i/>
-          <w:iCs/>
-        </w:rPr>
-        <w:t>practice</w:t>
-      </w:r>
-      <w:r>
-        <w:rPr/>
-        <w:t>: what a responsible literature-synthesis workflow consists of, what a methods-section disclosure should include for a specific class of AI tool, what an examiner should check during a viva voce, what a supervisor should ask a candidate to demonstrate before accepting an AI-augmented analysis chapter into a thesis.</w:t>
-      </w:r>
-    </w:p>
-    <w:p>
-      <w:pPr>
-        <w:pStyle w:val="BodyText"/>
-        <w:rPr/>
-      </w:pPr>
-      <w:r>
-        <w:rPr/>
-        <w:t>The vacuum is not the absence of principles. It is the absence of the operational specification between principle and practice. The five-dimension framework in Part 2 is built to be that operational specification.</w:t>
-      </w:r>
-    </w:p>
-    <w:p>
-      <w:pPr>
-        <w:pStyle w:val="BodyText"/>
-        <w:rPr/>
-      </w:pPr>
-      <w:r>
-        <w:rPr/>
-        <w:t xml:space="preserve">By “responsible,” this report means AI use that is </w:t>
-      </w:r>
-      <w:r>
-        <w:rPr>
-          <w:i/>
-          <w:iCs/>
-        </w:rPr>
-        <w:t>ethical, valid, reproducible, and transparent</w:t>
-      </w:r>
-      <w:r>
-        <w:rPr/>
-        <w:t xml:space="preserve">. These four are not arbitrary; they are the conditions under which AI-augmented research remains research. </w:t>
-      </w:r>
-      <w:r>
-        <w:rPr>
-          <w:i/>
-          <w:iCs/>
-        </w:rPr>
-        <w:t>Ethical</w:t>
-      </w:r>
-      <w:r>
-        <w:rPr/>
-        <w:t xml:space="preserve"> use does not harm research participants, affected communities, or third parties whose data is processed. </w:t>
-      </w:r>
-      <w:r>
-        <w:rPr>
-          <w:i/>
-          <w:iCs/>
-        </w:rPr>
-        <w:t>Valid</w:t>
-      </w:r>
-      <w:r>
-        <w:rPr/>
-        <w:t xml:space="preserve"> use means the inferences AI helps produce meet the same methodological and evidentiary standards as human-produced inferences, including assumption-checking, sensitivity analysis, and replication. </w:t>
-      </w:r>
-      <w:r>
-        <w:rPr>
-          <w:i/>
-          <w:iCs/>
-        </w:rPr>
-        <w:t>Reproducible</w:t>
-      </w:r>
-      <w:r>
-        <w:rPr/>
-        <w:t xml:space="preserve"> use means another researcher with access to the same inputs, prompts, parameters, and tool version can reproduce the output to a stated tolerance. </w:t>
-      </w:r>
-      <w:r>
-        <w:rPr>
-          <w:i/>
-          <w:iCs/>
-        </w:rPr>
-        <w:t>Transparent</w:t>
-      </w:r>
-      <w:r>
-        <w:rPr/>
-        <w:t xml:space="preserve"> use means AI’s role is disclosed with enough specificity for supervisors, examiners, reviewers, and readers to assess it. These four properties are necessary together; no three substitute for the fourth.</w:t>
-      </w:r>
-      <w:bookmarkEnd w:id="21"/>
-    </w:p>
-    <w:p>
-      <w:pPr>
-        <w:pStyle w:val="Heading3"/>
-        <w:rPr/>
-      </w:pPr>
-      <w:bookmarkStart w:id="22" w:name="the-institutional-baseline-in-2026"/>
-      <w:r>
-        <w:rPr/>
-        <w:t>1.3 The institutional baseline in 2026</w:t>
-      </w:r>
-    </w:p>
-    <w:p>
-      <w:pPr>
-        <w:pStyle w:val="FirstParagraph"/>
-        <w:rPr/>
-      </w:pPr>
-      <w:r>
-        <w:rPr/>
-        <w:t>Across thirty-eight top-tier doctoral universities in fifteen countries and jurisdictions, institutional AI policies fall into four maturity classes defined by capability scope: assessment-only rules, dedicated student-misconduct policies, research-integrity policies, and AI-literacy policies that reach supervision and examination. The sample classifies into four categories in ascending order of scope:</w:t>
-      </w:r>
-      <w:r>
-        <w:rPr>
-          <w:rFonts w:ascii="Inter" w:hAnsi="Inter" w:cs="Inter"/>
-          <w:b/>
-          <w:color w:val="3092B1"/>
-          <w:position w:val="8"/>
-          <w:sz w:val="18"/>
-          <w:szCs w:val="18"/>
-          <w:vertAlign w:val="superscript"/>
-        </w:rPr>
-        <w:footnoteReference w:id="16"/>
-      </w:r>
-    </w:p>
-    <w:p>
-      <w:pPr>
-        <w:pStyle w:val="Compact"/>
-        <w:numPr>
-          <w:ilvl w:val="0"/>
-          <w:numId w:val="7"/>
-        </w:numPr>
-        <w:rPr/>
-      </w:pPr>
-      <w:r>
-        <w:rPr>
-          <w:i/>
-          <w:iCs/>
-        </w:rPr>
-        <w:t>Class A — Generic student-conduct policy with an AI clause appended.</w:t>
-      </w:r>
-      <w:r>
-        <w:rPr/>
-        <w:t xml:space="preserve"> Four of the thirty-eight universities (approximately 11 per cent) sit here. AI appears only inside the institution’s existing academic-integrity rules; there is no separate framing for the research and research-training side. Stanford, Yale, UC Berkeley, and Wisconsin-Madison cluster at this layer.</w:t>
-      </w:r>
-    </w:p>
-    <w:p>
-      <w:pPr>
-        <w:pStyle w:val="Compact"/>
-        <w:numPr>
-          <w:ilvl w:val="0"/>
-          <w:numId w:val="7"/>
-        </w:numPr>
-        <w:rPr/>
-      </w:pPr>
-      <w:r>
-        <w:rPr>
-          <w:i/>
-          <w:iCs/>
-        </w:rPr>
-        <w:t>Class B — AI-specific policy on plagiarism only.</w:t>
-      </w:r>
-      <w:r>
-        <w:rPr/>
-        <w:t xml:space="preserve"> Eleven of the thirty-eight (approximately 29 per cent) sit here. A dedicated AI policy exists, but the policy’s substantive scope ends at student-misconduct framing, extended at most to a co-authorship rule that AI cannot be listed as an author of a scholarly work. Cambridge, Harvard, MIT, Princeton, Michigan, the University of Western Australia, Karolinska, Aarhus, the University of Tokyo, the National University of Singapore, and HKUST cluster at this layer.</w:t>
-      </w:r>
-    </w:p>
-    <w:p>
-      <w:pPr>
-        <w:pStyle w:val="Compact"/>
-        <w:numPr>
-          <w:ilvl w:val="0"/>
-          <w:numId w:val="7"/>
-        </w:numPr>
-        <w:rPr/>
-      </w:pPr>
-      <w:r>
-        <w:rPr>
-          <w:i/>
-          <w:iCs/>
-        </w:rPr>
-        <w:t>Class C — AI-specific policy extending into research integrity and reproducibility.</w:t>
-      </w:r>
-      <w:r>
-        <w:rPr/>
-        <w:t xml:space="preserve"> Seventeen of the thirty-eight (approximately 45 per cent) sit here, the modal posture. These policies address validity, reproducibility, fabrication risk, validator-use of AI, and disclosure on research outputs. Oxford, Imperial, Edinburgh, five of the Australian Group of Eight (Melbourne, Sydney, ANU, Queensland, Monash), the German LMU, Humboldt-Berlin, and RWTH Aachen, ETH Zürich, EPFL, TU Delft, and the Canadian Toronto, McGill, and UBC cluster at this layer.</w:t>
-      </w:r>
-    </w:p>
-    <w:p>
-      <w:pPr>
-        <w:pStyle w:val="Compact"/>
-        <w:numPr>
-          <w:ilvl w:val="0"/>
-          <w:numId w:val="7"/>
-        </w:numPr>
-        <w:rPr/>
-      </w:pPr>
-      <w:r>
-        <w:rPr>
-          <w:i/>
-          <w:iCs/>
-        </w:rPr>
-        <w:t>Class D — AI-specific policy extending into AI literacy, competency, and examiner discipline.</w:t>
-      </w:r>
-      <w:r>
-        <w:rPr/>
-        <w:t xml:space="preserve"> Six of the thirty-eight (approximately 16 per cent) sit here. Class C plus an articulated competency expectation for graduate students and supervisors, plus references to curriculum content, plus examiner-side rules for the viva voce and the thesis declaration. University College London’s Doctoral School, King’s College London’s Centre for Education Studies, the German Heidelberg Graduate Academy, the Belgian KU Leuven, the Finnish University of Helsinki, and China’s Tsinghua University populate the Class D group.</w:t>
-      </w:r>
-      <w:r>
-        <w:rPr>
-          <w:rFonts w:ascii="Inter" w:hAnsi="Inter" w:cs="Inter"/>
-          <w:b/>
-          <w:color w:val="3092B1"/>
-          <w:position w:val="8"/>
-          <w:sz w:val="18"/>
-          <w:szCs w:val="18"/>
-          <w:vertAlign w:val="superscript"/>
-        </w:rPr>
-        <w:footnoteReference w:id="17"/>
-      </w:r>
-    </w:p>
-    <w:p>
-      <w:pPr>
-        <w:pStyle w:val="FirstParagraph"/>
-        <w:rPr/>
-      </w:pPr>
-      <w:r>
-        <w:rPr/>
-        <w:t xml:space="preserve">The cross-country picture is sharper than the within-country picture. The German U15 sample (LMU, Heidelberg, Humboldt-Berlin, RWTH Aachen) clusters tightly at Class C and D, anchored by the pre-existing </w:t>
-      </w:r>
-      <w:r>
-        <w:rPr>
-          <w:i/>
-          <w:iCs/>
-        </w:rPr>
-        <w:t>eidesstattliche Versicherung</w:t>
-      </w:r>
-      <w:r>
-        <w:rPr/>
-        <w:t xml:space="preserve"> tradition: every German doctoral candidate already signs a sworn declaration that the work was completed independently, and AI disclosure has been bolted onto that pre-existing instrument with native legal anchorage. The Australian Group of Eight sits five-of-six at Class C, anchored by the 2018 Australian Code for the Responsible Conduct of Research; the University of Western Australia is the Class B exception, with a principles-led University Executive posture rather than a codified doctoral-research-specific policy. The Code supplies a common research-integrity reference that institutional policy across the cluster can hang AI disclosure on, without each institution having to invent its own. The UK Russell Group is the most bimodal cluster: Cambridge sits at Class B, Imperial at Class C, while UCL and KCL are clear Class D and the sector’s policy leaders. The US Ivy-Plus and Association of American Universities sample is the lagging cluster despite hosting much of the AI research itself; central doctoral-research policy is thin, devolved to schools, faculties, and supervisors, and the modal posture is Class A or B. The continental European research-intensives are clustered at Class C with KU Leuven and Helsinki as Class D outliers. Asia is bimodal: Tsinghua leapfrogs to Class D with its December 2025 university-wide AI framework, the first institutional AI policy in the global sample to cover teaching, research, and theses in a single integrated document, while the University of Tokyo, the National University of Singapore, and HKUST sit at Class B.</w:t>
-      </w:r>
-    </w:p>
-    <w:p>
-      <w:pPr>
-        <w:pStyle w:val="BodyText"/>
-        <w:rPr/>
-      </w:pPr>
-      <w:r>
-        <w:rPr/>
-        <w:t>Approximately one in six of the world’s top-tier doctoral universities has an AI policy that extends past research integrity into AI literacy and valid research practices. Class C and Class D combined, the policies that go past plagiarism into research integrity, account for around three in five (twenty-three of thirty-eight); the remaining 40 per cent sit at the plagiarism-policy ceiling. The cover-table comparator of this report is the smaller leading number: only six of the thirty-eight institutions reach AI literacy and valid research practices. The operational difference between Class C and Class D is the difference between disclosure-and-verification rules that bind researchers’ own conduct (Class C) and the same rules plus codified competency expectations for graduate students and supervisors and examiner-side rules for the viva voce and the thesis declaration (Class D). The maturity grid in Part 4 is designed to make those capabilities reachable for institutions at any starting class.</w:t>
-      </w:r>
-    </w:p>
-    <w:p>
-      <w:pPr>
-        <w:pStyle w:val="Normal"/>
-        <w:rPr/>
-      </w:pPr>
-      <w:r>
-        <w:rPr/>
-        <mc:AlternateContent>
-          <mc:Choice Requires="wps">
-            <w:drawing>
-              <wp:inline distT="0" distB="0" distL="0" distR="0">
-                <wp:extent cx="5972810" cy="19050"/>
-                <wp:effectExtent l="0" t="0" r="0" b="0"/>
-                <wp:docPr id="6" name=""/>
-                <a:graphic xmlns:a="http://schemas.openxmlformats.org/drawingml/2006/main">
-                  <a:graphicData uri="http://schemas.microsoft.com/office/word/2010/wordprocessingShape">
-                    <wps:wsp>
-                      <wps:cNvSpPr/>
-                      <wps:nvSpPr>
-                        <wps:cNvPr id="7" name=""/>
                         <wps:cNvSpPr/>
                       </wps:nvSpPr>
                       <wps:spPr>
@@ -6898,11 +6946,47 @@
           <w:b/>
           <w:bCs/>
         </w:rPr>
-        <w:t>Author and contact.</w:t>
-      </w:r>
-      <w:r>
-        <w:rPr/>
-        <w:t xml:space="preserve"> Michael J. Zyphur, PhD (Instats; ORCID 0000-0003-3237-7892; support@instats.org).</w:t>
+        <w:t>About the author.</w:t>
+      </w:r>
+      <w:r>
+        <w:rPr/>
+        <w:t xml:space="preserve"> Michael J. Zyphur is the Director of Instats and a Professor of Quantitative Methods at the University of Queensland. His research is at </w:t>
+      </w:r>
+      <w:hyperlink r:id="rId11">
+        <w:r>
+          <w:rPr>
+            <w:rStyle w:val="Hyperlink"/>
+          </w:rPr>
+          <w:t>Google Scholar</w:t>
+        </w:r>
+      </w:hyperlink>
+      <w:r>
+        <w:rPr/>
+        <w:t xml:space="preserve">. ORCID: </w:t>
+      </w:r>
+      <w:hyperlink r:id="rId12">
+        <w:r>
+          <w:rPr>
+            <w:rStyle w:val="Hyperlink"/>
+          </w:rPr>
+          <w:t>0000-0003-3237-7892</w:t>
+        </w:r>
+      </w:hyperlink>
+      <w:r>
+        <w:rPr/>
+        <w:t xml:space="preserve">. Contact: </w:t>
+      </w:r>
+      <w:hyperlink r:id="rId13">
+        <w:r>
+          <w:rPr>
+            <w:rStyle w:val="Hyperlink"/>
+          </w:rPr>
+          <w:t>support@instats.org</w:t>
+        </w:r>
+      </w:hyperlink>
+      <w:r>
+        <w:rPr/>
+        <w:t>.</w:t>
       </w:r>
     </w:p>
     <w:p>
@@ -9365,12 +9449,12 @@
       <w:bookmarkEnd w:id="52"/>
     </w:p>
     <w:sectPr>
-      <w:headerReference w:type="even" r:id="rId7"/>
-      <w:headerReference w:type="default" r:id="rId8"/>
-      <w:headerReference w:type="first" r:id="rId9"/>
-      <w:footerReference w:type="even" r:id="rId10"/>
-      <w:footerReference w:type="default" r:id="rId11"/>
-      <w:footerReference w:type="first" r:id="rId12"/>
+      <w:headerReference w:type="even" r:id="rId14"/>
+      <w:headerReference w:type="default" r:id="rId15"/>
+      <w:headerReference w:type="first" r:id="rId16"/>
+      <w:footerReference w:type="even" r:id="rId17"/>
+      <w:footerReference w:type="default" r:id="rId18"/>
+      <w:footerReference w:type="first" r:id="rId19"/>
       <w:footnotePr>
         <w:numFmt w:val="decimal"/>
       </w:footnotePr>
@@ -11208,7 +11292,7 @@
         <w:color w:val="495057"/>
         <w:sz w:val="17"/>
       </w:rPr>
-      <w:t>Instats Policy Series  ·  Responsible AI in research training (v1.2.3)</w:t>
+      <w:t>Instats Policy Series  ·  Responsible AI in research training</w:t>
     </w:r>
   </w:p>
 </w:hdr>

</xml_diff>

<commit_message>
Rename Capability → Competency framework wording
Renames every "Capability"/"capability"/"Capabilities"/"capabilities"
instance to the corresponding Competency form throughout the report,
metadata, and CITATION. Regenerates HTML, PDF, DOCX with the updated
wording. Reflects researcher-skill focus matching UK/Australia pedagogy
lingo. No substantive content changes; framework label only.
</commit_message>
<xml_diff>
--- a/docs/Instats - Responsible AI in Academic Research.docx
+++ b/docs/Instats - Responsible AI in Academic Research.docx
@@ -37,13 +37,13 @@
         <w:pStyle w:val="Heading2"/>
         <w:rPr/>
       </w:pPr>
-      <w:bookmarkStart w:id="1" w:name="Xb0099d9a5ffa4a0bdea957eac68513c9492629b"/>
+      <w:bookmarkStart w:id="1" w:name="X2fb842355ac54787f42696b927d479d64be5772"/>
       <w:r>
         <w:rPr>
           <w:i/>
           <w:iCs/>
         </w:rPr>
-        <w:t>A Capability Framework for Research Training</w:t>
+        <w:t>A Competency Framework for Research Training</w:t>
       </w:r>
     </w:p>
     <w:p>
@@ -64,7 +64,7 @@
       </w:r>
       <w:r>
         <w:rPr/>
-        <w:t xml:space="preserve"> have AI policies that extend past research integrity into AI literacy and valid research practices. The world’s major academic publishers, by contrast, issued a substantively identical no-AI-co-author policy across the sector within ten weeks of ChatGPT-3.5’s public release. The United Kingdom’s canonical PhD-researcher-development framework, refreshed in 2025, did not treat AI as a competency at all. While publishers and funders have responded to the emergence of AI, the universities that actually train researchers are lagging far behind what is needed to prepare them to use it responsibly. This report describes the significant opportunities and problems that agentic generative AI creates for research, setting out a capability framework for research training in the 21st century.</w:t>
+        <w:t xml:space="preserve"> have AI policies that extend past research integrity into AI literacy and valid research practices. The world’s major academic publishers, by contrast, issued a substantively identical no-AI-co-author policy across the sector within ten weeks of ChatGPT-3.5’s public release. The United Kingdom’s canonical PhD-researcher-development framework, refreshed in 2025, did not treat AI as a competency at all. While publishers and funders have responded to the emergence of AI, the universities that actually train researchers are lagging far behind what is needed to prepare them to use it responsibly. This report describes the significant opportunities and problems that agentic generative AI creates for research, setting out a competency framework for research training in the 21st century.</w:t>
       </w:r>
     </w:p>
     <w:p>
@@ -145,7 +145,7 @@
           <w:i/>
           <w:iCs/>
         </w:rPr>
-        <w:t>Responsible AI in Academic Research: A Capability Framework for Research Training.</w:t>
+        <w:t>Responsible AI in Academic Research: A Competency Framework for Research Training.</w:t>
       </w:r>
       <w:r>
         <w:rPr/>
@@ -332,7 +332,7 @@
       </w:pPr>
       <w:r>
         <w:rPr/>
-        <w:t>Since ChatGPT-3.5’s release in late 2022, major academic publishers, national research funders, and international capability-framework bodies have responded to AI in research. Publishers moved first and most uniformly: they issued substantively identical “no-AI-co-author” policies across the major journals within ten weeks of the release, later refining them into disclosure templates (Elsevier’s “Declaration of Generative AI” section; JAMA’s three-location rule; BMJ’s submission-form integration). National research funders moved more slowly and unevenly, issuing AI-in-application policies between September 2023 and April 2026; the German Research Foundation went first, the Australian Research Council and the National Health and Medical Research Council went last. International capability-framework bodies have published the AI-literacy literature universities now cite as their reference: UNESCO’s AI Competency Frameworks for Students and Teachers, the OECD-EC AILit Framework, the Council of Graduate Schools and INRS Global Action Agenda, the US National Academies’ five-principles editorial.</w:t>
+        <w:t>Since ChatGPT-3.5’s release in late 2022, major academic publishers, national research funders, and international competency-framework bodies have responded to AI in research. Publishers moved first and most uniformly: they issued substantively identical “no-AI-co-author” policies across the major journals within ten weeks of the release, later refining them into disclosure templates (Elsevier’s “Declaration of Generative AI” section; JAMA’s three-location rule; BMJ’s submission-form integration). National research funders moved more slowly and unevenly, issuing AI-in-application policies between September 2023 and April 2026; the German Research Foundation went first, the Australian Research Council and the National Health and Medical Research Council went last. International competency-framework bodies have published the AI-literacy literature universities now cite as their reference: UNESCO’s AI Competency Frameworks for Students and Teachers, the OECD-EC AILit Framework, the Council of Graduate Schools and INRS Global Action Agenda, the US National Academies’ five-principles editorial.</w:t>
       </w:r>
     </w:p>
     <w:p>
@@ -414,11 +414,11 @@
           <w:i/>
           <w:iCs/>
         </w:rPr>
-        <w:t>Policy alone is not the capability.</w:t>
-      </w:r>
-      <w:r>
-        <w:rPr/>
-        <w:t xml:space="preserve"> The most common institutional move in 2026 is to publish a single AI-policy document and treat the problem as closed. The capability sits across four institutional dimensions: the policy itself, the people responsible for enacting it, the systems that support it, and the process by which AI use enters supervision and examination. A policy is one row in the capability grid, not the grid.</w:t>
+        <w:t>Policy alone is not the competency.</w:t>
+      </w:r>
+      <w:r>
+        <w:rPr/>
+        <w:t xml:space="preserve"> The most common institutional move in 2026 is to publish a single AI-policy document and treat the problem as closed. The competency sits across four institutional dimensions: the policy itself, the people responsible for enacting it, the systems that support it, and the process by which AI use enters supervision and examination. A policy is one row in the competency grid, not the grid.</w:t>
       </w:r>
     </w:p>
     <w:p>
@@ -448,7 +448,7 @@
       </w:pPr>
       <w:r>
         <w:rPr/>
-        <w:t>The evidence supports a five-dimension capability framework, a maturity grid for institutional self-diagnosis, and audience-specific recommendations for the five leadership audiences named above.</w:t>
+        <w:t>The evidence supports a five-dimension competency framework, a maturity grid for institutional self-diagnosis, and audience-specific recommendations for the five leadership audiences named above.</w:t>
       </w:r>
     </w:p>
     <w:p>
@@ -456,7 +456,6 @@
         <w:pStyle w:val="BodyText"/>
         <w:rPr/>
       </w:pPr>
-      <w:bookmarkStart w:id="3" w:name="fig-timeline"/>
       <w:r>
         <w:rPr/>
         <w:drawing>
@@ -498,7 +497,6 @@
           </wp:inline>
         </w:drawing>
       </w:r>
-      <w:bookmarkEnd w:id="3"/>
     </w:p>
     <w:p>
       <w:pPr>
@@ -546,7 +544,7 @@
         <w:pStyle w:val="Heading1"/>
         <w:rPr/>
       </w:pPr>
-      <w:bookmarkStart w:id="4" w:name="contents"/>
+      <w:bookmarkStart w:id="3" w:name="contents"/>
       <w:r>
         <w:rPr/>
         <w:t>Contents</w:t>
@@ -558,7 +556,7 @@
         <w:rPr/>
       </w:pPr>
       <w:hyperlink w:anchor="the-finding">
-        <w:bookmarkStart w:id="5" w:name="executive-summary"/>
+        <w:bookmarkStart w:id="4" w:name="executive-summary"/>
         <w:r>
           <w:rPr>
             <w:rStyle w:val="Hyperlink"/>
@@ -566,7 +564,7 @@
           <w:t>Executive summary</w:t>
         </w:r>
       </w:hyperlink>
-      <w:bookmarkEnd w:id="5"/>
+      <w:bookmarkEnd w:id="4"/>
     </w:p>
     <w:p>
       <w:pPr>
@@ -574,7 +572,7 @@
         <w:rPr/>
       </w:pPr>
       <w:hyperlink w:anchor="part-1-the-factual-baseline_1">
-        <w:bookmarkStart w:id="6" w:name="part-1-the-factual-baseline"/>
+        <w:bookmarkStart w:id="5" w:name="part-1-the-factual-baseline"/>
         <w:r>
           <w:rPr>
             <w:rStyle w:val="Hyperlink"/>
@@ -636,20 +634,20 @@
           <w:t>1.3   The institutional baseline in 2026</w:t>
         </w:r>
       </w:hyperlink>
-      <w:bookmarkEnd w:id="6"/>
+      <w:bookmarkEnd w:id="5"/>
     </w:p>
     <w:p>
       <w:pPr>
         <w:pStyle w:val="Heading4"/>
         <w:rPr/>
       </w:pPr>
-      <w:hyperlink w:anchor="X4f9d66c4114ab910b08655494b03e6cc2bb0186">
-        <w:bookmarkStart w:id="7" w:name="X3bd643d343f2974ee01ac844e0357dfaba13ffe"/>
+      <w:hyperlink w:anchor="Xd22f1a0d75c4301aba8c4bbfa004e2cc903c864">
+        <w:bookmarkStart w:id="6" w:name="X50b37e5fe9ce7efff6f54829b1659bce63095d4"/>
         <w:r>
           <w:rPr>
             <w:rStyle w:val="Hyperlink"/>
           </w:rPr>
-          <w:t>Part 2 — A five-dimension capability framework</w:t>
+          <w:t>Part 2 — A five-dimension competency framework</w:t>
         </w:r>
       </w:hyperlink>
     </w:p>
@@ -742,7 +740,7 @@
           <w:t>2.5   Dimension 5 — Institutional benchmarking grid</w:t>
         </w:r>
       </w:hyperlink>
-      <w:bookmarkEnd w:id="7"/>
+      <w:bookmarkEnd w:id="6"/>
     </w:p>
     <w:p>
       <w:pPr>
@@ -750,7 +748,7 @@
         <w:rPr/>
       </w:pPr>
       <w:hyperlink w:anchor="Xfaf275e331ed51ebecadb9345be19a0314acfc3">
-        <w:bookmarkStart w:id="8" w:name="Xdc77c75a62b621fcf7c8fe71c969742e2e32c4d"/>
+        <w:bookmarkStart w:id="7" w:name="Xdc77c75a62b621fcf7c8fe71c969742e2e32c4d"/>
         <w:r>
           <w:rPr>
             <w:rStyle w:val="Hyperlink"/>
@@ -830,7 +828,7 @@
           <w:t>3.4   Existing AI-literacy and researcher-development frameworks</w:t>
         </w:r>
       </w:hyperlink>
-      <w:bookmarkEnd w:id="8"/>
+      <w:bookmarkEnd w:id="7"/>
     </w:p>
     <w:p>
       <w:pPr>
@@ -838,7 +836,7 @@
         <w:rPr/>
       </w:pPr>
       <w:hyperlink w:anchor="part-4-the-maturity-grid_1">
-        <w:bookmarkStart w:id="9" w:name="part-4-the-maturity-grid"/>
+        <w:bookmarkStart w:id="8" w:name="part-4-the-maturity-grid"/>
         <w:r>
           <w:rPr>
             <w:rStyle w:val="Hyperlink"/>
@@ -900,7 +898,7 @@
           <w:t>4.3   Worked institutional examples</w:t>
         </w:r>
       </w:hyperlink>
-      <w:bookmarkEnd w:id="9"/>
+      <w:bookmarkEnd w:id="8"/>
     </w:p>
     <w:p>
       <w:pPr>
@@ -908,7 +906,7 @@
         <w:rPr/>
       </w:pPr>
       <w:hyperlink w:anchor="Xa1dfcb691ac0c1297bce0e5e7c4e1d6d6dc6ae7">
-        <w:bookmarkStart w:id="10" w:name="Xade74cb8c91f1bbf3902d8c6c15257bafa8604c"/>
+        <w:bookmarkStart w:id="9" w:name="Xade74cb8c91f1bbf3902d8c6c15257bafa8604c"/>
         <w:r>
           <w:rPr>
             <w:rStyle w:val="Hyperlink"/>
@@ -1006,7 +1004,7 @@
           <w:t>5.5   For peak bodies for graduate students</w:t>
         </w:r>
       </w:hyperlink>
-      <w:bookmarkEnd w:id="10"/>
+      <w:bookmarkEnd w:id="9"/>
     </w:p>
     <w:p>
       <w:pPr>
@@ -1014,7 +1012,7 @@
         <w:rPr/>
       </w:pPr>
       <w:hyperlink w:anchor="conclusion_1">
-        <w:bookmarkStart w:id="11" w:name="conclusion"/>
+        <w:bookmarkStart w:id="10" w:name="conclusion"/>
         <w:r>
           <w:rPr>
             <w:rStyle w:val="Hyperlink"/>
@@ -1022,7 +1020,7 @@
           <w:t>Conclusion</w:t>
         </w:r>
       </w:hyperlink>
-      <w:bookmarkEnd w:id="11"/>
+      <w:bookmarkEnd w:id="10"/>
     </w:p>
     <w:p>
       <w:pPr>
@@ -1030,7 +1028,7 @@
         <w:rPr/>
       </w:pPr>
       <w:hyperlink w:anchor="X58efa211c38677f6721adc2049a1ec624e0c3e5">
-        <w:bookmarkStart w:id="12" w:name="Xacafc5f6c5affb2bcbe0c710c92c025823d84b1"/>
+        <w:bookmarkStart w:id="11" w:name="Xacafc5f6c5affb2bcbe0c710c92c025823d84b1"/>
         <w:r>
           <w:rPr>
             <w:rStyle w:val="Hyperlink"/>
@@ -1038,7 +1036,7 @@
           <w:t>Appendix A — The maturity grid, full version</w:t>
         </w:r>
       </w:hyperlink>
-      <w:bookmarkEnd w:id="12"/>
+      <w:bookmarkEnd w:id="11"/>
     </w:p>
     <w:p>
       <w:pPr>
@@ -1046,7 +1044,7 @@
         <w:rPr/>
       </w:pPr>
       <w:hyperlink w:anchor="X30a15aa0718d80bdea4e1d3776a0ba9becb19b9">
-        <w:bookmarkStart w:id="13" w:name="Xa4fff6b6df5f7a3b09445c229bc4b09ed80ee37"/>
+        <w:bookmarkStart w:id="12" w:name="Xa4fff6b6df5f7a3b09445c229bc4b09ed80ee37"/>
         <w:r>
           <w:rPr>
             <w:rStyle w:val="Hyperlink"/>
@@ -1054,7 +1052,7 @@
           <w:t>Appendix B — Country and institutional dossiers</w:t>
         </w:r>
       </w:hyperlink>
-      <w:bookmarkEnd w:id="13"/>
+      <w:bookmarkEnd w:id="12"/>
     </w:p>
     <w:p>
       <w:pPr>
@@ -1062,7 +1060,7 @@
         <w:rPr/>
       </w:pPr>
       <w:hyperlink w:anchor="appendix-c-glossary-of-ai-tool-classes_1">
-        <w:bookmarkStart w:id="14" w:name="appendix-c-glossary-of-ai-tool-classes"/>
+        <w:bookmarkStart w:id="13" w:name="appendix-c-glossary-of-ai-tool-classes"/>
         <w:r>
           <w:rPr>
             <w:rStyle w:val="Hyperlink"/>
@@ -1070,7 +1068,7 @@
           <w:t>Appendix C — Glossary of AI tool classes</w:t>
         </w:r>
       </w:hyperlink>
-      <w:bookmarkEnd w:id="14"/>
+      <w:bookmarkEnd w:id="13"/>
     </w:p>
     <w:p>
       <w:pPr>
@@ -1078,7 +1076,7 @@
         <w:rPr/>
       </w:pPr>
       <w:hyperlink w:anchor="appendix-d-about-this-report_1">
-        <w:bookmarkStart w:id="15" w:name="appendix-d-about-this-report"/>
+        <w:bookmarkStart w:id="14" w:name="appendix-d-about-this-report"/>
         <w:r>
           <w:rPr>
             <w:rStyle w:val="Hyperlink"/>
@@ -1086,7 +1084,7 @@
           <w:t>Appendix D — About this report</w:t>
         </w:r>
       </w:hyperlink>
-      <w:bookmarkEnd w:id="15"/>
+      <w:bookmarkEnd w:id="14"/>
     </w:p>
     <w:p>
       <w:pPr>
@@ -1094,7 +1092,7 @@
         <w:rPr/>
       </w:pPr>
       <w:hyperlink w:anchor="appendix-e-sources_1">
-        <w:bookmarkStart w:id="16" w:name="appendix-e-sources"/>
+        <w:bookmarkStart w:id="15" w:name="appendix-e-sources"/>
         <w:r>
           <w:rPr>
             <w:rStyle w:val="Hyperlink"/>
@@ -1102,7 +1100,7 @@
           <w:t>Appendix E — Sources</w:t>
         </w:r>
       </w:hyperlink>
-      <w:bookmarkEnd w:id="16"/>
+      <w:bookmarkEnd w:id="15"/>
     </w:p>
     <w:p>
       <w:pPr>
@@ -1110,7 +1108,7 @@
         <w:rPr/>
       </w:pPr>
       <w:hyperlink w:anchor="appendix-f-regional-adaptation-note_1">
-        <w:bookmarkStart w:id="17" w:name="appendix-f-regional-adaptation-note"/>
+        <w:bookmarkStart w:id="16" w:name="appendix-f-regional-adaptation-note"/>
         <w:r>
           <w:rPr>
             <w:rStyle w:val="Hyperlink"/>
@@ -1118,7 +1116,7 @@
           <w:t>Appendix F — Regional-adaptation note</w:t>
         </w:r>
       </w:hyperlink>
-      <w:bookmarkEnd w:id="17"/>
+      <w:bookmarkEnd w:id="16"/>
     </w:p>
     <w:p>
       <w:pPr>
@@ -1126,7 +1124,7 @@
         <w:rPr/>
       </w:pPr>
       <w:hyperlink w:anchor="Xbed8346cde3d6a4651c2d5c0a174b243c58d415">
-        <w:bookmarkStart w:id="18" w:name="X62e7b9ee26ca01e0177273e17f9dc12e4526de9"/>
+        <w:bookmarkStart w:id="17" w:name="X62e7b9ee26ca01e0177273e17f9dc12e4526de9"/>
         <w:r>
           <w:rPr>
             <w:rStyle w:val="Hyperlink"/>
@@ -1195,14 +1193,14 @@
           </mc:Fallback>
         </mc:AlternateContent>
       </w:r>
-      <w:bookmarkEnd w:id="18"/>
+      <w:bookmarkEnd w:id="17"/>
     </w:p>
     <w:p>
       <w:pPr>
         <w:pStyle w:val="Heading2"/>
         <w:rPr/>
       </w:pPr>
-      <w:bookmarkStart w:id="19" w:name="part-1-the-factual-baseline-1"/>
+      <w:bookmarkStart w:id="18" w:name="part-1-the-factual-baseline-1"/>
       <w:r>
         <w:rPr/>
         <w:t>Part 1 — The factual baseline</w:t>
@@ -1213,7 +1211,7 @@
         <w:pStyle w:val="Heading3"/>
         <w:rPr/>
       </w:pPr>
-      <w:bookmarkStart w:id="20" w:name="X25f912980d44fa8a235942a34c9340eb32a665f"/>
+      <w:bookmarkStart w:id="19" w:name="X25f912980d44fa8a235942a34c9340eb32a665f"/>
       <w:r>
         <w:rPr/>
         <w:t>1.1 The shift in research practice, 2022 to 2026</w:t>
@@ -1347,14 +1345,14 @@
         <w:rPr/>
         <w:t>That is the gap this report addresses: research practice has changed faster than university policy has defined responsible AI use in PhD training.</w:t>
       </w:r>
-      <w:bookmarkEnd w:id="20"/>
+      <w:bookmarkEnd w:id="19"/>
     </w:p>
     <w:p>
       <w:pPr>
         <w:pStyle w:val="Heading3"/>
         <w:rPr/>
       </w:pPr>
-      <w:bookmarkStart w:id="21" w:name="X249cd8f8d3611a5f7cf9a267ae9e027e6df62ea"/>
+      <w:bookmarkStart w:id="20" w:name="X249cd8f8d3611a5f7cf9a267ae9e027e6df62ea"/>
       <w:r>
         <w:rPr/>
         <w:t>1.2 What “responsible AI use” still lacks a definition for</w:t>
@@ -1367,7 +1365,7 @@
       </w:pPr>
       <w:r>
         <w:rPr/>
-        <w:t>Five years into the modern AI era, the phrase “responsible AI use” is in every funder policy, every publisher policy, every institutional policy, and every capability framework. The phrase is not in serious dispute. Its operational meaning is.</w:t>
+        <w:t>Five years into the modern AI era, the phrase “responsible AI use” is in every funder policy, every publisher policy, every institutional policy, and every competency framework. The phrase is not in serious dispute. Its operational meaning is.</w:t>
       </w:r>
     </w:p>
     <w:p>
@@ -1640,14 +1638,14 @@
         <w:rPr/>
         <w:t xml:space="preserve"> use means AI’s role is disclosed with enough specificity for supervisors, examiners, reviewers, and readers to assess it. These four properties are necessary together; no three substitute for the fourth.</w:t>
       </w:r>
-      <w:bookmarkEnd w:id="21"/>
+      <w:bookmarkEnd w:id="20"/>
     </w:p>
     <w:p>
       <w:pPr>
         <w:pStyle w:val="Heading3"/>
         <w:rPr/>
       </w:pPr>
-      <w:bookmarkStart w:id="22" w:name="the-institutional-baseline-in-2026"/>
+      <w:bookmarkStart w:id="21" w:name="the-institutional-baseline-in-2026"/>
       <w:r>
         <w:rPr/>
         <w:t>1.3 The institutional baseline in 2026</w:t>
@@ -1660,7 +1658,7 @@
       </w:pPr>
       <w:r>
         <w:rPr/>
-        <w:t>Across thirty-eight top-tier doctoral universities in fifteen countries and jurisdictions, institutional AI policies fall into four maturity classes defined by capability scope: assessment-only rules, dedicated student-misconduct policies, research-integrity policies, and AI-literacy policies that reach supervision and examination. The sample classifies into four categories in ascending order of scope:</w:t>
+        <w:t>Across thirty-eight top-tier doctoral universities in fifteen countries and jurisdictions, institutional AI policies fall into four maturity classes defined by competency scope: assessment-only rules, dedicated student-misconduct policies, research-integrity policies, and AI-literacy policies that reach supervision and examination. The sample classifies into four categories in ascending order of scope:</w:t>
       </w:r>
       <w:r>
         <w:rPr>
@@ -1799,7 +1797,7 @@
       </w:pPr>
       <w:r>
         <w:rPr/>
-        <w:t>Approximately one in six of the world’s top-tier doctoral universities has an AI policy that extends past research integrity into AI literacy and valid research practices. Class C and Class D combined, the policies that go past plagiarism into research integrity, account for around three in five (twenty-three of thirty-eight); the remaining 40 per cent sit at the plagiarism-policy ceiling. The cover-table comparator of this report is the smaller leading number: only six of the thirty-eight institutions reach AI literacy and valid research practices. The operational difference between Class C and Class D is the difference between disclosure-and-verification rules that bind researchers’ own conduct (Class C) and the same rules plus codified competency expectations for graduate students and supervisors and examiner-side rules for the viva voce and the thesis declaration (Class D). The maturity grid in Part 4 is designed to make those capabilities reachable for institutions at any starting class.</w:t>
+        <w:t>Approximately one in six of the world’s top-tier doctoral universities has an AI policy that extends past research integrity into AI literacy and valid research practices. Class C and Class D combined, the policies that go past plagiarism into research integrity, account for around three in five (twenty-three of thirty-eight); the remaining 40 per cent sit at the plagiarism-policy ceiling. The cover-table comparator of this report is the smaller leading number: only six of the thirty-eight institutions reach AI literacy and valid research practices. The operational difference between Class C and Class D is the difference between disclosure-and-verification rules that bind researchers’ own conduct (Class C) and the same rules plus codified competency expectations for graduate students and supervisors and examiner-side rules for the viva voce and the thesis declaration (Class D). The maturity grid in Part 4 is designed to make those competencies reachable for institutions at any starting class.</w:t>
       </w:r>
     </w:p>
     <w:p>
@@ -1862,18 +1860,18 @@
           </mc:Fallback>
         </mc:AlternateContent>
       </w:r>
-      <w:bookmarkEnd w:id="19"/>
-      <w:bookmarkEnd w:id="22"/>
+      <w:bookmarkEnd w:id="18"/>
+      <w:bookmarkEnd w:id="21"/>
     </w:p>
     <w:p>
       <w:pPr>
         <w:pStyle w:val="Heading2"/>
         <w:rPr/>
       </w:pPr>
-      <w:bookmarkStart w:id="23" w:name="X9ebc4f84bbc00a46a110ccc18a9acd7ffb35c1e"/>
-      <w:r>
-        <w:rPr/>
-        <w:t>Part 2 — A five-dimension capability framework</w:t>
+      <w:bookmarkStart w:id="22" w:name="X5539dbe61e1486b6995668c51a0ef1c8e045a94"/>
+      <w:r>
+        <w:rPr/>
+        <w:t>Part 2 — A five-dimension competency framework</w:t>
       </w:r>
     </w:p>
     <w:p>
@@ -1891,7 +1889,7 @@
         <w:pStyle w:val="Heading3"/>
         <w:rPr/>
       </w:pPr>
-      <w:bookmarkStart w:id="24" w:name="dimension-1-human-in-the-loop-discipline"/>
+      <w:bookmarkStart w:id="23" w:name="dimension-1-human-in-the-loop-discipline"/>
       <w:r>
         <w:rPr/>
         <w:t>2.1 Dimension 1 — Human-in-the-loop discipline</w:t>
@@ -2013,14 +2011,14 @@
         <w:rPr/>
         <w:t>Where Dimension 1 is absent, the result is the “AI did the analysis for me” failure mode and its institutional cousin, the “we used AI to validate our findings” justification offered without the disciplines Dimension 2 and Dimension 4 require. Where Dimension 1 is leading, the institution can answer the question “which research judgements stay human, why those, and how do we know” in a single paragraph that a Tier 1 audience member can read aloud to their council.</w:t>
       </w:r>
-      <w:bookmarkEnd w:id="24"/>
+      <w:bookmarkEnd w:id="23"/>
     </w:p>
     <w:p>
       <w:pPr>
         <w:pStyle w:val="Heading3"/>
         <w:rPr/>
       </w:pPr>
-      <w:bookmarkStart w:id="25" w:name="dimension-2-responsible-use-in-practice"/>
+      <w:bookmarkStart w:id="24" w:name="dimension-2-responsible-use-in-practice"/>
       <w:r>
         <w:rPr/>
         <w:t>2.2 Dimension 2 — Responsible use in practice</w:t>
@@ -2033,7 +2031,7 @@
       </w:pPr>
       <w:r>
         <w:rPr/>
-        <w:t>The second dimension is the operationalisation of “responsible AI use” from principle to research-task workflow. The phrase is in every funder, publisher, institutional, and capability-framework policy in the sample.</w:t>
+        <w:t>The second dimension is the operationalisation of “responsible AI use” from principle to research-task workflow. The phrase is in every funder, publisher, institutional, and competency-framework policy in the sample.</w:t>
       </w:r>
       <w:r>
         <w:rPr>
@@ -2215,7 +2213,7 @@
       </w:pPr>
       <w:r>
         <w:rPr/>
-        <w:t>The capability-framework literature converges at principle-level definitions: human-centred orientation, ethics, AI knowledge, AI literacy.</w:t>
+        <w:t>The competency-framework literature converges at principle-level definitions: human-centred orientation, ethics, AI knowledge, AI literacy.</w:t>
       </w:r>
       <w:r>
         <w:rPr>
@@ -2421,14 +2419,14 @@
         <w:rPr/>
         <w:t>The dimension’s operational test is whether the institution has translated its high-level “responsible use” language into rules at this level of specificity, and whether the supervision-and-examination practice actually applies them. Where it has, supervisors can articulate the practice on a single page; PhD candidates can apply it in their methods chapter; examiners can check it during the viva voce. Where it has not, “responsible use” remains a phrase rather than a practice.</w:t>
       </w:r>
-      <w:bookmarkEnd w:id="25"/>
+      <w:bookmarkEnd w:id="24"/>
     </w:p>
     <w:p>
       <w:pPr>
         <w:pStyle w:val="Heading3"/>
         <w:rPr/>
       </w:pPr>
-      <w:bookmarkStart w:id="26" w:name="X805c1c6013402fdf28df478a2e33eeb31711dbe"/>
+      <w:bookmarkStart w:id="25" w:name="X805c1c6013402fdf28df478a2e33eeb31711dbe"/>
       <w:r>
         <w:rPr/>
         <w:t>2.3 Dimension 3 — Tooling that promotes responsible use</w:t>
@@ -2441,7 +2439,7 @@
       </w:pPr>
       <w:r>
         <w:rPr/>
-        <w:t>The third dimension is the institutional commitment to choose, procure, and deploy AI tools that promote responsible use by construction, not by aspiration. The choice between a tool whose architecture makes responsible use easier and a tool whose architecture makes it harder is an observable institutional capability. Dossier 5 specifies the test.</w:t>
+        <w:t>The third dimension is the institutional commitment to choose, procure, and deploy AI tools that promote responsible use by construction, not by aspiration. The choice between a tool whose architecture makes responsible use easier and a tool whose architecture makes it harder is an observable institutional competency. Dossier 5 specifies the test.</w:t>
       </w:r>
       <w:r>
         <w:rPr>
@@ -2739,14 +2737,14 @@
         <w:rPr/>
         <w:t>Where Dimension 3 is absent, AI procurement is a private decision by each laboratory, with no institutional gate on the observable-property test. Where Dimension 3 is leading, the institution publishes its AI procurement standard, samples vendor outputs against the resolvability test before deployment, and re-tests on a stated cadence as model versions change.</w:t>
       </w:r>
-      <w:bookmarkEnd w:id="26"/>
+      <w:bookmarkEnd w:id="25"/>
     </w:p>
     <w:p>
       <w:pPr>
         <w:pStyle w:val="Heading3"/>
         <w:rPr/>
       </w:pPr>
-      <w:bookmarkStart w:id="27" w:name="dimension-4-ai-literate-humans"/>
+      <w:bookmarkStart w:id="26" w:name="dimension-4-ai-literate-humans"/>
       <w:r>
         <w:rPr/>
         <w:t>2.4 Dimension 4 — AI-literate humans</w:t>
@@ -2791,7 +2789,7 @@
       </w:r>
       <w:r>
         <w:rPr/>
-        <w:t xml:space="preserve"> The capability-framework literature in Dossier 3 populates this dimension more densely than any other, with UNESCO, OECD-EC AILit, Digital Education Council, Jisc, and DigComp 2.2 all contributing.</w:t>
+        <w:t xml:space="preserve"> The competency-framework literature in Dossier 3 populates this dimension more densely than any other, with UNESCO, OECD-EC AILit, Digital Education Council, Jisc, and DigComp 2.2 all contributing.</w:t>
       </w:r>
     </w:p>
     <w:p>
@@ -3139,14 +3137,14 @@
         <w:rPr/>
         <w:t>Where Dimension 4 is absent, the curriculum is either silent on AI or treats AI literacy as a tooling-skills problem (“which buttons to press in Claude or Gemini”). Where Dimension 4 is leading, the methods curriculum carries the six competencies above as named outcomes, supervisor training carries them as professional development, and examiner training carries the corresponding verification skills.</w:t>
       </w:r>
-      <w:bookmarkEnd w:id="27"/>
+      <w:bookmarkEnd w:id="26"/>
     </w:p>
     <w:p>
       <w:pPr>
         <w:pStyle w:val="Heading3"/>
         <w:rPr/>
       </w:pPr>
-      <w:bookmarkStart w:id="28" w:name="X04c51b46a89726e63cb47cb909f3f41f147c501"/>
+      <w:bookmarkStart w:id="27" w:name="X04c51b46a89726e63cb47cb909f3f41f147c501"/>
       <w:r>
         <w:rPr/>
         <w:t>2.5 Dimension 5 — Institutional benchmarking grid</w:t>
@@ -3275,17 +3273,17 @@
       </w:pPr>
       <w:r>
         <w:rPr/>
-        <w:t>A policy document is a row in the capability grid, not the grid. The dimension’s purpose is not to mandate a single right answer to any of the four axes. Institutional context varies, and an institutional choice that is leading at one university may be inappropriate at another. The purpose is to make the choice visible.</w:t>
-      </w:r>
-      <w:bookmarkEnd w:id="23"/>
-      <w:bookmarkEnd w:id="28"/>
+        <w:t>A policy document is a row in the competency grid, not the grid. The dimension’s purpose is not to mandate a single right answer to any of the four axes. Institutional context varies, and an institutional choice that is leading at one university may be inappropriate at another. The purpose is to make the choice visible.</w:t>
+      </w:r>
+      <w:bookmarkEnd w:id="22"/>
+      <w:bookmarkEnd w:id="27"/>
     </w:p>
     <w:p>
       <w:pPr>
         <w:pStyle w:val="Heading2"/>
         <w:rPr/>
       </w:pPr>
-      <w:bookmarkStart w:id="29" w:name="Xd1a73a0edba9ddda1e0d20cf1ed0ad021cf16f3"/>
+      <w:bookmarkStart w:id="28" w:name="Xd1a73a0edba9ddda1e0d20cf1ed0ad021cf16f3"/>
       <w:r>
         <w:rPr/>
         <w:t>Part 3 — What the international evidence shows</w:t>
@@ -3298,7 +3296,7 @@
       </w:pPr>
       <w:r>
         <w:rPr/>
-        <w:t>Part 3 populates the framework with what international evidence currently shows on each dimension. Four bodies of evidence are surveyed: national research-funder positions; institutional AI policies at top-tier doctoral universities; AI co-authorship and use policies at major academic publishers; and the existing AI-literacy and researcher-development capability-framework literature. They are sequenced by regulatory weight in the audience’s institutional environment: funders set the terms of grant-funded research; institutions set the terms of doctoral training; publishers set the terms of output dissemination; the capability-framework literature is the prior literature the framework is in conversation with.</w:t>
+        <w:t>Part 3 populates the framework with what international evidence currently shows on each dimension. Four bodies of evidence are surveyed: national research-funder positions; institutional AI policies at top-tier doctoral universities; AI co-authorship and use policies at major academic publishers; and the existing AI-literacy and researcher-development competency-framework literature. They are sequenced by regulatory weight in the audience’s institutional environment: funders set the terms of grant-funded research; institutions set the terms of doctoral training; publishers set the terms of output dissemination; the competency-framework literature is the prior literature the framework is in conversation with.</w:t>
       </w:r>
     </w:p>
     <w:p>
@@ -3308,7 +3306,7 @@
       </w:pPr>
       <w:r>
         <w:rPr/>
-        <w:t>The same pattern recurs across all four and is the central evidentiary finding of this report. Publishers acted first and tightest. Funders acted slower and unevenly, with most regulating AI at the application and assessment surface only. Institutions act slowest and at the widest internal variance; only six of the thirty-eight top-tier doctoral universities in the sample have AI policies that extend past plagiarism into research integrity, AI literacy, and valid research practices. The capability-framework literature is mature for K-12 and general undergraduate audiences but did not, in 2025-2026, populate the research-training-native PhD curriculum the report’s Dimension 4 has now articulated.</w:t>
+        <w:t>The same pattern recurs across all four and is the central evidentiary finding of this report. Publishers acted first and tightest. Funders acted slower and unevenly, with most regulating AI at the application and assessment surface only. Institutions act slowest and at the widest internal variance; only six of the thirty-eight top-tier doctoral universities in the sample have AI policies that extend past plagiarism into research integrity, AI literacy, and valid research practices. The competency-framework literature is mature for K-12 and general undergraduate audiences but did not, in 2025-2026, populate the research-training-native PhD curriculum the report’s Dimension 4 has now articulated.</w:t>
       </w:r>
     </w:p>
     <w:p>
@@ -3316,7 +3314,7 @@
         <w:pStyle w:val="Heading3"/>
         <w:rPr/>
       </w:pPr>
-      <w:bookmarkStart w:id="30" w:name="national-research-funder-positions"/>
+      <w:bookmarkStart w:id="29" w:name="national-research-funder-positions"/>
       <w:r>
         <w:rPr/>
         <w:t>3.1 National research-funder positions</w:t>
@@ -3447,14 +3445,14 @@
         <w:rPr/>
         <w:t xml:space="preserve"> The trajectory is policy-issuance, not the deeper question of what funded researchers are actually trained to do with AI. The Dimension 4 (AI-literate humans) gap the funders are leaving open is what universities need to close.</w:t>
       </w:r>
-      <w:bookmarkEnd w:id="30"/>
+      <w:bookmarkEnd w:id="29"/>
     </w:p>
     <w:p>
       <w:pPr>
         <w:pStyle w:val="Heading3"/>
         <w:rPr/>
       </w:pPr>
-      <w:bookmarkStart w:id="31" w:name="X02ed1aa3513dc0bebac80dd57b4494edf619a91"/>
+      <w:bookmarkStart w:id="30" w:name="X02ed1aa3513dc0bebac80dd57b4494edf619a91"/>
       <w:r>
         <w:rPr/>
         <w:t>3.2 Top-tier university institutional policies</w:t>
@@ -3600,14 +3598,14 @@
         <w:rPr/>
         <w:t>The cross-country picture is sharper than the within-country picture. Where an institution sits on the Class A through D scale is more strongly predicted by the country (and its pre-AI research-integrity infrastructure) than by within-country institutional features such as research-intensity ranking, AI-research depth, or institutional age. Universities are, in 2026, not absent. They have substantial activity, but it is mostly stopped at the plagiarism-policy ceiling. The framework’s Dimension 5 (institutional benchmarking grid) is the operational answer.</w:t>
       </w:r>
-      <w:bookmarkEnd w:id="31"/>
+      <w:bookmarkEnd w:id="30"/>
     </w:p>
     <w:p>
       <w:pPr>
         <w:pStyle w:val="Heading3"/>
         <w:rPr/>
       </w:pPr>
-      <w:bookmarkStart w:id="32" w:name="publisher-and-journal-policies"/>
+      <w:bookmarkStart w:id="31" w:name="publisher-and-journal-policies"/>
       <w:r>
         <w:rPr/>
         <w:t>3.3 Publisher and journal policies</w:t>
@@ -3722,14 +3720,14 @@
         <w:rPr/>
         <w:t>Publishers operate the most operational policy surface in 2026. They are also the actor group whose policy speed was unusually fast compared with the publisher-policy convergences recorded. The implication for universities is sharp: convergence at sector scale is possible when sectors decide to act. The ten-week wave is the existence proof.</w:t>
       </w:r>
-      <w:bookmarkEnd w:id="32"/>
+      <w:bookmarkEnd w:id="31"/>
     </w:p>
     <w:p>
       <w:pPr>
         <w:pStyle w:val="Heading3"/>
         <w:rPr/>
       </w:pPr>
-      <w:bookmarkStart w:id="33" w:name="Xca4da2d26c3d4406d6d5f02dafc313a2e0f1372"/>
+      <w:bookmarkStart w:id="32" w:name="Xca4da2d26c3d4406d6d5f02dafc313a2e0f1372"/>
       <w:r>
         <w:rPr/>
         <w:t>3.4 Existing AI-literacy and researcher-development frameworks</w:t>
@@ -3742,7 +3740,7 @@
       </w:pPr>
       <w:r>
         <w:rPr/>
-        <w:t>The existing capability-framework dossier surveys thirteen frameworks: UNESCO AI Competency Frameworks for Students and Teachers; the Organisation for Economic Co-operation and Development and European Commission AI Literacy Framework (AILit); DigComp 2.2; the Jisc Digital Capability Framework with AI question sets and the Jisc Strategic AI Framework for Colleges and Universities; the EDUCAUSE Horizon Action Plan on Generative AI and 2024 AI Landscape Study; the Vitae UK Researcher Development Framework; the Council of Graduate Schools and Institut national de la recherche scientifique Global Action Agenda; European University Association statements; the US National Academies and PNAS Blau et al. editorial; the Tertiary Education Quality and Standards Agency Generative AI Strategies Toolkit; the Russell Group Principles; and the Digital Education Council AI Literacy Framework.</w:t>
+        <w:t>The existing competency-framework dossier surveys thirteen frameworks: UNESCO AI Competency Frameworks for Students and Teachers; the Organisation for Economic Co-operation and Development and European Commission AI Literacy Framework (AILit); DigComp 2.2; the Jisc Digital Capability Framework with AI question sets and the Jisc Strategic AI Framework for Colleges and Universities; the EDUCAUSE Horizon Action Plan on Generative AI and 2024 AI Landscape Study; the Vitae UK Researcher Development Framework; the Council of Graduate Schools and Institut national de la recherche scientifique Global Action Agenda; European University Association statements; the US National Academies and PNAS Blau et al. editorial; the Tertiary Education Quality and Standards Agency Generative AI Strategies Toolkit; the Russell Group Principles; and the Digital Education Council AI Literacy Framework.</w:t>
       </w:r>
       <w:r>
         <w:rPr>
@@ -3784,7 +3782,7 @@
       </w:pPr>
       <w:r>
         <w:rPr/>
-        <w:t>The most consequential single finding in the framework literature is the silence of the Vitae UK Researcher Development Framework’s 2025 refresh on AI as a competency. Vitae is the canonical researcher-development framework for the United Kingdom and is widely adopted internationally. The 2025 refresh updated “digital and innovation skills” and “research integrity” descriptors without surfacing AI as a competency domain or sub-domain. The absence is itself a finding: the most authoritative researcher-development framework in the Anglophone university world had not, by 2025-2026, built the PhD-research-training-native AI capability framework that the report’s Dimension 4 articulates.</w:t>
+        <w:t>The most consequential single finding in the framework literature is the silence of the Vitae UK Researcher Development Framework’s 2025 refresh on AI as a competency. Vitae is the canonical researcher-development framework for the United Kingdom and is widely adopted internationally. The 2025 refresh updated “digital and innovation skills” and “research integrity” descriptors without surfacing AI as a competency domain or sub-domain. The absence is itself a finding: the most authoritative researcher-development framework in the Anglophone university world had not, by 2025-2026, built the PhD-research-training-native AI competency framework that the report’s Dimension 4 articulates.</w:t>
       </w:r>
     </w:p>
     <w:p>
@@ -3818,15 +3816,15 @@
         <w:rPr/>
         <w:t>The framework literature is not a vacuum. The five dimensions in Part 2 are built in conversation with it. Their distinctive contribution is the operational specificity the existing frameworks chose not to build.</w:t>
       </w:r>
-      <w:bookmarkEnd w:id="29"/>
-      <w:bookmarkEnd w:id="33"/>
+      <w:bookmarkEnd w:id="28"/>
+      <w:bookmarkEnd w:id="32"/>
     </w:p>
     <w:p>
       <w:pPr>
         <w:pStyle w:val="Heading2"/>
         <w:rPr/>
       </w:pPr>
-      <w:bookmarkStart w:id="34" w:name="part-4-the-maturity-grid-1"/>
+      <w:bookmarkStart w:id="33" w:name="part-4-the-maturity-grid-1"/>
       <w:r>
         <w:rPr/>
         <w:t>Part 4 — The maturity grid</w:t>
@@ -3859,7 +3857,7 @@
         <w:pStyle w:val="Heading3"/>
         <w:rPr/>
       </w:pPr>
-      <w:bookmarkStart w:id="35" w:name="the-five-by-four-grid"/>
+      <w:bookmarkStart w:id="34" w:name="the-five-by-four-grid"/>
       <w:r>
         <w:rPr/>
         <w:t>4.1 The five-by-four grid</w:t>
@@ -3992,14 +3990,14 @@
         <w:rPr/>
         <w:t xml:space="preserve"> level rather than aspirationally. The five dimensions are interdependent in the order the framework specifies, and the grid makes the interdependence observable.</w:t>
       </w:r>
-      <w:bookmarkEnd w:id="35"/>
+      <w:bookmarkEnd w:id="34"/>
     </w:p>
     <w:p>
       <w:pPr>
         <w:pStyle w:val="Heading3"/>
         <w:rPr/>
       </w:pPr>
-      <w:bookmarkStart w:id="36" w:name="what-ready-looks-like-by-dimension"/>
+      <w:bookmarkStart w:id="35" w:name="what-ready-looks-like-by-dimension"/>
       <w:r>
         <w:rPr/>
         <w:t>4.2 What “ready” looks like by dimension</w:t>
@@ -4198,14 +4196,14 @@
         <w:rPr/>
         <w:t xml:space="preserve"> on Dimension 5 is, for now, a forward-looking standard that the framework’s adopters can elect to populate.</w:t>
       </w:r>
-      <w:bookmarkEnd w:id="36"/>
+      <w:bookmarkEnd w:id="35"/>
     </w:p>
     <w:p>
       <w:pPr>
         <w:pStyle w:val="Heading3"/>
         <w:rPr/>
       </w:pPr>
-      <w:bookmarkStart w:id="37" w:name="worked-institutional-examples"/>
+      <w:bookmarkStart w:id="36" w:name="worked-institutional-examples"/>
       <w:r>
         <w:rPr/>
         <w:t>4.3 Worked institutional examples</w:t>
@@ -4488,7 +4486,7 @@
       </w:pPr>
       <w:r>
         <w:rPr/>
-        <w:t xml:space="preserve">The worked examples illustrate two structural findings. First, an institution’s maturity is rarely uniform across dimensions; the diagnostic value of the grid is the dimensional pattern, not a single score. Second, the dimension that an institution is weakest on is often the dimension that constrains its overall capability: a university at </w:t>
+        <w:t xml:space="preserve">The worked examples illustrate two structural findings. First, an institution’s maturity is rarely uniform across dimensions; the diagnostic value of the grid is the dimensional pattern, not a single score. Second, the dimension that an institution is weakest on is often the dimension that constrains its overall competency: a university at </w:t>
       </w:r>
       <w:r>
         <w:rPr>
@@ -4512,15 +4510,15 @@
         <w:rPr/>
         <w:t xml:space="preserve"> on Dimension 3 cannot realise the human-in-the-loop discipline at scale, because the tooling its researchers actually use does not support it. The grid is built to make the constraint visible.</w:t>
       </w:r>
-      <w:bookmarkEnd w:id="34"/>
-      <w:bookmarkEnd w:id="37"/>
+      <w:bookmarkEnd w:id="33"/>
+      <w:bookmarkEnd w:id="36"/>
     </w:p>
     <w:p>
       <w:pPr>
         <w:pStyle w:val="Heading2"/>
         <w:rPr/>
       </w:pPr>
-      <w:bookmarkStart w:id="38" w:name="X84b8053bd241840a3d62bcee5726c3dbee3ed04"/>
+      <w:bookmarkStart w:id="37" w:name="X84b8053bd241840a3d62bcee5726c3dbee3ed04"/>
       <w:r>
         <w:rPr/>
         <w:t>Part 5 — Recommendations for university research leadership</w:t>
@@ -4541,7 +4539,7 @@
         <w:pStyle w:val="Heading3"/>
         <w:rPr/>
       </w:pPr>
-      <w:bookmarkStart w:id="39" w:name="for-executive-research-leadership"/>
+      <w:bookmarkStart w:id="38" w:name="for-executive-research-leadership"/>
       <w:r>
         <w:rPr/>
         <w:t>5.1 For executive research leadership</w:t>
@@ -4716,14 +4714,14 @@
         <w:rPr/>
         <w:t xml:space="preserve"> to council, board, and sector peers. Convergence at sector scale is achievable, as the publisher ten-week wave demonstrated. Universities have not yet achieved convergence at sector scale. Public articulation of the institutional framework position contributes to the convergence the report’s evidence shows the sector currently lacks.</w:t>
       </w:r>
-      <w:bookmarkEnd w:id="39"/>
+      <w:bookmarkEnd w:id="38"/>
     </w:p>
     <w:p>
       <w:pPr>
         <w:pStyle w:val="Heading3"/>
         <w:rPr/>
       </w:pPr>
-      <w:bookmarkStart w:id="40" w:name="Xfe35cd0e7334cb7c73c4edbd7515c9376f22755"/>
+      <w:bookmarkStart w:id="39" w:name="Xfe35cd0e7334cb7c73c4edbd7515c9376f22755"/>
       <w:r>
         <w:rPr/>
         <w:t>5.2 For faculty deans and associate deans of research</w:t>
@@ -4888,14 +4886,14 @@
         <w:rPr/>
         <w:t xml:space="preserve"> needs faculty-level intervention.</w:t>
       </w:r>
-      <w:bookmarkEnd w:id="40"/>
+      <w:bookmarkEnd w:id="39"/>
     </w:p>
     <w:p>
       <w:pPr>
         <w:pStyle w:val="Heading3"/>
         <w:rPr/>
       </w:pPr>
-      <w:bookmarkStart w:id="41" w:name="Xc5c7e67c2b686b79a10b44fe001854c04336b11"/>
+      <w:bookmarkStart w:id="40" w:name="Xc5c7e67c2b686b79a10b44fe001854c04336b11"/>
       <w:r>
         <w:rPr/>
         <w:t>5.3 For deans of graduate schools and A/Deans of research training</w:t>
@@ -5016,14 +5014,14 @@
         <w:rPr/>
         <w:t>. The examiner-side rule that a candidate “must be able to describe and defend any use of generative AI, as well as the contents of the thesis during their final oral examination,” the University of Toronto School of Graduate Studies formulation, operationalises Dimension 1 at the point of examination. The examiner training carries the verification competencies the examination is expected to apply.</w:t>
       </w:r>
-      <w:bookmarkEnd w:id="41"/>
+      <w:bookmarkEnd w:id="40"/>
     </w:p>
     <w:p>
       <w:pPr>
         <w:pStyle w:val="Heading3"/>
         <w:rPr/>
       </w:pPr>
-      <w:bookmarkStart w:id="42" w:name="Xf8e6fc39c3d0ddc0391c79039db452b3c38372d"/>
+      <w:bookmarkStart w:id="41" w:name="Xf8e6fc39c3d0ddc0391c79039db452b3c38372d"/>
       <w:r>
         <w:rPr/>
         <w:t>5.4 For higher-degrees committees and research-integrity committees</w:t>
@@ -5112,14 +5110,14 @@
         <w:rPr/>
         <w:t xml:space="preserve"> applicable to the institution. For institutions in or for the EU market, the EU AI Act Article 27 Fundamental Rights Impact Assessment for admissions, learning-outcome evaluation, education-level assignment within institutions, and proctoring is the binding operational test from 2 August 2026. The committee may not own the assessment itself, but the committee owns the policy language that surrounds it. The committee that has read the framework before the deadline is the committee that can write the policy language the institution needs.</w:t>
       </w:r>
-      <w:bookmarkEnd w:id="42"/>
+      <w:bookmarkEnd w:id="41"/>
     </w:p>
     <w:p>
       <w:pPr>
         <w:pStyle w:val="Heading3"/>
         <w:rPr/>
       </w:pPr>
-      <w:bookmarkStart w:id="43" w:name="for-peak-bodies-for-graduate-students"/>
+      <w:bookmarkStart w:id="42" w:name="for-peak-bodies-for-graduate-students"/>
       <w:r>
         <w:rPr/>
         <w:t>5.5 For peak bodies for graduate students</w:t>
@@ -5197,7 +5195,49 @@
         <w:rPr/>
         <w:t xml:space="preserve"> of the universities in each peak body’s jurisdiction. Universities are the actor the framework’s evidence shows is least developed; the peak body is the independent voice with the standing to make universities’ gaps visible. The benchmarking can use the Part 4 maturity grid directly.</w:t>
       </w:r>
-      <w:bookmarkEnd w:id="38"/>
+      <w:bookmarkEnd w:id="37"/>
+      <w:bookmarkEnd w:id="42"/>
+    </w:p>
+    <w:p>
+      <w:pPr>
+        <w:pStyle w:val="Heading2"/>
+        <w:rPr/>
+      </w:pPr>
+      <w:bookmarkStart w:id="43" w:name="conclusion-1"/>
+      <w:r>
+        <w:rPr/>
+        <w:t>Conclusion</w:t>
+      </w:r>
+    </w:p>
+    <w:p>
+      <w:pPr>
+        <w:pStyle w:val="FirstParagraph"/>
+        <w:rPr/>
+      </w:pPr>
+      <w:r>
+        <w:rPr/>
+        <w:t>The world’s major academic publishers acted in ten weeks. National research funders have acted, unevenly, over three years. International competency-framework bodies have published the AI-literacy literature universities now cite. Universities themselves, the institutions that actually train PhD researchers, have not caught up. Only six of thirty-eight top-tier doctoral universities publish AI policies that extend past plagiarism into AI literacy and valid research practices; the other five in six do not. The single most authoritative researcher-development framework in the Anglophone university world did not, in its 2025 refresh, surface AI as a competency at all.</w:t>
+      </w:r>
+    </w:p>
+    <w:p>
+      <w:pPr>
+        <w:pStyle w:val="BodyText"/>
+        <w:rPr/>
+      </w:pPr>
+      <w:r>
+        <w:rPr/>
+        <w:t>This matters beyond institutional compliance. Universities train the researchers who produce the knowledge for public decisions on health, climate, economic policy, and technology. Society relies on universities as epistemic infrastructure: institutions that organise knowledge production, discipline claims, and sustain trust in evidence. If AI use in research is not constrained by the four-way standard set out in §1.2, the public record absorbs fabricated citations, unreproducible findings, biased analyses, and methods that cannot be assessed. The four-way standard is therefore not internal discipline; it is the precondition for research the public can trust. Responsible AI in research is an obligation universities owe society, because the social licence of research depends on knowledge that remains ethical, valid, reproducible, and transparent.</w:t>
+      </w:r>
+    </w:p>
+    <w:p>
+      <w:pPr>
+        <w:pStyle w:val="BodyText"/>
+        <w:rPr/>
+      </w:pPr>
+      <w:r>
+        <w:rPr/>
+        <w:t>Universities are not passive consumers of AI. They are the institutions that define what responsible research practice looks like for the next generation of researchers, examiners, supervisors, and colleagues. LLMs are agentic research tools, and the institutional question is whether their use is ethical, valid, reproducible, and transparent. Universities therefore need purpose-built, adaptive frameworks for AI as a research tool: not extensions to plagiarism policies, and not bolt-ons to researcher-development frameworks designed for a pre-2022 world. The framework presented here is the operational tool for that task. Its goal is excellent research, achieved through excellent research training, at the speed and scale publishers have already shown is possible.</w:t>
+      </w:r>
       <w:bookmarkEnd w:id="43"/>
     </w:p>
     <w:p>
@@ -5205,49 +5245,7 @@
         <w:pStyle w:val="Heading2"/>
         <w:rPr/>
       </w:pPr>
-      <w:bookmarkStart w:id="44" w:name="conclusion-1"/>
-      <w:r>
-        <w:rPr/>
-        <w:t>Conclusion</w:t>
-      </w:r>
-    </w:p>
-    <w:p>
-      <w:pPr>
-        <w:pStyle w:val="FirstParagraph"/>
-        <w:rPr/>
-      </w:pPr>
-      <w:r>
-        <w:rPr/>
-        <w:t>The world’s major academic publishers acted in ten weeks. National research funders have acted, unevenly, over three years. International capability-framework bodies have published the AI-literacy literature universities now cite. Universities themselves, the institutions that actually train PhD researchers, have not caught up. Only six of thirty-eight top-tier doctoral universities publish AI policies that extend past plagiarism into AI literacy and valid research practices; the other five in six do not. The single most authoritative researcher-development framework in the Anglophone university world did not, in its 2025 refresh, surface AI as a competency at all.</w:t>
-      </w:r>
-    </w:p>
-    <w:p>
-      <w:pPr>
-        <w:pStyle w:val="BodyText"/>
-        <w:rPr/>
-      </w:pPr>
-      <w:r>
-        <w:rPr/>
-        <w:t>This matters beyond institutional compliance. Universities train the researchers who produce the knowledge for public decisions on health, climate, economic policy, and technology. Society relies on universities as epistemic infrastructure: institutions that organise knowledge production, discipline claims, and sustain trust in evidence. If AI use in research is not constrained by the four-way standard set out in §1.2, the public record absorbs fabricated citations, unreproducible findings, biased analyses, and methods that cannot be assessed. The four-way standard is therefore not internal discipline; it is the precondition for research the public can trust. Responsible AI in research is an obligation universities owe society, because the social licence of research depends on knowledge that remains ethical, valid, reproducible, and transparent.</w:t>
-      </w:r>
-    </w:p>
-    <w:p>
-      <w:pPr>
-        <w:pStyle w:val="BodyText"/>
-        <w:rPr/>
-      </w:pPr>
-      <w:r>
-        <w:rPr/>
-        <w:t>Universities are not passive consumers of AI. They are the institutions that define what responsible research practice looks like for the next generation of researchers, examiners, supervisors, and colleagues. LLMs are agentic research tools, and the institutional question is whether their use is ethical, valid, reproducible, and transparent. Universities therefore need purpose-built, adaptive frameworks for AI as a research tool: not extensions to plagiarism policies, and not bolt-ons to researcher-development frameworks designed for a pre-2022 world. The framework presented here is the operational tool for that task. Its goal is excellent research, achieved through excellent research training, at the speed and scale publishers have already shown is possible.</w:t>
-      </w:r>
-      <w:bookmarkEnd w:id="44"/>
-    </w:p>
-    <w:p>
-      <w:pPr>
-        <w:pStyle w:val="Heading2"/>
-        <w:rPr/>
-      </w:pPr>
-      <w:bookmarkStart w:id="45" w:name="Xe68ee8087a0fb6c54faf307f3bd4ef6aae1293d"/>
+      <w:bookmarkStart w:id="44" w:name="Xe68ee8087a0fb6c54faf307f3bd4ef6aae1293d"/>
       <w:r>
         <w:rPr/>
         <w:t>Appendix A — The maturity grid, full version</w:t>
@@ -6305,14 +6303,14 @@
         <w:rPr/>
         <w:t>The grid is also intentionally compact. A short audit, four to six questions per dimension, can apply it in an hour; a comprehensive institutional review can apply it over a six-month cycle with external benchmarking. Both applications are reviewable against the same published criteria. The dimensional profile that emerges is the operational answer to the question this report opened with: what does responsible AI use look like at PhD level, and how would a university know whether it is doing it well.</w:t>
       </w:r>
-      <w:bookmarkEnd w:id="45"/>
+      <w:bookmarkEnd w:id="44"/>
     </w:p>
     <w:p>
       <w:pPr>
         <w:pStyle w:val="Heading2"/>
         <w:rPr/>
       </w:pPr>
-      <w:bookmarkStart w:id="46" w:name="Xa84783782a8a542074362876906e23e4f0078b9"/>
+      <w:bookmarkStart w:id="45" w:name="Xa84783782a8a542074362876906e23e4f0078b9"/>
       <w:r>
         <w:rPr/>
         <w:t>Appendix B — Country and institutional dossiers</w:t>
@@ -6662,16 +6660,16 @@
       </w:pPr>
       <w:r>
         <w:rPr/>
-        <w:t>The cross-country picture is the central evidentiary finding of Part 3: publishers standardised disclosure and authorship rules across the sector in roughly ten weeks, while national research funders standardised AI-in-application policies unevenly over roughly three years. Universities have not built research-training capability at scale; the framework’s Dimension 5 maturity grid is where they can self-diagnose against that pattern.</w:t>
-      </w:r>
-      <w:bookmarkEnd w:id="46"/>
+        <w:t>The cross-country picture is the central evidentiary finding of Part 3: publishers standardised disclosure and authorship rules across the sector in roughly ten weeks, while national research funders standardised AI-in-application policies unevenly over roughly three years. Universities have not built research-training competency at scale; the framework’s Dimension 5 maturity grid is where they can self-diagnose against that pattern.</w:t>
+      </w:r>
+      <w:bookmarkEnd w:id="45"/>
     </w:p>
     <w:p>
       <w:pPr>
         <w:pStyle w:val="Heading2"/>
         <w:rPr/>
       </w:pPr>
-      <w:bookmarkStart w:id="47" w:name="appendix-c-glossary-of-ai-tool-classes-1"/>
+      <w:bookmarkStart w:id="46" w:name="appendix-c-glossary-of-ai-tool-classes-1"/>
       <w:r>
         <w:rPr/>
         <w:t>Appendix C — Glossary of AI tool classes</w:t>
@@ -6923,14 +6921,14 @@
         <w:rPr/>
         <w:t xml:space="preserve"> Statistical or watermark-detection classifiers used to flag whether text was written or substantially edited by an AI tool (Turnitin AI Detection, GPTZero, Originality.ai, Copyleaks, Winston AI, Sapling, Crossplag). Good for: coarse triage of suspected-AI text where institutional policy explicitly allows detection-tool evidence; a do-we-trigger-a-process decision-support tool. Fails at: reliable detection without unacceptable false-positive rates (Perkins et al. 2024: seven detectors at 39.5 per cent baseline accuracy dropping to 17.4 per cent under simple adversarial techniques; documented bias against non-native-English-speaking authors). Responsible-by-construction: calibrated false-positive rates published per language and writing style; refusal to render a binary verdict below a length threshold; per-segment rather than whole-document flagging; institutional policy that uses flags as triage, not as evidence. The class is the clearest illustration of the category error this report’s framework displaces: AI-detection treats surface authorship signals as a proxy for research validity, which they are not.</w:t>
       </w:r>
-      <w:bookmarkEnd w:id="47"/>
+      <w:bookmarkEnd w:id="46"/>
     </w:p>
     <w:p>
       <w:pPr>
         <w:pStyle w:val="Heading2"/>
         <w:rPr/>
       </w:pPr>
-      <w:bookmarkStart w:id="48" w:name="appendix-d-about-this-report-1"/>
+      <w:bookmarkStart w:id="47" w:name="appendix-d-about-this-report-1"/>
       <w:r>
         <w:rPr/>
         <w:t>Appendix D — About this report</w:t>
@@ -7003,7 +7001,7 @@
       </w:r>
       <w:r>
         <w:rPr/>
-        <w:t xml:space="preserve"> This is the global view in a planned regional series. The capability framework in Part 2 is intended to be re-populated in later reports for the US / Americas, the UK / Europe, and APAC ex Japan; the framework itself does not change across those reports. The evidence base in Parts 1 and 3 draws on four primary dossiers, snapshotted 2026-05-18: national research-funder AI policies across fourteen funders in eleven countries plus the European Research Council as a supranational fourteenth funder; institutional AI policies across thirty-eight top-tier doctoral universities in fifteen countries and jurisdictions; the existing AI-literacy and researcher-development capability-framework literature; and the AI co-authorship and use policies of eighteen major publishers plus three preprint servers. Every load-bearing claim is anchored to a primary-source URL with a snapshot date.</w:t>
+        <w:t xml:space="preserve"> This is the global view in a planned regional series. The competency framework in Part 2 is intended to be re-populated in later reports for the US / Americas, the UK / Europe, and APAC ex Japan; the framework itself does not change across those reports. The evidence base in Parts 1 and 3 draws on four primary dossiers, snapshotted 2026-05-18: national research-funder AI policies across fourteen funders in eleven countries plus the European Research Council as a supranational fourteenth funder; institutional AI policies across thirty-eight top-tier doctoral universities in fifteen countries and jurisdictions; the existing AI-literacy and researcher-development competency-framework literature; and the AI co-authorship and use policies of eighteen major publishers plus three preprint servers. Every load-bearing claim is anchored to a primary-source URL with a snapshot date.</w:t>
       </w:r>
     </w:p>
     <w:p>
@@ -7020,7 +7018,7 @@
       </w:r>
       <w:r>
         <w:rPr/>
-        <w:t xml:space="preserve"> Forensic, source-anchored analysis. Synthesis claims that consolidate multiple primary sources are anchored through the publication’s evidence dossiers (Appendix E), organised by evidence axis: national research-funder policies; institutional AI policies; capability frameworks; publisher and journal policies; AI tool taxonomy; privacy and governance frameworks; reproducibility-crisis intersection; adversarial-review patterns.</w:t>
+        <w:t xml:space="preserve"> Forensic, source-anchored analysis. Synthesis claims that consolidate multiple primary sources are anchored through the publication’s evidence dossiers (Appendix E), organised by evidence axis: national research-funder policies; institutional AI policies; competency frameworks; publisher and journal policies; AI tool taxonomy; privacy and governance frameworks; reproducibility-crisis intersection; adversarial-review patterns.</w:t>
       </w:r>
     </w:p>
     <w:p>
@@ -7056,14 +7054,14 @@
         <w:rPr/>
         <w:t xml:space="preserve"> The author has no paid relationships with any of the institutions in the report’s institutional sample (Appendix B). The author’s commercial role at Instats is research-training-adjacent; the report’s framing was developed independently of any commercial activity and is offered as a contribution to the public discussion of responsible AI use in research and research training, not as a product placement.</w:t>
       </w:r>
-      <w:bookmarkEnd w:id="48"/>
+      <w:bookmarkEnd w:id="47"/>
     </w:p>
     <w:p>
       <w:pPr>
         <w:pStyle w:val="Heading2"/>
         <w:rPr/>
       </w:pPr>
-      <w:bookmarkStart w:id="49" w:name="appendix-e-sources-1"/>
+      <w:bookmarkStart w:id="48" w:name="appendix-e-sources-1"/>
       <w:r>
         <w:rPr/>
         <w:t>Appendix E — Sources</w:t>
@@ -7152,11 +7150,11 @@
         <w:rPr>
           <w:rStyle w:val="VerbatimChar"/>
         </w:rPr>
-        <w:t>research/dossier_03_capability_frameworks.md</w:t>
-      </w:r>
-      <w:r>
-        <w:rPr/>
-        <w:t xml:space="preserve"> — thirteen capability frameworks (UNESCO AI CF for Students and Teachers; OECD-EC AILit; DigComp 2.2; Jisc; EDUCAUSE; Vitae RDF; CGS-INRS Global Action Agenda; EUA; US National Academies / PNAS; TEQSA; Russell Group; Digital Education Council).</w:t>
+        <w:t>research/dossier_03_competency_frameworks.md</w:t>
+      </w:r>
+      <w:r>
+        <w:rPr/>
+        <w:t xml:space="preserve"> — thirteen competency frameworks (UNESCO AI CF for Students and Teachers; OECD-EC AILit; DigComp 2.2; Jisc; EDUCAUSE; Vitae RDF; CGS-INRS Global Action Agenda; EUA; US National Academies / PNAS; TEQSA; Russell Group; Digital Education Council).</w:t>
       </w:r>
     </w:p>
     <w:p>
@@ -7268,14 +7266,14 @@
         <w:rPr/>
         <w:t>The dossiers are intended as working evidence notes for the report’s drafting and review process. The footnotes in this report’s main text are the canonical citations for downstream use; readers seeking the underlying evidence base will find the dossiers in the same git repository as the report itself, with each entry naming the primary-source URL and its access status as of the snapshot date.</w:t>
       </w:r>
-      <w:bookmarkEnd w:id="49"/>
+      <w:bookmarkEnd w:id="48"/>
     </w:p>
     <w:p>
       <w:pPr>
         <w:pStyle w:val="Heading2"/>
         <w:rPr/>
       </w:pPr>
-      <w:bookmarkStart w:id="50" w:name="appendix-f-regional-adaptation-note-1"/>
+      <w:bookmarkStart w:id="49" w:name="appendix-f-regional-adaptation-note-1"/>
       <w:r>
         <w:rPr/>
         <w:t>Appendix F — Regional-adaptation note</w:t>
@@ -7341,14 +7339,14 @@
         <w:rPr/>
         <w:t>Together the global view and the regional adaptations form a connected sequence: the global view sets the framework and the maturity grid; the regional adaptations populate the cells with regional evidence; the connected reports allow institutions in any jurisdiction to score themselves and to benchmark against jurisdictionally appropriate peers.</w:t>
       </w:r>
-      <w:bookmarkEnd w:id="50"/>
+      <w:bookmarkEnd w:id="49"/>
     </w:p>
     <w:p>
       <w:pPr>
         <w:pStyle w:val="Heading2"/>
         <w:rPr/>
       </w:pPr>
-      <w:bookmarkStart w:id="51" w:name="X17285a873e63ccb0cca26e646af65800f47b2e1"/>
+      <w:bookmarkStart w:id="50" w:name="X17285a873e63ccb0cca26e646af65800f47b2e1"/>
       <w:r>
         <w:rPr/>
         <w:t>Appendix G — Labour-vs-judgement task taxonomy</w:t>
@@ -9428,9 +9426,9 @@
       </w:pPr>
       <w:r>
         <w:rPr/>
-        <w:t>The catalogue is intentionally short and discipline-blind so that faculties adapt rather than copy. A computational-biology faculty extending the taxonomy will add entries for protein-structure-prediction-with-pLDDT-thresholds, molecular-dynamics-simulation-with-uncertainty-reporting, and similar discipline-specific surfaces. A humanities faculty extending the taxonomy will add entries for archive-document interpretation, primary-text close-reading, and discipline-specific exegesis surfaces. The institutional capability the framework specifies is the act of articulating the taxonomy, not the specific entries.</w:t>
-      </w:r>
-      <w:bookmarkEnd w:id="51"/>
+        <w:t>The catalogue is intentionally short and discipline-blind so that faculties adapt rather than copy. A computational-biology faculty extending the taxonomy will add entries for protein-structure-prediction-with-pLDDT-thresholds, molecular-dynamics-simulation-with-uncertainty-reporting, and similar discipline-specific surfaces. A humanities faculty extending the taxonomy will add entries for archive-document interpretation, primary-text close-reading, and discipline-specific exegesis surfaces. The institutional competency the framework specifies is the act of articulating the taxonomy, not the specific entries.</w:t>
+      </w:r>
+      <w:bookmarkEnd w:id="50"/>
     </w:p>
     <w:p>
       <w:pPr>
@@ -9440,13 +9438,13 @@
         <w:spacing w:lineRule="auto" w:line="288" w:before="360" w:after="120"/>
         <w:rPr/>
       </w:pPr>
-      <w:bookmarkStart w:id="52" w:name="sources-and-footnotes"/>
+      <w:bookmarkStart w:id="51" w:name="sources-and-footnotes"/>
       <w:r>
         <w:rPr/>
         <w:t>Sources and footnotes</w:t>
       </w:r>
-      <w:bookmarkEnd w:id="4"/>
-      <w:bookmarkEnd w:id="52"/>
+      <w:bookmarkEnd w:id="3"/>
+      <w:bookmarkEnd w:id="51"/>
     </w:p>
     <w:sectPr>
       <w:headerReference w:type="even" r:id="rId14"/>
@@ -10138,13 +10136,13 @@
       </w:r>
       <w:r>
         <w:rPr/>
-        <w:t xml:space="preserve">Synthesised across the thirteen-entry capability-frameworks dossier covering UNESCO AI Competency Frameworks for Students and Teachers, the OECD-EC AILit Framework, DigComp 2.2, the Jisc digital-capability and Strategic AI frameworks, the EDUCAUSE Horizon Action Plan and 2024 AI Landscape Study, the Vitae UK Researcher Development Framework, the Council of Graduate Schools and INRS Global Action Agenda, the European University Association statements, the US National Academies / PNAS editorial, TEQSA, the Russell Group Principles, and the Digital Education Council framework. See </w:t>
+        <w:t xml:space="preserve">Synthesised across the thirteen-entry competency-frameworks dossier covering UNESCO AI Competency Frameworks for Students and Teachers, the OECD-EC AILit Framework, DigComp 2.2, the Jisc digital-capability and Strategic AI frameworks, the EDUCAUSE Horizon Action Plan and 2024 AI Landscape Study, the Vitae UK Researcher Development Framework, the Council of Graduate Schools and INRS Global Action Agenda, the European University Association statements, the US National Academies / PNAS editorial, TEQSA, the Russell Group Principles, and the Digital Education Council framework. See </w:t>
       </w:r>
       <w:r>
         <w:rPr>
           <w:rStyle w:val="VerbatimChar"/>
         </w:rPr>
-        <w:t>research/dossier_03_capability_frameworks.md</w:t>
+        <w:t>research/dossier_03_competency_frameworks.md</w:t>
       </w:r>
       <w:r>
         <w:rPr/>
@@ -10190,7 +10188,7 @@
   <w:footnote w:id="31">
     <w:p>
       <w:r>
-        <w:t xml:space="preserve">Repeated source: Synthesised across the thirteen-entry capability-frameworks dossier covering UNESCO AI...</w:t>
+        <w:t xml:space="preserve">Repeated source: Synthesised across the thirteen-entry competency-frameworks dossier covering UNESCO AI...</w:t>
       </w:r>
     </w:p>
   </w:footnote>
@@ -10741,7 +10739,7 @@
   <w:footnote w:id="46">
     <w:p>
       <w:r>
-        <w:t xml:space="preserve">Repeated source: Synthesised across the thirteen-entry capability-frameworks dossier covering UNESCO AI...</w:t>
+        <w:t xml:space="preserve">Repeated source: Synthesised across the thirteen-entry competency-frameworks dossier covering UNESCO AI...</w:t>
       </w:r>
     </w:p>
   </w:footnote>
@@ -11172,14 +11170,14 @@
   <w:footnote w:id="72">
     <w:p>
       <w:r>
-        <w:t xml:space="preserve">Repeated source: Synthesised across the thirteen-entry capability-frameworks dossier covering UNESCO AI...</w:t>
+        <w:t xml:space="preserve">Repeated source: Synthesised across the thirteen-entry competency-frameworks dossier covering UNESCO AI...</w:t>
       </w:r>
     </w:p>
   </w:footnote>
   <w:footnote w:id="73">
     <w:p>
       <w:r>
-        <w:t xml:space="preserve">Repeated source: Synthesised across the thirteen-entry capability-frameworks dossier covering UNESCO AI...</w:t>
+        <w:t xml:space="preserve">Repeated source: Synthesised across the thirteen-entry competency-frameworks dossier covering UNESCO AI...</w:t>
       </w:r>
     </w:p>
   </w:footnote>

</xml_diff>

<commit_message>
COI clarification + PhD phrasing tidy
Two small textual edits: (1) COI disclosure now explicitly notes the
author's UQ employment given UQ's inclusion in the sample; (2)
"at PhD level" → "at the PhD level" in all three occurrences for
natural phrasing. No content findings change.

Stage-A carry-over SHA in final/p0_p1_carryover.md bumped to reflect
the new drafts/report.md hash. The carry-over review remains
substantively valid for these trivial edits.
</commit_message>
<xml_diff>
--- a/docs/Instats - Responsible AI in Academic Research.docx
+++ b/docs/Instats - Responsible AI in Academic Research.docx
@@ -374,7 +374,7 @@
       </w:r>
       <w:r>
         <w:rPr/>
-        <w:t xml:space="preserve"> Framing responsible AI use at PhD level as a plagiarism issue treats the binding constraint as student conduct rather than the validity, replicability, and ethical defensibility of AI-augmented research itself. Reproducibility, hallucination, validator-use, and adversarial-review competencies are research-integrity competencies. None of them is reducible to “do not present AI output as your own.”</w:t>
+        <w:t xml:space="preserve"> Framing responsible AI use at the PhD level as a plagiarism issue treats the binding constraint as student conduct rather than the validity, replicability, and ethical defensibility of AI-augmented research itself. Reproducibility, hallucination, validator-use, and adversarial-review competencies are research-integrity competencies. None of them is reducible to “do not present AI output as your own.”</w:t>
       </w:r>
     </w:p>
     <w:p>
@@ -392,7 +392,7 @@
           <w:i/>
           <w:iCs/>
         </w:rPr>
-        <w:t>AI literacy at PhD level is not a tooling-skills problem; it is a judgement problem.</w:t>
+        <w:t>AI literacy at the PhD level is not a tooling-skills problem; it is a judgement problem.</w:t>
       </w:r>
       <w:r>
         <w:rPr/>
@@ -6301,7 +6301,7 @@
       </w:pPr>
       <w:r>
         <w:rPr/>
-        <w:t>The grid is also intentionally compact. A short audit, four to six questions per dimension, can apply it in an hour; a comprehensive institutional review can apply it over a six-month cycle with external benchmarking. Both applications are reviewable against the same published criteria. The dimensional profile that emerges is the operational answer to the question this report opened with: what does responsible AI use look like at PhD level, and how would a university know whether it is doing it well.</w:t>
+        <w:t>The grid is also intentionally compact. A short audit, four to six questions per dimension, can apply it in an hour; a comprehensive institutional review can apply it over a six-month cycle with external benchmarking. Both applications are reviewable against the same published criteria. The dimensional profile that emerges is the operational answer to the question this report opened with: what does responsible AI use look like at the PhD level, and how would a university know whether it is doing it well.</w:t>
       </w:r>
       <w:bookmarkEnd w:id="44"/>
     </w:p>
@@ -7052,7 +7052,7 @@
       </w:r>
       <w:r>
         <w:rPr/>
-        <w:t xml:space="preserve"> The author has no paid relationships with any of the institutions in the report’s institutional sample (Appendix B). The author’s commercial role at Instats is research-training-adjacent; the report’s framing was developed independently of any commercial activity and is offered as a contribution to the public discussion of responsible AI use in research and research training, not as a product placement.</w:t>
+        <w:t xml:space="preserve"> The author has no paid relationships with any of the institutions in the report’s institutional sample (Appendix B), except his employment by the University of Queensland (UQ). UQ is one of the thirty-eight universities in the sample; its treatment is based only on public-facing policy documents, on the same basis as every other sample institution. The author’s commercial role at Instats is research-training-adjacent; the report’s framing was developed independently of any commercial activity and is offered as a contribution to the public discussion of responsible AI use in research and research training, not as a product placement.</w:t>
       </w:r>
       <w:bookmarkEnd w:id="47"/>
     </w:p>

</xml_diff>

<commit_message>
revise: incorporate lead-author tracked changes + comments; CC BY-NC-ND
- apply ~30 tracked-changes edits verbatim across the executive summary and
  Parts 1-2 from the Word review copy
- editorial fixes from review comments: Figure 1 drops the not-yet-defined
  "Class D" term (caption + chart relabelled to "AI-literacy policies"); the
  S1.2 heading reworded to "'Responsible AI use' still lacks an operational
  definition"; the "structural signal" sentence clarified; Figure 1 sources
  moved to a footnote
- clean 5 footnotes of internal dossier-process wording
- licence -> CC BY-NC-ND 4.0, copyright Instats (LICENSE, CITATION, README,
  colophon)
- rebuild final/ + docs/ with general-repo v0.22.45: repeated-source footnotes
  now correctly styled + numbered ("As cited above"); body font uniform 12pt;
  citation superscripts clickable

Co-Authored-By: Claude Opus 4.8 (1M context) <noreply@anthropic.com>
</commit_message>
<xml_diff>
--- a/docs/Instats - Responsible AI in Academic Research.docx
+++ b/docs/Instats - Responsible AI in Academic Research.docx
@@ -299,7 +299,7 @@
       </w:r>
       <w:r>
         <w:rPr/>
-        <w:t xml:space="preserve"> Creative Commons Attribution-NonCommercial 4.0 International (CC BY-NC 4.0). Share and adapt with attribution; commercial reuse requires written permission from the author.</w:t>
+        <w:t xml:space="preserve"> © 2026 Instats. Licensed under Creative Commons Attribution-NonCommercial-NoDerivatives 4.0 International (CC BY-NC-ND 4.0): share in full, with attribution, for non-commercial purposes; no adapted or modified redistribution; commercial reuse by written permission from Instats.</w:t>
       </w:r>
     </w:p>
     <w:p>
@@ -352,7 +352,7 @@
       </w:pPr>
       <w:r>
         <w:rPr/>
-        <w:t>LLMs are best understood as agentic research tools: task-directed systems that produce usable outputs, in the same family as statistical packages, transcription engines, code-generation assistants, and data-cleaning pipelines. They mimic human writing as a surface feature, not as their primary research function. The right question of any such tool is not who wrote the output but whether the use is ethical, valid, reproducible, and transparent. No one treats SPSS output as plagiarism. No one treats a Whisper-transcribed interview as fraudulent so long as the researcher verifies the transcript against the audio. The institutional move to treat AI use as a plagiarism question is a category error driven by surface mimicry rather than underlying function. The category error has three concrete consequences for institutional practice:</w:t>
+        <w:t>LLMs are best understood as agentic research tools: task-directed systems that produce usable outputs, in the same family as statistical packages, transcription engines, code-generation assistants, and data-cleaning pipelines. They mimic human writing as a potential feature, not as their primary research function. The right question of any such tool is not who wrote the output but whether the use is ethical, valid, reproducible, and transparent. No one treats SPSS output as plagiarism when it appears in a manuscript. No one treats Whisper-transcribed interviews as fraudulent so long as the researcher verifies them against the audio. The institutional move to treat AI use as a plagiarism question is a category error driven by surface mimicry rather than underlying function. This category error has three concrete consequences for institutional practice:</w:t>
       </w:r>
     </w:p>
     <w:p>
@@ -374,7 +374,7 @@
       </w:r>
       <w:r>
         <w:rPr/>
-        <w:t xml:space="preserve"> Framing responsible AI use at the PhD level as a plagiarism issue treats the binding constraint as student conduct rather than the validity, replicability, and ethical defensibility of AI-augmented research itself. Reproducibility, hallucination, validator-use, and adversarial-review competencies are research-integrity competencies. None of them is reducible to “do not present AI output as your own.”</w:t>
+        <w:t xml:space="preserve"> Framing responsible AI use at the PhD level as a plagiarism issue treats student conduct in the form of writing as the central issue rather than the validity, replicability, and ethical defensibility of AI-augmented research itself. Reproducibility, hallucination, validation, and adversarial-review competencies are research-integrity competencies. None of them is reducible to “do not present AI output as your own.”</w:t>
       </w:r>
     </w:p>
     <w:p>
@@ -396,7 +396,7 @@
       </w:r>
       <w:r>
         <w:rPr/>
-        <w:t xml:space="preserve"> The competency that distinguishes a defensible AI-augmented PhD from an indefensible one is not which tool the candidate can drive, but which research tasks the candidate decides to give AI, which ones the candidate decides to keep, and how the candidate verifies whichever side carries the AI contribution. Tools change every six months; the judgement does not.</w:t>
+        <w:t xml:space="preserve"> The competency that distinguishes defensible from indefensible AI-augmented research is not which tool researchers can use, but which research tasks the researchers decide to give AI, which ones they decide to keep, and how they verify whichever side carries the AI contribution. Tools change every six months; the judgement does not.</w:t>
       </w:r>
     </w:p>
     <w:p>
@@ -523,18 +523,19 @@
       </w:r>
       <w:r>
         <w:rPr/>
-        <w:t xml:space="preserve"> The six dots in the universities lane are the Class D universities — the only institutions with AI policies that extend past research integrity into AI literacy and valid research practices: UCL Doctoral School, KCL Centre for Education Studies, Heidelberg Graduate Academy, KU Leuven, University of Helsinki, and Tsinghua University. The remaining thirty-two institutions in the sample do not yet extend their AI policies into AI literacy and valid research practices. </w:t>
-      </w:r>
-      <w:r>
-        <w:rPr>
-          <w:i/>
-          <w:iCs/>
-        </w:rPr>
-        <w:t>Sources</w:t>
-      </w:r>
-      <w:r>
-        <w:rPr/>
-        <w:t>: publisher dossier (18 publishers + 3 preprint servers, snapshotted 2026-05-18); funder dossier (14 national research funders + the European Research Council); institutional dossier (38 top-tier doctoral universities in 15 countries and jurisdictions); Vitae RDF refresh date from vitae.ac.uk.</w:t>
+        <w:t xml:space="preserve"> The six dots in the universities lane are the only six institutions whose AI policies extend past research integrity into AI literacy and valid research practices: UCL Doctoral School, KCL Centre for Education Studies, Heidelberg Graduate Academy, KU Leuven, University of Helsinki, and Tsinghua University. The remaining thirty-two institutions in the sample do not yet extend their AI policies into AI literacy and valid research practices.</w:t>
+      </w:r>
+      <w:r>
+        <w:rPr>
+          <w:rFonts w:ascii="Inter" w:hAnsi="Inter" w:cs="Inter"/>
+          <w:b/>
+          <w:color w:val="3092B1"/>
+          <w:position w:val="8"/>
+          <w:sz w:val="18"/>
+          <w:szCs w:val="18"/>
+          <w:vertAlign w:val="superscript"/>
+        </w:rPr>
+        <w:footnoteReference w:id="2"/>
       </w:r>
       <w:bookmarkEnd w:id="0"/>
       <w:bookmarkEnd w:id="2"/>
@@ -608,12 +609,12 @@
         </w:numPr>
         <w:rPr/>
       </w:pPr>
-      <w:hyperlink w:anchor="X249cd8f8d3611a5f7cf9a267ae9e027e6df62ea">
+      <w:hyperlink w:anchor="X2560ded8103a952a7c82b7b0eaacab37c19c5b3">
         <w:r>
           <w:rPr>
             <w:rStyle w:val="Hyperlink"/>
           </w:rPr>
-          <w:t>1.2   What “responsible AI use” still lacks a definition for</w:t>
+          <w:t>1.2   “Responsible AI use” still lacks an operational definition</w:t>
         </w:r>
       </w:hyperlink>
     </w:p>
@@ -1247,7 +1248,7 @@
           <w:szCs w:val="18"/>
           <w:vertAlign w:val="superscript"/>
         </w:rPr>
-        <w:footnoteReference w:id="2"/>
+        <w:footnoteReference w:id="3"/>
       </w:r>
     </w:p>
     <w:p>
@@ -1257,7 +1258,7 @@
       </w:pPr>
       <w:r>
         <w:rPr/>
-        <w:t>The policy speed was unusually fast compared with the years-long convergence of prior publisher-policy adoptions on adjacent surfaces. Cross-publisher convergences (predatory-publishing rules, alignment with the International Committee of Medical Journal Editors authorship criteria, the Committee on Publication Ethics post-publication review protocols) typically take years to settle. The no-AI-co-authors convergence took ten weeks.</w:t>
+        <w:t>The policy speed was unusually fast compared with the years-long convergence of prior publisher-policy adoptions on other issues. Cross-publisher convergences (predatory-publishing rules, alignment with the International Committee of Medical Journal Editors authorship criteria, the Committee on Publication Ethics post-publication review protocols) typically take years to settle. The no-AI-co-authors convergence took ten weeks.</w:t>
       </w:r>
       <w:r>
         <w:rPr>
@@ -1269,7 +1270,7 @@
           <w:szCs w:val="18"/>
           <w:vertAlign w:val="superscript"/>
         </w:rPr>
-        <w:footnoteReference w:id="3"/>
+        <w:footnoteReference w:id="4"/>
       </w:r>
     </w:p>
     <w:p>
@@ -1291,7 +1292,7 @@
           <w:szCs w:val="18"/>
           <w:vertAlign w:val="superscript"/>
         </w:rPr>
-        <w:footnoteReference w:id="4"/>
+        <w:footnoteReference w:id="5"/>
       </w:r>
     </w:p>
     <w:p>
@@ -1313,7 +1314,7 @@
           <w:szCs w:val="18"/>
           <w:vertAlign w:val="superscript"/>
         </w:rPr>
-        <w:footnoteReference w:id="5"/>
+        <w:footnoteReference w:id="6"/>
       </w:r>
       <w:r>
         <w:rPr/>
@@ -1329,11 +1330,11 @@
           <w:szCs w:val="18"/>
           <w:vertAlign w:val="superscript"/>
         </w:rPr>
-        <w:footnoteReference w:id="6"/>
-      </w:r>
-      <w:r>
-        <w:rPr/>
-        <w:t xml:space="preserve"> The disclosure rate is low, but the trajectory is positive; the gap between use and disclosure is the structural signal.</w:t>
+        <w:footnoteReference w:id="7"/>
+      </w:r>
+      <w:r>
+        <w:rPr/>
+        <w:t xml:space="preserve"> The disclosure rate is low, but the trajectory is positive; the gap between how widely AI is used and how rarely that use is disclosed is the structural signal that research practice is outrunning the disclosure regimes built to govern it.</w:t>
       </w:r>
     </w:p>
     <w:p>
@@ -1343,7 +1344,7 @@
       </w:pPr>
       <w:r>
         <w:rPr/>
-        <w:t>That is the gap this report addresses: research practice has changed faster than university policy has defined responsible AI use in PhD training.</w:t>
+        <w:t>That is the gap this report addresses: research practice has changed faster than university policy has defined responsible AI use in PhD training, and faster than virtually all academic researchers have been able to cope with in terms of understanding what responsible AI use might look like for their own research and their PhD student supervision practices.</w:t>
       </w:r>
       <w:bookmarkEnd w:id="19"/>
     </w:p>
@@ -1352,10 +1353,10 @@
         <w:pStyle w:val="Heading3"/>
         <w:rPr/>
       </w:pPr>
-      <w:bookmarkStart w:id="20" w:name="X249cd8f8d3611a5f7cf9a267ae9e027e6df62ea"/>
-      <w:r>
-        <w:rPr/>
-        <w:t>1.2 What “responsible AI use” still lacks a definition for</w:t>
+      <w:bookmarkStart w:id="20" w:name="X2560ded8103a952a7c82b7b0eaacab37c19c5b3"/>
+      <w:r>
+        <w:rPr/>
+        <w:t>1.2 “Responsible AI use” still lacks an operational definition</w:t>
       </w:r>
     </w:p>
     <w:p>
@@ -1387,7 +1388,7 @@
           <w:szCs w:val="18"/>
           <w:vertAlign w:val="superscript"/>
         </w:rPr>
-        <w:footnoteReference w:id="7"/>
+        <w:footnoteReference w:id="8"/>
       </w:r>
       <w:r>
         <w:rPr/>
@@ -1403,11 +1404,11 @@
           <w:szCs w:val="18"/>
           <w:vertAlign w:val="superscript"/>
         </w:rPr>
-        <w:footnoteReference w:id="8"/>
-      </w:r>
-      <w:r>
-        <w:rPr/>
-        <w:t xml:space="preserve"> Both formulations are unobjectionable. Neither tells a PhD candidate or a PhD supervisor what to do on Monday morning when an AI tool returns a plausible-looking citation list, a plausible-looking explanation of a statistical assumption, or a plausible-looking interpretation of an experimental result.</w:t>
+        <w:footnoteReference w:id="9"/>
+      </w:r>
+      <w:r>
+        <w:rPr/>
+        <w:t xml:space="preserve"> Both formulations are unobjectionable, but neither tells a PhD candidate or a PhD supervisor what to do on Monday morning when an AI tool returns a plausible-looking citation list, a plausible-looking explanation of a statistical assumption, a plausible-looking interpretation of an experimental result, or a plausible summary of a paper or book.</w:t>
       </w:r>
     </w:p>
     <w:p>
@@ -1429,7 +1430,7 @@
           <w:szCs w:val="18"/>
           <w:vertAlign w:val="superscript"/>
         </w:rPr>
-        <w:footnoteReference w:id="9"/>
+        <w:footnoteReference w:id="10"/>
       </w:r>
       <w:r>
         <w:rPr/>
@@ -1445,7 +1446,7 @@
           <w:szCs w:val="18"/>
           <w:vertAlign w:val="superscript"/>
         </w:rPr>
-        <w:footnoteReference w:id="10"/>
+        <w:footnoteReference w:id="11"/>
       </w:r>
       <w:r>
         <w:rPr/>
@@ -1461,7 +1462,7 @@
           <w:szCs w:val="18"/>
           <w:vertAlign w:val="superscript"/>
         </w:rPr>
-        <w:footnoteReference w:id="11"/>
+        <w:footnoteReference w:id="12"/>
       </w:r>
       <w:r>
         <w:rPr/>
@@ -1477,7 +1478,7 @@
           <w:szCs w:val="18"/>
           <w:vertAlign w:val="superscript"/>
         </w:rPr>
-        <w:footnoteReference w:id="12"/>
+        <w:footnoteReference w:id="13"/>
       </w:r>
       <w:r>
         <w:rPr/>
@@ -1503,7 +1504,7 @@
           <w:szCs w:val="18"/>
           <w:vertAlign w:val="superscript"/>
         </w:rPr>
-        <w:footnoteReference w:id="13"/>
+        <w:footnoteReference w:id="14"/>
       </w:r>
       <w:r>
         <w:rPr/>
@@ -1519,7 +1520,7 @@
           <w:szCs w:val="18"/>
           <w:vertAlign w:val="superscript"/>
         </w:rPr>
-        <w:footnoteReference w:id="14"/>
+        <w:footnoteReference w:id="15"/>
       </w:r>
       <w:r>
         <w:rPr/>
@@ -1535,7 +1536,7 @@
           <w:szCs w:val="18"/>
           <w:vertAlign w:val="superscript"/>
         </w:rPr>
-        <w:footnoteReference w:id="15"/>
+        <w:footnoteReference w:id="16"/>
       </w:r>
       <w:r>
         <w:rPr/>
@@ -1670,7 +1671,7 @@
           <w:szCs w:val="18"/>
           <w:vertAlign w:val="superscript"/>
         </w:rPr>
-        <w:footnoteReference w:id="16"/>
+        <w:footnoteReference w:id="17"/>
       </w:r>
     </w:p>
     <w:p>
@@ -1766,7 +1767,7 @@
           <w:szCs w:val="18"/>
           <w:vertAlign w:val="superscript"/>
         </w:rPr>
-        <w:footnoteReference w:id="17"/>
+        <w:footnoteReference w:id="18"/>
       </w:r>
     </w:p>
     <w:p>
@@ -1902,7 +1903,7 @@
       </w:pPr>
       <w:r>
         <w:rPr/>
-        <w:t>The first dimension is the institutional commitment, articulated and operationalised, that the judgement steps that define research remain human. The labour steps can be augmented or accelerated by AI; the judgement steps cannot be outsourced to it without ceasing to be research.</w:t>
+        <w:t>The first dimension is the institutional commitment that the judgement steps that define research remain human. The labour steps can be augmented or accelerated by AI; the judgement steps cannot be outsourced to it without ceasing to be research.</w:t>
       </w:r>
     </w:p>
     <w:p>
@@ -1924,7 +1925,7 @@
           <w:szCs w:val="18"/>
           <w:vertAlign w:val="superscript"/>
         </w:rPr>
-        <w:footnoteReference w:id="18"/>
+        <w:footnoteReference w:id="19"/>
       </w:r>
       <w:r>
         <w:rPr/>
@@ -1940,7 +1941,7 @@
           <w:szCs w:val="18"/>
           <w:vertAlign w:val="superscript"/>
         </w:rPr>
-        <w:footnoteReference w:id="19"/>
+        <w:footnoteReference w:id="20"/>
       </w:r>
       <w:r>
         <w:rPr/>
@@ -1956,7 +1957,7 @@
           <w:szCs w:val="18"/>
           <w:vertAlign w:val="superscript"/>
         </w:rPr>
-        <w:footnoteReference w:id="20"/>
+        <w:footnoteReference w:id="21"/>
       </w:r>
     </w:p>
     <w:p>
@@ -1966,7 +1967,7 @@
       </w:pPr>
       <w:r>
         <w:rPr/>
-        <w:t>Operationally, the dimension demarcates the research task at task level. Some tasks are labour, where AI augmentation is fine and the cost of mistakes is recoverable: typesetting, formatting, language polishing on text the researcher generated, transcription against a verified audio source, code-style cleanup, bibliography formatting. Other tasks are judgement, where AI substitution silently degrades the research product: framing the research question, interpreting an unexpected result, deciding what counts as an outlier, weighing the competing pieces of evidence in a literature, deciding whether a finding survives an adversarial test, agreeing or disagreeing with a peer reviewer. The demarcation runs through every step of a PhD project, and PhD methods training should teach the demarcation explicitly. It is not given by the AI tool’s marketing description.</w:t>
+        <w:t>Operationally, the dimension demarcates the research task at a task level. Some tasks are labour, where AI augmentation is fine and the cost of mistakes is recoverable: typesetting, formatting, language polishing on text the researcher generated, transcription against a verified audio source, code-style cleanup, bibliography formatting. Other tasks are judgement, where AI substitution silently degrades the research product: framing the research question, interpreting an unexpected result, deciding what counts as an outlier, weighing the competing pieces of evidence in a literature, deciding whether a finding survives an adversarial test, agreeing or disagreeing with a peer reviewer. The demarcation runs through every step of a PhD project, and PhD methods training should teach the demarcation explicitly. It is not given by the AI tool’s marketing description and certainly not by any of the public hype surrounding it.</w:t>
       </w:r>
     </w:p>
     <w:p>
@@ -1976,7 +1977,7 @@
       </w:pPr>
       <w:r>
         <w:rPr/>
-        <w:t xml:space="preserve">The Dimension 1 institutional move is to publish this demarcation and enforce it through supervision and examination. The Australian Code for the Responsible Conduct of Research 2018, which anchors the Australian Group of Eight’s Class C posture (Part 1.3), supplies a national-level instance: validity, integrity, and accountability are framed in a way that AI augmentation must respect, not in a way that closes off AI augmentation. The German </w:t>
+        <w:t xml:space="preserve">The Dimension 1 institutional move is to publish this demarcation and enforce it through supervision and examination. The Australian Code for the Responsible Conduct of Research 2018, which anchors the Australian Group of Eight’s Class C posture (Part 1.3), supplies a national-level example: validity, integrity, and accountability are framed in a way that AI augmentation must respect, not in a way that closes off AI augmentation. The German </w:t>
       </w:r>
       <w:r>
         <w:rPr>
@@ -1999,7 +2000,7 @@
           <w:szCs w:val="18"/>
           <w:vertAlign w:val="superscript"/>
         </w:rPr>
-        <w:footnoteReference w:id="21"/>
+        <w:footnoteReference w:id="22"/>
       </w:r>
     </w:p>
     <w:p>
@@ -2009,7 +2010,7 @@
       </w:pPr>
       <w:r>
         <w:rPr/>
-        <w:t>Where Dimension 1 is absent, the result is the “AI did the analysis for me” failure mode and its institutional cousin, the “we used AI to validate our findings” justification offered without the disciplines Dimension 2 and Dimension 4 require. Where Dimension 1 is leading, the institution can answer the question “which research judgements stay human, why those, and how do we know” in a single paragraph that a Tier 1 audience member can read aloud to their council.</w:t>
+        <w:t>Where Dimension 1 is absent, the result is the “AI did the analysis for me” failure mode and its institutional cousin, the “we used AI to validate our findings” justification offered without the disciplines Dimension 2 and Dimension 4 require. Where Dimension 1 is leading, the institution can answer the question “which research judgements stay human, why those, and how do we know” in a single paragraph that a Tier 1 audience member can read aloud to their council/colleagues for planning implementation (or, more likely, deliberation and debate).</w:t>
       </w:r>
       <w:bookmarkEnd w:id="23"/>
     </w:p>
@@ -2043,7 +2044,7 @@
           <w:szCs w:val="18"/>
           <w:vertAlign w:val="superscript"/>
         </w:rPr>
-        <w:footnoteReference w:id="22"/>
+        <w:footnoteReference w:id="23"/>
       </w:r>
       <w:r>
         <w:rPr/>
@@ -2059,7 +2060,7 @@
           <w:szCs w:val="18"/>
           <w:vertAlign w:val="superscript"/>
         </w:rPr>
-        <w:footnoteReference w:id="23"/>
+        <w:footnoteReference w:id="24"/>
       </w:r>
       <w:r>
         <w:rPr/>
@@ -2075,7 +2076,7 @@
           <w:szCs w:val="18"/>
           <w:vertAlign w:val="superscript"/>
         </w:rPr>
-        <w:footnoteReference w:id="24"/>
+        <w:footnoteReference w:id="25"/>
       </w:r>
       <w:r>
         <w:rPr/>
@@ -2091,7 +2092,7 @@
           <w:szCs w:val="18"/>
           <w:vertAlign w:val="superscript"/>
         </w:rPr>
-        <w:footnoteReference w:id="25"/>
+        <w:footnoteReference w:id="26"/>
       </w:r>
       <w:r>
         <w:rPr/>
@@ -2117,7 +2118,7 @@
           <w:szCs w:val="18"/>
           <w:vertAlign w:val="superscript"/>
         </w:rPr>
-        <w:footnoteReference w:id="26"/>
+        <w:footnoteReference w:id="27"/>
       </w:r>
       <w:r>
         <w:rPr>
@@ -2141,7 +2142,7 @@
           <w:szCs w:val="18"/>
           <w:vertAlign w:val="superscript"/>
         </w:rPr>
-        <w:footnoteReference w:id="27"/>
+        <w:footnoteReference w:id="28"/>
       </w:r>
       <w:r>
         <w:rPr/>
@@ -2157,7 +2158,7 @@
           <w:szCs w:val="18"/>
           <w:vertAlign w:val="superscript"/>
         </w:rPr>
-        <w:footnoteReference w:id="28"/>
+        <w:footnoteReference w:id="29"/>
       </w:r>
       <w:r>
         <w:rPr/>
@@ -2171,7 +2172,7 @@
       </w:pPr>
       <w:r>
         <w:rPr/>
-        <w:t>National research funders have converged at application-stage transparency. The Council of Graduate Schools and Institut national de la recherche scientifique 2025 Global Action Agenda specifies seven principles of which Integrity, Transparency, and Responsibility and Accountability carry the responsible-use weight at institutional level.</w:t>
+        <w:t>National research funders have converged at application-stage transparency. The Council of Graduate Schools and Institut national de la recherche scientifique 2025 Global Action Agenda specifies seven principles of which Integrity, Transparency, and Responsibility and Accountability carry the responsible-use weight at the institutional level.</w:t>
       </w:r>
       <w:r>
         <w:rPr>
@@ -2183,7 +2184,7 @@
           <w:szCs w:val="18"/>
           <w:vertAlign w:val="superscript"/>
         </w:rPr>
-        <w:footnoteReference w:id="29"/>
+        <w:footnoteReference w:id="30"/>
       </w:r>
       <w:r>
         <w:rPr/>
@@ -2199,7 +2200,7 @@
           <w:szCs w:val="18"/>
           <w:vertAlign w:val="superscript"/>
         </w:rPr>
-        <w:footnoteReference w:id="30"/>
+        <w:footnoteReference w:id="31"/>
       </w:r>
       <w:r>
         <w:rPr/>
@@ -2225,11 +2226,11 @@
           <w:szCs w:val="18"/>
           <w:vertAlign w:val="superscript"/>
         </w:rPr>
-        <w:footnoteReference w:id="31"/>
-      </w:r>
-      <w:r>
-        <w:rPr/>
-        <w:t xml:space="preserve"> These principles are unobjectionable; they do not translate to research-task-level rules.</w:t>
+        <w:footnoteReference w:id="32"/>
+      </w:r>
+      <w:r>
+        <w:rPr/>
+        <w:t xml:space="preserve"> These principles are unobjectionable, but they do not translate to research-task-level rules.</w:t>
       </w:r>
     </w:p>
     <w:p>
@@ -2239,7 +2240,7 @@
       </w:pPr>
       <w:r>
         <w:rPr/>
-        <w:t>The Dimension 2 contribution is to specify responsible use at task level for the four AI-use modes that appear in PhD-level research. The taxonomy comes from the AI-tool-class dossier:</w:t>
+        <w:t>The Dimension 2 contribution is to specify responsible use at the task level for the four AI-use modes that appear in PhD-level research. The taxonomy comes from the AI-tool-class dossier:</w:t>
       </w:r>
       <w:r>
         <w:rPr>
@@ -2251,7 +2252,7 @@
           <w:szCs w:val="18"/>
           <w:vertAlign w:val="superscript"/>
         </w:rPr>
-        <w:footnoteReference w:id="32"/>
+        <w:footnoteReference w:id="33"/>
       </w:r>
     </w:p>
     <w:p>
@@ -2284,7 +2285,7 @@
           <w:szCs w:val="18"/>
           <w:vertAlign w:val="superscript"/>
         </w:rPr>
-        <w:footnoteReference w:id="33"/>
+        <w:footnoteReference w:id="34"/>
       </w:r>
       <w:r>
         <w:rPr>
@@ -2308,7 +2309,7 @@
           <w:szCs w:val="18"/>
           <w:vertAlign w:val="superscript"/>
         </w:rPr>
-        <w:footnoteReference w:id="34"/>
+        <w:footnoteReference w:id="35"/>
       </w:r>
     </w:p>
     <w:p>
@@ -2350,7 +2351,7 @@
       </w:r>
       <w:r>
         <w:rPr/>
-        <w:t xml:space="preserve"> Treat AI critique as a brainstorm prompt, not as a validation that completes the adversarial-review obligation. Run the critique through a model from a different family than the one that produced the original argument (Dimension 4’s model-heterogeneity discipline). Treat agreement with the user’s framing as a sycophancy signal, not as a validation signal.</w:t>
+        <w:t xml:space="preserve"> Treat AI critique as a brainstorm prompt, not as a validation that completes the adversarial-review obligation. Run the critique through a model from a different frontier-model AI family than the one that produced the original argument (Dimension 4’s model-heterogeneity discipline). Treat agreement with the user’s framing as a potential sycophancy signal, not as a validation signal.</w:t>
       </w:r>
       <w:r>
         <w:rPr>
@@ -2362,7 +2363,7 @@
           <w:szCs w:val="18"/>
           <w:vertAlign w:val="superscript"/>
         </w:rPr>
-        <w:footnoteReference w:id="35"/>
+        <w:footnoteReference w:id="36"/>
       </w:r>
       <w:r>
         <w:rPr>
@@ -2386,7 +2387,7 @@
           <w:szCs w:val="18"/>
           <w:vertAlign w:val="superscript"/>
         </w:rPr>
-        <w:footnoteReference w:id="36"/>
+        <w:footnoteReference w:id="37"/>
       </w:r>
     </w:p>
     <w:p>
@@ -2407,7 +2408,7 @@
       </w:r>
       <w:r>
         <w:rPr/>
-        <w:t xml:space="preserve"> Use corpus-grounded tutoring (RAG over the supervisor’s reading list, institutional knowledge bases) in preference to free-form chat. Require the student to demonstrate independent recall of the core concepts before accepting AI-assisted progress as evidence of learning.</w:t>
+        <w:t xml:space="preserve"> Use corpus-grounded tutoring (RAG over the supervisor’s reading list, institutional knowledge bases) in preference to free-form chat to improve structure and replicability. Require the student to demonstrate independent recall of the core concepts before accepting AI-assisted progress as evidence of learning.</w:t>
       </w:r>
     </w:p>
     <w:p>
@@ -2417,7 +2418,7 @@
       </w:pPr>
       <w:r>
         <w:rPr/>
-        <w:t>The dimension’s operational test is whether the institution has translated its high-level “responsible use” language into rules at this level of specificity, and whether the supervision-and-examination practice actually applies them. Where it has, supervisors can articulate the practice on a single page; PhD candidates can apply it in their methods chapter; examiners can check it during the viva voce. Where it has not, “responsible use” remains a phrase rather than a practice.</w:t>
+        <w:t>The dimension’s operational test is whether the institution has translated its high-level “responsible use” language into rules at this level of specificity, and whether the supervision-and-examination practice actually applies them. Where it has, supervisors can articulate the practice on a single page; PhD candidates can apply it in their methods chapter; examiners can check it during the viva voce. Where it has not, “responsible use” remains an empty phrase rather than a concrete and locally operationalised practice.</w:t>
       </w:r>
       <w:bookmarkEnd w:id="24"/>
     </w:p>
@@ -2451,7 +2452,7 @@
           <w:szCs w:val="18"/>
           <w:vertAlign w:val="superscript"/>
         </w:rPr>
-        <w:footnoteReference w:id="37"/>
+        <w:footnoteReference w:id="38"/>
       </w:r>
     </w:p>
     <w:p>
@@ -2494,7 +2495,7 @@
           <w:szCs w:val="18"/>
           <w:vertAlign w:val="superscript"/>
         </w:rPr>
-        <w:footnoteReference w:id="38"/>
+        <w:footnoteReference w:id="39"/>
       </w:r>
       <w:r>
         <w:rPr/>
@@ -2510,7 +2511,7 @@
           <w:szCs w:val="18"/>
           <w:vertAlign w:val="superscript"/>
         </w:rPr>
-        <w:footnoteReference w:id="39"/>
+        <w:footnoteReference w:id="40"/>
       </w:r>
       <w:r>
         <w:rPr/>
@@ -2547,7 +2548,7 @@
           <w:szCs w:val="18"/>
           <w:vertAlign w:val="superscript"/>
         </w:rPr>
-        <w:footnoteReference w:id="40"/>
+        <w:footnoteReference w:id="41"/>
       </w:r>
     </w:p>
     <w:p>
@@ -2580,7 +2581,7 @@
           <w:szCs w:val="18"/>
           <w:vertAlign w:val="superscript"/>
         </w:rPr>
-        <w:footnoteReference w:id="41"/>
+        <w:footnoteReference w:id="42"/>
       </w:r>
       <w:r>
         <w:rPr/>
@@ -2617,7 +2618,7 @@
           <w:szCs w:val="18"/>
           <w:vertAlign w:val="superscript"/>
         </w:rPr>
-        <w:footnoteReference w:id="42"/>
+        <w:footnoteReference w:id="43"/>
       </w:r>
     </w:p>
     <w:p>
@@ -2681,7 +2682,7 @@
           <w:szCs w:val="18"/>
           <w:vertAlign w:val="superscript"/>
         </w:rPr>
-        <w:footnoteReference w:id="43"/>
+        <w:footnoteReference w:id="44"/>
       </w:r>
       <w:r>
         <w:rPr>
@@ -2705,7 +2706,7 @@
           <w:szCs w:val="18"/>
           <w:vertAlign w:val="superscript"/>
         </w:rPr>
-        <w:footnoteReference w:id="44"/>
+        <w:footnoteReference w:id="45"/>
       </w:r>
       <w:r>
         <w:rPr/>
@@ -2721,7 +2722,7 @@
           <w:szCs w:val="18"/>
           <w:vertAlign w:val="superscript"/>
         </w:rPr>
-        <w:footnoteReference w:id="45"/>
+        <w:footnoteReference w:id="46"/>
       </w:r>
       <w:r>
         <w:rPr/>
@@ -2769,7 +2770,7 @@
           <w:szCs w:val="18"/>
           <w:vertAlign w:val="superscript"/>
         </w:rPr>
-        <w:footnoteReference w:id="46"/>
+        <w:footnoteReference w:id="47"/>
       </w:r>
       <w:r>
         <w:rPr/>
@@ -2785,7 +2786,7 @@
           <w:szCs w:val="18"/>
           <w:vertAlign w:val="superscript"/>
         </w:rPr>
-        <w:footnoteReference w:id="47"/>
+        <w:footnoteReference w:id="48"/>
       </w:r>
       <w:r>
         <w:rPr/>
@@ -2811,11 +2812,11 @@
           <w:szCs w:val="18"/>
           <w:vertAlign w:val="superscript"/>
         </w:rPr>
-        <w:footnoteReference w:id="48"/>
-      </w:r>
-      <w:r>
-        <w:rPr/>
-        <w:t xml:space="preserve"> A PhD researcher trained on that pre-AI canon brings the foundation for AI-augmented research: reproducibility, validity, and scepticism; the AI-era competencies extend that foundation.</w:t>
+        <w:footnoteReference w:id="49"/>
+      </w:r>
+      <w:r>
+        <w:rPr/>
+        <w:t xml:space="preserve"> A PhD researcher trained on that pre-AI canon brings the foundation for AI-augmented research: reproducibility, validity, and scepticism; however, the AI-era competencies extend that foundation and point to the need for AI-centric upskilling in the form of rigorous AI-related research training.</w:t>
       </w:r>
     </w:p>
     <w:p>
@@ -2846,7 +2847,7 @@
       </w:r>
       <w:r>
         <w:rPr/>
-        <w:t xml:space="preserve"> Every citation produced by an LLM workflow is verified against the primary source before publication. The Walters and Wilder 2023 fabrication rate (18 per cent on GPT-4, 55 per cent on GPT-3.5) is the empirical baseline; the Chelli et al. 2024 cross-LLM range (28.6 per cent to 91.4 per cent) is the medical-literature extension; the Mata v Avianca sanction (S.D.N.Y. 22-cv-01461, 22 June 2023) is the cautionary tale.</w:t>
+        <w:t xml:space="preserve"> Every citation produced by an LLM workflow is verified against the primary source before publication. The Walters and Wilder 2023 fabrication rate (18 per cent on GPT-4, 55 per cent on GPT-3.5) is an empirical baseline; the Chelli et al. 2024 cross-LLM range (28.6 per cent to 91.4 per cent) is the medical-literature extension; the Mata v Avianca sanction (S.D.N.Y. 22-cv-01461, 22 June 2023) is the cautionary tale.</w:t>
       </w:r>
       <w:r>
         <w:rPr>
@@ -2858,7 +2859,7 @@
           <w:szCs w:val="18"/>
           <w:vertAlign w:val="superscript"/>
         </w:rPr>
-        <w:footnoteReference w:id="49"/>
+        <w:footnoteReference w:id="50"/>
       </w:r>
       <w:r>
         <w:rPr>
@@ -2882,7 +2883,7 @@
           <w:szCs w:val="18"/>
           <w:vertAlign w:val="superscript"/>
         </w:rPr>
-        <w:footnoteReference w:id="50"/>
+        <w:footnoteReference w:id="51"/>
       </w:r>
       <w:r>
         <w:rPr/>
@@ -2898,7 +2899,7 @@
           <w:szCs w:val="18"/>
           <w:vertAlign w:val="superscript"/>
         </w:rPr>
-        <w:footnoteReference w:id="51"/>
+        <w:footnoteReference w:id="52"/>
       </w:r>
     </w:p>
     <w:p>
@@ -2931,7 +2932,7 @@
           <w:szCs w:val="18"/>
           <w:vertAlign w:val="superscript"/>
         </w:rPr>
-        <w:footnoteReference w:id="52"/>
+        <w:footnoteReference w:id="53"/>
       </w:r>
     </w:p>
     <w:p>
@@ -2964,7 +2965,7 @@
           <w:szCs w:val="18"/>
           <w:vertAlign w:val="superscript"/>
         </w:rPr>
-        <w:footnoteReference w:id="53"/>
+        <w:footnoteReference w:id="54"/>
       </w:r>
       <w:r>
         <w:rPr/>
@@ -2989,7 +2990,7 @@
       </w:r>
       <w:r>
         <w:rPr/>
-        <w:t xml:space="preserve"> Adversarial validation patterns (red-team, blue-team, devil’s-advocate, multi-agent debate) work in the AI setting only when the agent pool is heterogeneous across model families. Zhang et al. 2025 (“Stop Overvaluing Multi-Agent Debate”), covering five debate methods, nine benchmarks, and four foundational models, found that homogeneous multi-agent debate frequently fails to beat single-agent Chain-of-Thought, with model heterogeneity carrying most of the gain. Single-model devil’s-advocate prompting and intrinsic self-critique chains break down because the same parameters produce both the original answer and the critique.</w:t>
+        <w:t xml:space="preserve"> Adversarial validation patterns (red-team, blue-team, devil’s-advocate, multi-agent debate) work in the AI setting only when the agent pool is heterogeneous across model families. Zhang et al. 2025 (“Stop Overvaluing Multi-Agent Debate”), covering five debate methods, nine benchmarks, and four foundational models, found that homogeneous multi-agent debate frequently fails to beat single-agent Chain-of-Thought, with model heterogeneity carrying most of the gain. Single-model devil’s-advocate prompting and intrinsic self-critique chains can break down because the same parameters produce both the original answer and the critique.</w:t>
       </w:r>
       <w:r>
         <w:rPr>
@@ -3001,7 +3002,7 @@
           <w:szCs w:val="18"/>
           <w:vertAlign w:val="superscript"/>
         </w:rPr>
-        <w:footnoteReference w:id="54"/>
+        <w:footnoteReference w:id="55"/>
       </w:r>
       <w:r>
         <w:rPr>
@@ -3025,7 +3026,7 @@
           <w:szCs w:val="18"/>
           <w:vertAlign w:val="superscript"/>
         </w:rPr>
-        <w:footnoteReference w:id="55"/>
+        <w:footnoteReference w:id="56"/>
       </w:r>
     </w:p>
     <w:p>
@@ -3058,7 +3059,7 @@
           <w:szCs w:val="18"/>
           <w:vertAlign w:val="superscript"/>
         </w:rPr>
-        <w:footnoteReference w:id="56"/>
+        <w:footnoteReference w:id="57"/>
       </w:r>
     </w:p>
     <w:p>
@@ -3091,7 +3092,7 @@
           <w:szCs w:val="18"/>
           <w:vertAlign w:val="superscript"/>
         </w:rPr>
-        <w:footnoteReference w:id="57"/>
+        <w:footnoteReference w:id="58"/>
       </w:r>
       <w:r>
         <w:rPr>
@@ -3115,7 +3116,7 @@
           <w:szCs w:val="18"/>
           <w:vertAlign w:val="superscript"/>
         </w:rPr>
-        <w:footnoteReference w:id="58"/>
+        <w:footnoteReference w:id="59"/>
       </w:r>
     </w:p>
     <w:p>
@@ -3243,7 +3244,7 @@
           <w:szCs w:val="18"/>
           <w:vertAlign w:val="superscript"/>
         </w:rPr>
-        <w:footnoteReference w:id="59"/>
+        <w:footnoteReference w:id="60"/>
       </w:r>
       <w:r>
         <w:rPr/>
@@ -3259,7 +3260,7 @@
           <w:szCs w:val="18"/>
           <w:vertAlign w:val="superscript"/>
         </w:rPr>
-        <w:footnoteReference w:id="60"/>
+        <w:footnoteReference w:id="61"/>
       </w:r>
       <w:r>
         <w:rPr/>
@@ -3273,7 +3274,7 @@
       </w:pPr>
       <w:r>
         <w:rPr/>
-        <w:t>A policy document is a row in the competency grid, not the grid. The dimension’s purpose is not to mandate a single right answer to any of the four axes. Institutional context varies, and an institutional choice that is leading at one university may be inappropriate at another. The purpose is to make the choice visible.</w:t>
+        <w:t>A policy document is a row in the competency grid, not the grid itself. The dimension’s purpose is not to mandate a single right answer to any of the four axes. Institutional context varies, and an institutional choice that is leading at one university may be inappropriate at another. The purpose is to make the choice visible.</w:t>
       </w:r>
       <w:bookmarkEnd w:id="22"/>
       <w:bookmarkEnd w:id="27"/>
@@ -3339,7 +3340,7 @@
           <w:szCs w:val="18"/>
           <w:vertAlign w:val="superscript"/>
         </w:rPr>
-        <w:footnoteReference w:id="61"/>
+        <w:footnoteReference w:id="62"/>
       </w:r>
     </w:p>
     <w:p>
@@ -3361,7 +3362,7 @@
           <w:szCs w:val="18"/>
           <w:vertAlign w:val="superscript"/>
         </w:rPr>
-        <w:footnoteReference w:id="62"/>
+        <w:footnoteReference w:id="63"/>
       </w:r>
       <w:r>
         <w:rPr/>
@@ -3377,7 +3378,7 @@
           <w:szCs w:val="18"/>
           <w:vertAlign w:val="superscript"/>
         </w:rPr>
-        <w:footnoteReference w:id="63"/>
+        <w:footnoteReference w:id="64"/>
       </w:r>
       <w:r>
         <w:rPr/>
@@ -3413,7 +3414,7 @@
           <w:szCs w:val="18"/>
           <w:vertAlign w:val="superscript"/>
         </w:rPr>
-        <w:footnoteReference w:id="64"/>
+        <w:footnoteReference w:id="65"/>
       </w:r>
       <w:r>
         <w:rPr/>
@@ -3439,7 +3440,7 @@
           <w:szCs w:val="18"/>
           <w:vertAlign w:val="superscript"/>
         </w:rPr>
-        <w:footnoteReference w:id="65"/>
+        <w:footnoteReference w:id="66"/>
       </w:r>
       <w:r>
         <w:rPr/>
@@ -3477,7 +3478,7 @@
           <w:szCs w:val="18"/>
           <w:vertAlign w:val="superscript"/>
         </w:rPr>
-        <w:footnoteReference w:id="66"/>
+        <w:footnoteReference w:id="67"/>
       </w:r>
     </w:p>
     <w:p>
@@ -3530,7 +3531,7 @@
           <w:szCs w:val="18"/>
           <w:vertAlign w:val="superscript"/>
         </w:rPr>
-        <w:footnoteReference w:id="67"/>
+        <w:footnoteReference w:id="68"/>
       </w:r>
     </w:p>
     <w:p>
@@ -3572,7 +3573,7 @@
           <w:szCs w:val="18"/>
           <w:vertAlign w:val="superscript"/>
         </w:rPr>
-        <w:footnoteReference w:id="68"/>
+        <w:footnoteReference w:id="69"/>
       </w:r>
       <w:r>
         <w:rPr/>
@@ -3630,7 +3631,7 @@
           <w:szCs w:val="18"/>
           <w:vertAlign w:val="superscript"/>
         </w:rPr>
-        <w:footnoteReference w:id="69"/>
+        <w:footnoteReference w:id="70"/>
       </w:r>
     </w:p>
     <w:p>
@@ -3662,7 +3663,7 @@
           <w:szCs w:val="18"/>
           <w:vertAlign w:val="superscript"/>
         </w:rPr>
-        <w:footnoteReference w:id="70"/>
+        <w:footnoteReference w:id="71"/>
       </w:r>
     </w:p>
     <w:p>
@@ -3684,7 +3685,7 @@
           <w:szCs w:val="18"/>
           <w:vertAlign w:val="superscript"/>
         </w:rPr>
-        <w:footnoteReference w:id="71"/>
+        <w:footnoteReference w:id="72"/>
       </w:r>
       <w:r>
         <w:rPr/>
@@ -3752,7 +3753,7 @@
           <w:szCs w:val="18"/>
           <w:vertAlign w:val="superscript"/>
         </w:rPr>
-        <w:footnoteReference w:id="72"/>
+        <w:footnoteReference w:id="73"/>
       </w:r>
     </w:p>
     <w:p>
@@ -3804,7 +3805,7 @@
           <w:szCs w:val="18"/>
           <w:vertAlign w:val="superscript"/>
         </w:rPr>
-        <w:footnoteReference w:id="73"/>
+        <w:footnoteReference w:id="74"/>
       </w:r>
     </w:p>
     <w:p>
@@ -6352,7 +6353,7 @@
           <w:szCs w:val="18"/>
           <w:vertAlign w:val="superscript"/>
         </w:rPr>
-        <w:footnoteReference w:id="74"/>
+        <w:footnoteReference w:id="75"/>
       </w:r>
       <w:r>
         <w:rPr/>
@@ -6385,7 +6386,7 @@
           <w:szCs w:val="18"/>
           <w:vertAlign w:val="superscript"/>
         </w:rPr>
-        <w:footnoteReference w:id="75"/>
+        <w:footnoteReference w:id="76"/>
       </w:r>
       <w:r>
         <w:rPr/>
@@ -6418,7 +6419,7 @@
           <w:szCs w:val="18"/>
           <w:vertAlign w:val="superscript"/>
         </w:rPr>
-        <w:footnoteReference w:id="76"/>
+        <w:footnoteReference w:id="77"/>
       </w:r>
       <w:r>
         <w:rPr/>
@@ -6451,7 +6452,7 @@
           <w:szCs w:val="18"/>
           <w:vertAlign w:val="superscript"/>
         </w:rPr>
-        <w:footnoteReference w:id="77"/>
+        <w:footnoteReference w:id="78"/>
       </w:r>
       <w:r>
         <w:rPr/>
@@ -6495,7 +6496,7 @@
           <w:szCs w:val="18"/>
           <w:vertAlign w:val="superscript"/>
         </w:rPr>
-        <w:footnoteReference w:id="78"/>
+        <w:footnoteReference w:id="79"/>
       </w:r>
       <w:r>
         <w:rPr/>
@@ -6511,7 +6512,7 @@
           <w:szCs w:val="18"/>
           <w:vertAlign w:val="superscript"/>
         </w:rPr>
-        <w:footnoteReference w:id="79"/>
+        <w:footnoteReference w:id="80"/>
       </w:r>
       <w:r>
         <w:rPr>
@@ -6535,7 +6536,7 @@
           <w:szCs w:val="18"/>
           <w:vertAlign w:val="superscript"/>
         </w:rPr>
-        <w:footnoteReference w:id="80"/>
+        <w:footnoteReference w:id="81"/>
       </w:r>
       <w:r>
         <w:rPr/>
@@ -6551,7 +6552,7 @@
           <w:szCs w:val="18"/>
           <w:vertAlign w:val="superscript"/>
         </w:rPr>
-        <w:footnoteReference w:id="81"/>
+        <w:footnoteReference w:id="82"/>
       </w:r>
     </w:p>
     <w:p>
@@ -6580,7 +6581,7 @@
           <w:szCs w:val="18"/>
           <w:vertAlign w:val="superscript"/>
         </w:rPr>
-        <w:footnoteReference w:id="82"/>
+        <w:footnoteReference w:id="83"/>
       </w:r>
       <w:r>
         <w:rPr/>
@@ -6613,7 +6614,7 @@
           <w:szCs w:val="18"/>
           <w:vertAlign w:val="superscript"/>
         </w:rPr>
-        <w:footnoteReference w:id="83"/>
+        <w:footnoteReference w:id="84"/>
       </w:r>
       <w:r>
         <w:rPr/>
@@ -6646,7 +6647,7 @@
           <w:szCs w:val="18"/>
           <w:vertAlign w:val="superscript"/>
         </w:rPr>
-        <w:footnoteReference w:id="84"/>
+        <w:footnoteReference w:id="85"/>
       </w:r>
       <w:r>
         <w:rPr/>
@@ -9505,7 +9506,7 @@
     </w:r>
     <w:r>
       <w:rPr/>
-      <w:t>84</w:t>
+      <w:t>95</w:t>
     </w:r>
     <w:r>
       <w:rPr/>
@@ -9566,8 +9567,15 @@
         <w:t xml:space="preserve"> </w:t>
       </w:r>
       <w:r>
-        <w:rPr/>
-        <w:t>Hill, M., quoted in Cambridge University Press’s “Cambridge launches AI research ethics policy” press release, March 2023. URL: https://www.cambridge.org/news-and-insights/cambridge-launches-ai-research-ethics-policy · snapshotted 2026-05-18.</w:t>
+        <w:rPr>
+          <w:i/>
+          <w:iCs/>
+        </w:rPr>
+        <w:t>Sources</w:t>
+      </w:r>
+      <w:r>
+        <w:rPr/>
+        <w:t>: publisher dossier (18 publishers + 3 preprint servers, snapshotted 2026-05-18); funder dossier (14 national research funders + the European Research Council); institutional dossier (38 top-tier doctoral universities in 15 countries and jurisdictions); Vitae RDF refresh date from vitae.ac.uk.</w:t>
       </w:r>
     </w:p>
   </w:footnote>
@@ -9593,17 +9601,7 @@
       </w:r>
       <w:r>
         <w:rPr/>
-        <w:t xml:space="preserve">Synthesised across the eighteen-entry publisher dossier; see </w:t>
-      </w:r>
-      <w:r>
-        <w:rPr>
-          <w:rStyle w:val="VerbatimChar"/>
-        </w:rPr>
-        <w:t>research/dossier_04_publisher_policies.md</w:t>
-      </w:r>
-      <w:r>
-        <w:rPr/>
-        <w:t xml:space="preserve"> and the trajectory-analysis section therein.</w:t>
+        <w:t>Hill, M., quoted in Cambridge University Press’s “Cambridge launches AI research ethics policy” press release, March 2023. URL: https://www.cambridge.org/news-and-insights/cambridge-launches-ai-research-ethics-policy · snapshotted 2026-05-18.</w:t>
       </w:r>
     </w:p>
   </w:footnote>
@@ -9629,17 +9627,17 @@
       </w:r>
       <w:r>
         <w:rPr/>
-        <w:t xml:space="preserve">Synthesised across the fourteen-entry national-funder dossier; see </w:t>
+        <w:t>Synthesised across the eighteen-entry publisher-policy dossier (</w:t>
       </w:r>
       <w:r>
         <w:rPr>
           <w:rStyle w:val="VerbatimChar"/>
         </w:rPr>
-        <w:t>research/dossier_01_national_funders.md</w:t>
-      </w:r>
-      <w:r>
-        <w:rPr/>
-        <w:t>.</w:t>
+        <w:t>research/dossier_04_publisher_policies.md</w:t>
+      </w:r>
+      <w:r>
+        <w:rPr/>
+        <w:t>).</w:t>
       </w:r>
     </w:p>
   </w:footnote>
@@ -9665,17 +9663,17 @@
       </w:r>
       <w:r>
         <w:rPr/>
-        <w:t xml:space="preserve">arXiv internal moderation findings reported in 2025; methodology and threshold discussed in </w:t>
+        <w:t xml:space="preserve">Synthesised across the fourteen-entry national-funder dossier; see </w:t>
       </w:r>
       <w:r>
         <w:rPr>
           <w:rStyle w:val="VerbatimChar"/>
         </w:rPr>
-        <w:t>research/dossier_04_publisher_policies.md</w:t>
-      </w:r>
-      <w:r>
-        <w:rPr/>
-        <w:t xml:space="preserve"> § preprint-server position.</w:t>
+        <w:t>research/dossier_01_national_funders.md</w:t>
+      </w:r>
+      <w:r>
+        <w:rPr/>
+        <w:t>.</w:t>
       </w:r>
     </w:p>
   </w:footnote>
@@ -9701,7 +9699,7 @@
       </w:r>
       <w:r>
         <w:rPr/>
-        <w:t xml:space="preserve">BMJ Author Hub, “AI policy and submission form disclosure,” April 2024; 2025 Peer Review Congress disclosure rate report. See </w:t>
+        <w:t>arXiv internal moderation findings reported in 2025; methodology and threshold detailed in the publisher-policy dossier (</w:t>
       </w:r>
       <w:r>
         <w:rPr>
@@ -9711,7 +9709,7 @@
       </w:r>
       <w:r>
         <w:rPr/>
-        <w:t xml:space="preserve"> § BMJ family entry. URL: https://authors.bmj.com/policies/bmj-policy-on-artificial-intelligence/ (access status noted in dossier).</w:t>
+        <w:t>).</w:t>
       </w:r>
     </w:p>
   </w:footnote>
@@ -9737,7 +9735,7 @@
       </w:r>
       <w:r>
         <w:rPr/>
-        <w:t>Deutsche Forschungsgemeinschaft, Executive Committee statement on the use of generative models in research, 21 September 2023. URL: https://www.dfg.de/en/service/press/press-releases/2023/press-release-no-39 · snapshotted 2026-05-18.</w:t>
+        <w:t>BMJ Author Hub, “AI policy and submission form disclosure,” April 2024; 2025 Peer Review Congress disclosure-rate report. URL: https://authors.bmj.com/policies/bmj-policy-on-artificial-intelligence/ · snapshotted 2026-05-18.</w:t>
       </w:r>
     </w:p>
   </w:footnote>
@@ -9763,7 +9761,7 @@
       </w:r>
       <w:r>
         <w:rPr/>
-        <w:t>ARC / NHMRC, joint policy on the use of generative AI in grant applications and assessment, effective 28 April 2026. URLs: https://www.arc.gov.au/about-arc/program-policies/policy-use-generative-artificial-intelligence-arcs-grant-programs and https://www.nhmrc.gov.au/about-us/resources/policy-use-generative-artificial-intelligence · snapshotted 2026-05-18.</w:t>
+        <w:t>Deutsche Forschungsgemeinschaft, Executive Committee statement on the use of generative models in research, 21 September 2023. URL: https://www.dfg.de/en/service/press/press-releases/2023/press-release-no-39 · snapshotted 2026-05-18.</w:t>
       </w:r>
     </w:p>
   </w:footnote>
@@ -9789,7 +9787,7 @@
       </w:r>
       <w:r>
         <w:rPr/>
-        <w:t>Elsevier publisher-wide policy on the use of generative AI and AI-assisted technologies in scientific writing. URL: https://www.elsevier.com/about/policies-and-standards/the-use-of-generative-ai-and-ai-assisted-technologies-in-scientific-writing · snapshotted 2026-05-18.</w:t>
+        <w:t>ARC / NHMRC, joint policy on the use of generative AI in grant applications and assessment, effective 28 April 2026. URLs: https://www.arc.gov.au/about-arc/program-policies/policy-use-generative-artificial-intelligence-arcs-grant-programs and https://www.nhmrc.gov.au/about-us/resources/policy-use-generative-artificial-intelligence · snapshotted 2026-05-18.</w:t>
       </w:r>
     </w:p>
   </w:footnote>
@@ -9815,28 +9813,7 @@
       </w:r>
       <w:r>
         <w:rPr/>
-        <w:t xml:space="preserve">Cell Press, </w:t>
-      </w:r>
-      <w:r>
-        <w:rPr>
-          <w:i/>
-          <w:iCs/>
-        </w:rPr>
-        <w:t>Newton</w:t>
-      </w:r>
-      <w:r>
-        <w:rPr/>
-        <w:t xml:space="preserve"> journal Information for Authors (April 2024 issue), summarising the Cell Press-wide AI disclosure rule. See </w:t>
-      </w:r>
-      <w:r>
-        <w:rPr>
-          <w:rStyle w:val="VerbatimChar"/>
-        </w:rPr>
-        <w:t>research/dossier_04_publisher_policies.md</w:t>
-      </w:r>
-      <w:r>
-        <w:rPr/>
-        <w:t xml:space="preserve"> § Cell Press entry.</w:t>
+        <w:t>Elsevier publisher-wide policy on the use of generative AI and AI-assisted technologies in scientific writing. URL: https://www.elsevier.com/about/policies-and-standards/the-use-of-generative-ai-and-ai-assisted-technologies-in-scientific-writing · snapshotted 2026-05-18.</w:t>
       </w:r>
     </w:p>
   </w:footnote>
@@ -9862,7 +9839,18 @@
       </w:r>
       <w:r>
         <w:rPr/>
-        <w:t>JAMA Network policy on the use of AI in scholarly publication, formal Guidance issued 27 July 2023. URL: https://jamanetwork.com/journals/jama/fullarticle/2807956 · snapshotted 2026-05-18.</w:t>
+        <w:t xml:space="preserve">Cell Press, </w:t>
+      </w:r>
+      <w:r>
+        <w:rPr>
+          <w:i/>
+          <w:iCs/>
+        </w:rPr>
+        <w:t>Newton</w:t>
+      </w:r>
+      <w:r>
+        <w:rPr/>
+        <w:t xml:space="preserve"> journal Information for Authors (April 2024 issue), summarising the Cell Press-wide AI disclosure rule.</w:t>
       </w:r>
     </w:p>
   </w:footnote>
@@ -9888,7 +9876,7 @@
       </w:r>
       <w:r>
         <w:rPr/>
-        <w:t>Public Library of Science, “The promise and perils of AI use in peer review,” The PLOS Blog, September 2025. URL: https://theplosblog.plos.org/2025/09/the-promise-and-perils-of-ai-use-in-peer-review/ · snapshotted 2026-05-18.</w:t>
+        <w:t>JAMA Network policy on the use of AI in scholarly publication, formal Guidance issued 27 July 2023. URL: https://jamanetwork.com/journals/jama/fullarticle/2807956 · snapshotted 2026-05-18.</w:t>
       </w:r>
     </w:p>
   </w:footnote>
@@ -9914,7 +9902,7 @@
       </w:r>
       <w:r>
         <w:rPr/>
-        <w:t>UNESCO, AI Competency Framework for Students, issued 8 August 2024, revised 16 January 2026. URL: https://www.unesco.org/en/articles/ai-competency-framework-students · snapshotted 2026-05-18.</w:t>
+        <w:t>Public Library of Science, “The promise and perils of AI use in peer review,” The PLOS Blog, September 2025. URL: https://theplosblog.plos.org/2025/09/the-promise-and-perils-of-ai-use-in-peer-review/ · snapshotted 2026-05-18.</w:t>
       </w:r>
     </w:p>
   </w:footnote>
@@ -9940,18 +9928,7 @@
       </w:r>
       <w:r>
         <w:rPr/>
-        <w:t xml:space="preserve">Council of Graduate Schools and Institut national de la recherche scientifique, </w:t>
-      </w:r>
-      <w:r>
-        <w:rPr>
-          <w:i/>
-          <w:iCs/>
-        </w:rPr>
-        <w:t>Global Action Agenda for Using AI to Improve Graduate Education and Workforce Preparation</w:t>
-      </w:r>
-      <w:r>
-        <w:rPr/>
-        <w:t>, 13 November 2025. URL: https://cgsnet.org/press-releases/new-action-agenda-for-using-ai-to-improve-graduate-education-and-workforce-preparation · snapshotted 2026-05-18.</w:t>
+        <w:t>UNESCO, AI Competency Framework for Students, issued 8 August 2024, revised 16 January 2026. URL: https://www.unesco.org/en/articles/ai-competency-framework-students · snapshotted 2026-05-18.</w:t>
       </w:r>
     </w:p>
   </w:footnote>
@@ -9977,29 +9954,18 @@
       </w:r>
       <w:r>
         <w:rPr/>
-        <w:t xml:space="preserve">Blau, W. </w:t>
+        <w:t xml:space="preserve">Council of Graduate Schools and Institut national de la recherche scientifique, </w:t>
       </w:r>
       <w:r>
         <w:rPr>
           <w:i/>
           <w:iCs/>
         </w:rPr>
-        <w:t>et al.</w:t>
-      </w:r>
-      <w:r>
-        <w:rPr/>
-        <w:t xml:space="preserve">, “Protecting scientific integrity in an age of generative AI,” </w:t>
-      </w:r>
-      <w:r>
-        <w:rPr>
-          <w:i/>
-          <w:iCs/>
-        </w:rPr>
-        <w:t>PNAS</w:t>
-      </w:r>
-      <w:r>
-        <w:rPr/>
-        <w:t>, 21 May 2024. DOI: 10.1073/pnas.2407886121. URL: https://www.pnas.org/doi/10.1073/pnas.2407886121 · snapshotted 2026-05-18.</w:t>
+        <w:t>Global Action Agenda for Using AI to Improve Graduate Education and Workforce Preparation</w:t>
+      </w:r>
+      <w:r>
+        <w:rPr/>
+        <w:t>, 13 November 2025. URL: https://cgsnet.org/press-releases/new-action-agenda-for-using-ai-to-improve-graduate-education-and-workforce-preparation · snapshotted 2026-05-18.</w:t>
       </w:r>
     </w:p>
   </w:footnote>
@@ -10025,17 +9991,29 @@
       </w:r>
       <w:r>
         <w:rPr/>
-        <w:t xml:space="preserve">Thirty-eight-university sample with class breakdown A=4, B=11, C=17, D=6 (Total 38) per the reconciled summary table in </w:t>
-      </w:r>
-      <w:r>
-        <w:rPr>
-          <w:rStyle w:val="VerbatimChar"/>
-        </w:rPr>
-        <w:t>research/dossier_02_university_policies.md</w:t>
-      </w:r>
-      <w:r>
-        <w:rPr/>
-        <w:t xml:space="preserve"> § Class distribution and per-institution entries. The dossier’s earlier summary figures (A=5, B=6, C=13, D=6, Total 30) were inconsistent with the per-entry Classification fields and were reconciled at Stage A.</w:t>
+        <w:t xml:space="preserve">Blau, W. </w:t>
+      </w:r>
+      <w:r>
+        <w:rPr>
+          <w:i/>
+          <w:iCs/>
+        </w:rPr>
+        <w:t>et al.</w:t>
+      </w:r>
+      <w:r>
+        <w:rPr/>
+        <w:t xml:space="preserve">, “Protecting scientific integrity in an age of generative AI,” </w:t>
+      </w:r>
+      <w:r>
+        <w:rPr>
+          <w:i/>
+          <w:iCs/>
+        </w:rPr>
+        <w:t>PNAS</w:t>
+      </w:r>
+      <w:r>
+        <w:rPr/>
+        <w:t>, 21 May 2024. DOI: 10.1073/pnas.2407886121. URL: https://www.pnas.org/doi/10.1073/pnas.2407886121 · snapshotted 2026-05-18.</w:t>
       </w:r>
     </w:p>
   </w:footnote>
@@ -10061,60 +10039,21 @@
       </w:r>
       <w:r>
         <w:rPr/>
-        <w:t>Class D institutional documents: - UCL Doctoral School, “Transparency on Authorship and Generative AI in Doctoral Research.” URL: https://www.ucl.ac.uk/study/doctoral-school/regulations/essential-procedures-and-policies/transparency-authorship-and-generative-ai-doctoral-research · snapshotted 2026-05-18. - KCL, “Generative AI: Guidance for doctoral students, supervisors and examiners.” URL: https://www.kcl.ac.uk/about/strategy/learning-and-teaching/ai-guidance/doctoral-assessment · snapshotted 2026-05-18. - Heidelberg University Graduate Academy, AI in doctoral research. URL: https://www.graduateacademy.uni-heidelberg.de/promovieren/ai_en.html · snapshotted 2026-05-18. - KU Leuven, “Use of generative AI when writing your doctoral thesis.” URL: https://www.kuleuven.be/genai/documenten/generative-ai-and-doctoral-thesis.pdf · snapshotted 2026-05-18. - University of Helsinki, AI in research guidelines. URL: https://www.helsinki.fi/en/research/research-integrity/ai-research · snapshotted 2026-05-18. - Tsinghua University, AI framework December 2025 (English-language summary). URL: https://www.prnewswire.com/news-releases/tsinghua-university-releases-the-first-university-wide-framework-governing-ai-in-teaching-and-research-302628933.html · snapshotted 2026-05-18.</w:t>
+        <w:t>Thirty-eight-university sample; class distribution A=4, B=11, C=17, D=6 (38 total), from the per-institution policy classifications in the institutional-policy dossier (</w:t>
+      </w:r>
+      <w:r>
+        <w:rPr>
+          <w:rStyle w:val="VerbatimChar"/>
+        </w:rPr>
+        <w:t>research/dossier_02_university_policies.md</w:t>
+      </w:r>
+      <w:r>
+        <w:rPr/>
+        <w:t>).</w:t>
       </w:r>
     </w:p>
   </w:footnote>
   <w:footnote w:id="18">
-    <w:p>
-      <w:r>
-        <w:t xml:space="preserve">Repeated source: ARC / NHMRC, joint policy on the use of generative AI in grant applications and assessm...</w:t>
-      </w:r>
-    </w:p>
-  </w:footnote>
-  <w:footnote w:id="19">
-    <w:p>
-      <w:r>
-        <w:t xml:space="preserve">Repeated source: Synthesised across the eighteen-entry publisher dossier; see research/dossier_04_publis...</w:t>
-      </w:r>
-    </w:p>
-  </w:footnote>
-  <w:footnote w:id="20">
-    <w:p>
-      <w:r>
-        <w:t xml:space="preserve">Repeated source: Blau, W. et al., “Protecting scientific integrity in an age of generative AI,” PNAS, 21...</w:t>
-      </w:r>
-    </w:p>
-  </w:footnote>
-  <w:footnote w:id="21">
-    <w:p>
-      <w:r>
-        <w:t xml:space="preserve">Repeated source: Thirty-eight-university sample with class breakdown A=4, B=11, C=17, D=6 (Total 38) per...</w:t>
-      </w:r>
-    </w:p>
-  </w:footnote>
-  <w:footnote w:id="22">
-    <w:p>
-      <w:r>
-        <w:t xml:space="preserve">Repeated source: Synthesised across the fourteen-entry national-funder dossier; see research/dossier_01_...</w:t>
-      </w:r>
-    </w:p>
-  </w:footnote>
-  <w:footnote w:id="23">
-    <w:p>
-      <w:r>
-        <w:t xml:space="preserve">Repeated source: Synthesised across the eighteen-entry publisher dossier; see research/dossier_04_publis...</w:t>
-      </w:r>
-    </w:p>
-  </w:footnote>
-  <w:footnote w:id="24">
-    <w:p>
-      <w:r>
-        <w:t xml:space="preserve">Repeated source: Thirty-eight-university sample with class breakdown A=4, B=11, C=17, D=6 (Total 38) per...</w:t>
-      </w:r>
-    </w:p>
-  </w:footnote>
-  <w:footnote w:id="25">
     <w:p>
       <w:pPr>
         <w:pStyle w:val="FootnoteText"/>
@@ -10136,63 +10075,158 @@
       </w:r>
       <w:r>
         <w:rPr/>
-        <w:t xml:space="preserve">Synthesised across the thirteen-entry competency-frameworks dossier covering UNESCO AI Competency Frameworks for Students and Teachers, the OECD-EC AILit Framework, DigComp 2.2, the Jisc digital-capability and Strategic AI frameworks, the EDUCAUSE Horizon Action Plan and 2024 AI Landscape Study, the Vitae UK Researcher Development Framework, the Council of Graduate Schools and INRS Global Action Agenda, the European University Association statements, the US National Academies / PNAS editorial, TEQSA, the Russell Group Principles, and the Digital Education Council framework. See </w:t>
-      </w:r>
-      <w:r>
-        <w:rPr>
-          <w:rStyle w:val="VerbatimChar"/>
-        </w:rPr>
-        <w:t>research/dossier_03_competency_frameworks.md</w:t>
-      </w:r>
-      <w:r>
-        <w:rPr/>
-        <w:t>.</w:t>
+        <w:t>Class D institutional documents: - UCL Doctoral School, “Transparency on Authorship and Generative AI in Doctoral Research.” URL: https://www.ucl.ac.uk/study/doctoral-school/regulations/essential-procedures-and-policies/transparency-authorship-and-generative-ai-doctoral-research · snapshotted 2026-05-18. - KCL, “Generative AI: Guidance for doctoral students, supervisors and examiners.” URL: https://www.kcl.ac.uk/about/strategy/learning-and-teaching/ai-guidance/doctoral-assessment · snapshotted 2026-05-18. - Heidelberg University Graduate Academy, AI in doctoral research. URL: https://www.graduateacademy.uni-heidelberg.de/promovieren/ai_en.html · snapshotted 2026-05-18. - KU Leuven, “Use of generative AI when writing your doctoral thesis.” URL: https://www.kuleuven.be/genai/documenten/generative-ai-and-doctoral-thesis.pdf · snapshotted 2026-05-18. - University of Helsinki, AI in research guidelines. URL: https://www.helsinki.fi/en/research/research-integrity/ai-research · snapshotted 2026-05-18. - Tsinghua University, AI framework December 2025 (English-language summary). URL: https://www.prnewswire.com/news-releases/tsinghua-university-releases-the-first-university-wide-framework-governing-ai-in-teaching-and-research-302628933.html · snapshotted 2026-05-18.</w:t>
+      </w:r>
+    </w:p>
+  </w:footnote>
+  <w:footnote w:id="19">
+    <w:p>
+      <w:pPr>
+        <w:pStyle w:val="FootnoteText"/>
+      </w:pPr>
+      <w:r>
+        <w:rPr>
+          <w:rStyle w:val="FootnoteCharacters"/>
+        </w:rPr>
+        <w:footnoteRef/>
+      </w:r>
+      <w:r>
+        <w:rPr/>
+        <w:t xml:space="preserve"> </w:t>
+      </w:r>
+      <w:r>
+        <w:rPr/>
+        <w:t xml:space="preserve">As cited above: ARC / NHMRC, joint policy on the use of generative AI in grant applications and assessment, effective 28 April 2026. URLs…</w:t>
+      </w:r>
+    </w:p>
+  </w:footnote>
+  <w:footnote w:id="20">
+    <w:p>
+      <w:pPr>
+        <w:pStyle w:val="FootnoteText"/>
+      </w:pPr>
+      <w:r>
+        <w:rPr>
+          <w:rStyle w:val="FootnoteCharacters"/>
+        </w:rPr>
+        <w:footnoteRef/>
+      </w:r>
+      <w:r>
+        <w:rPr/>
+        <w:t xml:space="preserve"> </w:t>
+      </w:r>
+      <w:r>
+        <w:rPr/>
+        <w:t xml:space="preserve">As cited above: Synthesised across the eighteen-entry publisher-policy dossier (research/dossier_04_publisher_policies.md).</w:t>
+      </w:r>
+    </w:p>
+  </w:footnote>
+  <w:footnote w:id="21">
+    <w:p>
+      <w:pPr>
+        <w:pStyle w:val="FootnoteText"/>
+      </w:pPr>
+      <w:r>
+        <w:rPr>
+          <w:rStyle w:val="FootnoteCharacters"/>
+        </w:rPr>
+        <w:footnoteRef/>
+      </w:r>
+      <w:r>
+        <w:rPr/>
+        <w:t xml:space="preserve"> </w:t>
+      </w:r>
+      <w:r>
+        <w:rPr/>
+        <w:t xml:space="preserve">As cited above: Blau, W. et al., “Protecting scientific integrity in an age of generative AI,” PNAS, 21 May 2024. DOI: 10.1073/pnas.2407886121. URL…</w:t>
+      </w:r>
+    </w:p>
+  </w:footnote>
+  <w:footnote w:id="22">
+    <w:p>
+      <w:pPr>
+        <w:pStyle w:val="FootnoteText"/>
+      </w:pPr>
+      <w:r>
+        <w:rPr>
+          <w:rStyle w:val="FootnoteCharacters"/>
+        </w:rPr>
+        <w:footnoteRef/>
+      </w:r>
+      <w:r>
+        <w:rPr/>
+        <w:t xml:space="preserve"> </w:t>
+      </w:r>
+      <w:r>
+        <w:rPr/>
+        <w:t xml:space="preserve">As cited above: Thirty-eight-university sample; class distribution A=4, B=11, C=17, D=6 (38 total), from the per-institution policy classifications in the…</w:t>
+      </w:r>
+    </w:p>
+  </w:footnote>
+  <w:footnote w:id="23">
+    <w:p>
+      <w:pPr>
+        <w:pStyle w:val="FootnoteText"/>
+      </w:pPr>
+      <w:r>
+        <w:rPr>
+          <w:rStyle w:val="FootnoteCharacters"/>
+        </w:rPr>
+        <w:footnoteRef/>
+      </w:r>
+      <w:r>
+        <w:rPr/>
+        <w:t xml:space="preserve"> </w:t>
+      </w:r>
+      <w:r>
+        <w:rPr/>
+        <w:t xml:space="preserve">As cited above: Synthesised across the fourteen-entry national-funder dossier; see research/dossier_01_national_funders.md.</w:t>
+      </w:r>
+    </w:p>
+  </w:footnote>
+  <w:footnote w:id="24">
+    <w:p>
+      <w:pPr>
+        <w:pStyle w:val="FootnoteText"/>
+      </w:pPr>
+      <w:r>
+        <w:rPr>
+          <w:rStyle w:val="FootnoteCharacters"/>
+        </w:rPr>
+        <w:footnoteRef/>
+      </w:r>
+      <w:r>
+        <w:rPr/>
+        <w:t xml:space="preserve"> </w:t>
+      </w:r>
+      <w:r>
+        <w:rPr/>
+        <w:t xml:space="preserve">As cited above: Synthesised across the eighteen-entry publisher-policy dossier (research/dossier_04_publisher_policies.md).</w:t>
+      </w:r>
+    </w:p>
+  </w:footnote>
+  <w:footnote w:id="25">
+    <w:p>
+      <w:pPr>
+        <w:pStyle w:val="FootnoteText"/>
+      </w:pPr>
+      <w:r>
+        <w:rPr>
+          <w:rStyle w:val="FootnoteCharacters"/>
+        </w:rPr>
+        <w:footnoteRef/>
+      </w:r>
+      <w:r>
+        <w:rPr/>
+        <w:t xml:space="preserve"> </w:t>
+      </w:r>
+      <w:r>
+        <w:rPr/>
+        <w:t xml:space="preserve">As cited above: Thirty-eight-university sample; class distribution A=4, B=11, C=17, D=6 (38 total), from the per-institution policy classifications in the…</w:t>
       </w:r>
     </w:p>
   </w:footnote>
   <w:footnote w:id="26">
-    <w:p>
-      <w:r>
-        <w:t xml:space="preserve">Repeated source: Elsevier publisher-wide policy on the use of generative AI and AI-assisted technologies...</w:t>
-      </w:r>
-    </w:p>
-  </w:footnote>
-  <w:footnote w:id="27">
-    <w:p>
-      <w:r>
-        <w:t xml:space="preserve">Repeated source: JAMA Network policy on the use of AI in scholarly publication, formal Guidance issued 2...</w:t>
-      </w:r>
-    </w:p>
-  </w:footnote>
-  <w:footnote w:id="28">
-    <w:p>
-      <w:r>
-        <w:t xml:space="preserve">Repeated source: Public Library of Science, “The promise and perils of AI use in peer review,” The PLOS...</w:t>
-      </w:r>
-    </w:p>
-  </w:footnote>
-  <w:footnote w:id="29">
-    <w:p>
-      <w:r>
-        <w:t xml:space="preserve">Repeated source: Council of Graduate Schools and Institut national de la recherche scientifique, Global...</w:t>
-      </w:r>
-    </w:p>
-  </w:footnote>
-  <w:footnote w:id="30">
-    <w:p>
-      <w:r>
-        <w:t xml:space="preserve">Repeated source: Synthesised across the fourteen-entry national-funder dossier; see research/dossier_01_...</w:t>
-      </w:r>
-    </w:p>
-  </w:footnote>
-  <w:footnote w:id="31">
-    <w:p>
-      <w:r>
-        <w:t xml:space="preserve">Repeated source: Synthesised across the thirteen-entry competency-frameworks dossier covering UNESCO AI...</w:t>
-      </w:r>
-    </w:p>
-  </w:footnote>
-  <w:footnote w:id="32">
     <w:p>
       <w:pPr>
         <w:pStyle w:val="FootnoteText"/>
@@ -10214,17 +10248,143 @@
       </w:r>
       <w:r>
         <w:rPr/>
-        <w:t xml:space="preserve">Synthesised across the eleven-class AI tool taxonomy dossier; see </w:t>
+        <w:t xml:space="preserve">Synthesised across the thirteen-entry competency-frameworks dossier covering UNESCO AI Competency Frameworks for Students and Teachers, the OECD-EC AILit Framework, DigComp 2.2, the Jisc digital-capability and Strategic AI frameworks, the EDUCAUSE Horizon Action Plan and 2024 AI Landscape Study, the Vitae UK Researcher Development Framework, the Council of Graduate Schools and INRS Global Action Agenda, the European University Association statements, the US National Academies / PNAS editorial, TEQSA, the Russell Group Principles, and the Digital Education Council framework. See </w:t>
       </w:r>
       <w:r>
         <w:rPr>
           <w:rStyle w:val="VerbatimChar"/>
         </w:rPr>
-        <w:t>research/dossier_05_ai_tool_taxonomy.md</w:t>
-      </w:r>
-      <w:r>
-        <w:rPr/>
-        <w:t xml:space="preserve"> and Appendix C of this report. The 8 mandatory classes plus 3 optional classes (image/figure generation, voice/transcription, AI-detection) populate the matrix the dimension’s procurement test references.</w:t>
+        <w:t>research/dossier_03_competency_frameworks.md</w:t>
+      </w:r>
+      <w:r>
+        <w:rPr/>
+        <w:t>.</w:t>
+      </w:r>
+    </w:p>
+  </w:footnote>
+  <w:footnote w:id="27">
+    <w:p>
+      <w:pPr>
+        <w:pStyle w:val="FootnoteText"/>
+      </w:pPr>
+      <w:r>
+        <w:rPr>
+          <w:rStyle w:val="FootnoteCharacters"/>
+        </w:rPr>
+        <w:footnoteRef/>
+      </w:r>
+      <w:r>
+        <w:rPr/>
+        <w:t xml:space="preserve"> </w:t>
+      </w:r>
+      <w:r>
+        <w:rPr/>
+        <w:t xml:space="preserve">As cited above: Elsevier publisher-wide policy on the use of generative AI and AI-assisted technologies in scientific writing. URL…</w:t>
+      </w:r>
+    </w:p>
+  </w:footnote>
+  <w:footnote w:id="28">
+    <w:p>
+      <w:pPr>
+        <w:pStyle w:val="FootnoteText"/>
+      </w:pPr>
+      <w:r>
+        <w:rPr>
+          <w:rStyle w:val="FootnoteCharacters"/>
+        </w:rPr>
+        <w:footnoteRef/>
+      </w:r>
+      <w:r>
+        <w:rPr/>
+        <w:t xml:space="preserve"> </w:t>
+      </w:r>
+      <w:r>
+        <w:rPr/>
+        <w:t xml:space="preserve">As cited above: JAMA Network policy on the use of AI in scholarly publication, formal Guidance issued 27 July 2023. URL…</w:t>
+      </w:r>
+    </w:p>
+  </w:footnote>
+  <w:footnote w:id="29">
+    <w:p>
+      <w:pPr>
+        <w:pStyle w:val="FootnoteText"/>
+      </w:pPr>
+      <w:r>
+        <w:rPr>
+          <w:rStyle w:val="FootnoteCharacters"/>
+        </w:rPr>
+        <w:footnoteRef/>
+      </w:r>
+      <w:r>
+        <w:rPr/>
+        <w:t xml:space="preserve"> </w:t>
+      </w:r>
+      <w:r>
+        <w:rPr/>
+        <w:t xml:space="preserve">As cited above: Public Library of Science, “The promise and perils of AI use in peer review,” The PLOS Blog, September 2025. URL…</w:t>
+      </w:r>
+    </w:p>
+  </w:footnote>
+  <w:footnote w:id="30">
+    <w:p>
+      <w:pPr>
+        <w:pStyle w:val="FootnoteText"/>
+      </w:pPr>
+      <w:r>
+        <w:rPr>
+          <w:rStyle w:val="FootnoteCharacters"/>
+        </w:rPr>
+        <w:footnoteRef/>
+      </w:r>
+      <w:r>
+        <w:rPr/>
+        <w:t xml:space="preserve"> </w:t>
+      </w:r>
+      <w:r>
+        <w:rPr/>
+        <w:t xml:space="preserve">As cited above: Council of Graduate Schools and Institut national de la recherche scientifique, Global Action Agenda for Using AI to Improve Graduate Education and…</w:t>
+      </w:r>
+    </w:p>
+  </w:footnote>
+  <w:footnote w:id="31">
+    <w:p>
+      <w:pPr>
+        <w:pStyle w:val="FootnoteText"/>
+      </w:pPr>
+      <w:r>
+        <w:rPr>
+          <w:rStyle w:val="FootnoteCharacters"/>
+        </w:rPr>
+        <w:footnoteRef/>
+      </w:r>
+      <w:r>
+        <w:rPr/>
+        <w:t xml:space="preserve"> </w:t>
+      </w:r>
+      <w:r>
+        <w:rPr/>
+        <w:t xml:space="preserve">As cited above: Synthesised across the fourteen-entry national-funder dossier; see research/dossier_01_national_funders.md.</w:t>
+      </w:r>
+    </w:p>
+  </w:footnote>
+  <w:footnote w:id="32">
+    <w:p>
+      <w:pPr>
+        <w:pStyle w:val="FootnoteText"/>
+      </w:pPr>
+      <w:r>
+        <w:rPr>
+          <w:rStyle w:val="FootnoteCharacters"/>
+        </w:rPr>
+        <w:footnoteRef/>
+      </w:r>
+      <w:r>
+        <w:rPr/>
+        <w:t xml:space="preserve"> </w:t>
+      </w:r>
+      <w:r>
+        <w:rPr/>
+        <w:t xml:space="preserve">As cited above: Synthesised across the thirteen-entry competency-frameworks dossier covering UNESCO AI Competency Frameworks for Students and Teachers, the OECD-EC…</w:t>
       </w:r>
     </w:p>
   </w:footnote>
@@ -10250,18 +10410,17 @@
       </w:r>
       <w:r>
         <w:rPr/>
-        <w:t xml:space="preserve">Walters, W. H., &amp; Wilder, E. I. (2023). “Fabrication and errors in the bibliographic citations generated by ChatGPT.” </w:t>
-      </w:r>
-      <w:r>
-        <w:rPr>
-          <w:i/>
-          <w:iCs/>
-        </w:rPr>
-        <w:t>Scientific Reports</w:t>
-      </w:r>
-      <w:r>
-        <w:rPr/>
-        <w:t>, 13:14045. DOI: 10.1038/s41598-023-41032-5. URL: https://www.nature.com/articles/s41598-023-41032-5 · snapshotted 2026-05-18.</w:t>
+        <w:t xml:space="preserve">Synthesised across the eleven-class AI tool taxonomy dossier; see </w:t>
+      </w:r>
+      <w:r>
+        <w:rPr>
+          <w:rStyle w:val="VerbatimChar"/>
+        </w:rPr>
+        <w:t>research/dossier_05_ai_tool_taxonomy.md</w:t>
+      </w:r>
+      <w:r>
+        <w:rPr/>
+        <w:t xml:space="preserve"> and Appendix C of this report. The 8 mandatory classes plus 3 optional classes (image/figure generation, voice/transcription, AI-detection) populate the matrix the dimension’s procurement test references.</w:t>
       </w:r>
     </w:p>
   </w:footnote>
@@ -10287,7 +10446,18 @@
       </w:r>
       <w:r>
         <w:rPr/>
-        <w:t>Jaźwińska, K., &amp; Chandrasekar, A. (2025). “AI Search Has A Citation Problem.” Tow Center for Digital Journalism, 6 March 2025. Eight consumer AI search engines, 1,600 queries, collective error rate above 60 per cent. URL: https://www.cjr.org/tow_center/we-compared-eight-ai-search-engines-theyre-all-bad-at-citing-news.php · snapshotted 2026-05-18.</w:t>
+        <w:t xml:space="preserve">Walters, W. H., &amp; Wilder, E. I. (2023). “Fabrication and errors in the bibliographic citations generated by ChatGPT.” </w:t>
+      </w:r>
+      <w:r>
+        <w:rPr>
+          <w:i/>
+          <w:iCs/>
+        </w:rPr>
+        <w:t>Scientific Reports</w:t>
+      </w:r>
+      <w:r>
+        <w:rPr/>
+        <w:t>, 13:14045. DOI: 10.1038/s41598-023-41032-5. URL: https://www.nature.com/articles/s41598-023-41032-5 · snapshotted 2026-05-18.</w:t>
       </w:r>
     </w:p>
   </w:footnote>
@@ -10313,29 +10483,7 @@
       </w:r>
       <w:r>
         <w:rPr/>
-        <w:t xml:space="preserve">Huang, J., </w:t>
-      </w:r>
-      <w:r>
-        <w:rPr>
-          <w:i/>
-          <w:iCs/>
-        </w:rPr>
-        <w:t>et al.</w:t>
-      </w:r>
-      <w:r>
-        <w:rPr/>
-        <w:t xml:space="preserve"> (2024). “Large Language Models Cannot Self-Correct Reasoning Yet.” </w:t>
-      </w:r>
-      <w:r>
-        <w:rPr>
-          <w:i/>
-          <w:iCs/>
-        </w:rPr>
-        <w:t>Transactions of the Association for Computational Linguistics</w:t>
-      </w:r>
-      <w:r>
-        <w:rPr/>
-        <w:t>, 12. DOI: 10.1162/tacl_a_00713. URL: https://aclanthology.org/2024.tacl-1.43/ · snapshotted 2026-05-18.</w:t>
+        <w:t>Jaźwińska, K., &amp; Chandrasekar, A. (2025). “AI Search Has A Citation Problem.” Tow Center for Digital Journalism, 6 March 2025. Eight consumer AI search engines, 1,600 queries, collective error rate above 60 per cent. URL: https://www.cjr.org/tow_center/we-compared-eight-ai-search-engines-theyre-all-bad-at-citing-news.php · snapshotted 2026-05-18.</w:t>
       </w:r>
     </w:p>
   </w:footnote>
@@ -10361,18 +10509,33 @@
       </w:r>
       <w:r>
         <w:rPr/>
-        <w:t>Wynn, S., Satija, T., &amp; Hadfield, G. (2025). “Talk Isn’t Always Cheap: Understanding Failure Modes in Multi-Agent Debate.” arXiv 2509.05396, September 2025. URL: https://arxiv.org/abs/2509.05396 · snapshotted 2026-05-18.</w:t>
+        <w:t xml:space="preserve">Huang, J., </w:t>
+      </w:r>
+      <w:r>
+        <w:rPr>
+          <w:i/>
+          <w:iCs/>
+        </w:rPr>
+        <w:t>et al.</w:t>
+      </w:r>
+      <w:r>
+        <w:rPr/>
+        <w:t xml:space="preserve"> (2024). “Large Language Models Cannot Self-Correct Reasoning Yet.” </w:t>
+      </w:r>
+      <w:r>
+        <w:rPr>
+          <w:i/>
+          <w:iCs/>
+        </w:rPr>
+        <w:t>Transactions of the Association for Computational Linguistics</w:t>
+      </w:r>
+      <w:r>
+        <w:rPr/>
+        <w:t>, 12. DOI: 10.1162/tacl_a_00713. URL: https://aclanthology.org/2024.tacl-1.43/ · snapshotted 2026-05-18.</w:t>
       </w:r>
     </w:p>
   </w:footnote>
   <w:footnote w:id="37">
-    <w:p>
-      <w:r>
-        <w:t xml:space="preserve">Repeated source: Synthesised across the eleven-class AI tool taxonomy dossier; see research/dossier_05_a...</w:t>
-      </w:r>
-    </w:p>
-  </w:footnote>
-  <w:footnote w:id="38">
     <w:p>
       <w:pPr>
         <w:pStyle w:val="FootnoteText"/>
@@ -10394,18 +10557,32 @@
       </w:r>
       <w:r>
         <w:rPr/>
-        <w:t>Magesh, V., Surani, F., Dahl, M., Suzgun, M., Manning, C. D., &amp; Ho, D. E. (2024). “Hallucination-Free? Assessing the Reliability of Leading AI Legal Research Tools.” Stanford RegLab + HAI, 30 May 2024. Preregistered evaluation of Westlaw AI-Assisted Research, Lexis+ AI, and Thomson Reuters Ask Practical Law AI; 17 to 33 per cent hallucination across all three despite vendor “hallucination-free” marketing. URL: https://reglab.stanford.edu/publications/hallucinating-law/ · snapshotted 2026-05-18.</w:t>
+        <w:t>Wynn, S., Satija, T., &amp; Hadfield, G. (2025). “Talk Isn’t Always Cheap: Understanding Failure Modes in Multi-Agent Debate.” arXiv 2509.05396, September 2025. URL: https://arxiv.org/abs/2509.05396 · snapshotted 2026-05-18.</w:t>
+      </w:r>
+    </w:p>
+  </w:footnote>
+  <w:footnote w:id="38">
+    <w:p>
+      <w:pPr>
+        <w:pStyle w:val="FootnoteText"/>
+      </w:pPr>
+      <w:r>
+        <w:rPr>
+          <w:rStyle w:val="FootnoteCharacters"/>
+        </w:rPr>
+        <w:footnoteRef/>
+      </w:r>
+      <w:r>
+        <w:rPr/>
+        <w:t xml:space="preserve"> </w:t>
+      </w:r>
+      <w:r>
+        <w:rPr/>
+        <w:t xml:space="preserve">As cited above: Synthesised across the eleven-class AI tool taxonomy dossier; see research/dossier_05_ai_tool_taxonomy.md and Appendix C of this report. The 8…</w:t>
       </w:r>
     </w:p>
   </w:footnote>
   <w:footnote w:id="39">
-    <w:p>
-      <w:r>
-        <w:t xml:space="preserve">Repeated source: Jaźwińska, K., &amp;amp; Chandrasekar, A. (2025). “AI Search Has A Citation Problem.” Tow C...</w:t>
-      </w:r>
-    </w:p>
-  </w:footnote>
-  <w:footnote w:id="40">
     <w:p>
       <w:pPr>
         <w:pStyle w:val="FootnoteText"/>
@@ -10427,40 +10604,28 @@
       </w:r>
       <w:r>
         <w:rPr/>
-        <w:t xml:space="preserve">Samsung Electronics ban on consumer generative AI in the workplace, May 2023, following three confidential-data leaks (semiconductor source code, equipment defect-detection algorithms, transcribed internal meeting) inside 20 days. Coverage at </w:t>
-      </w:r>
-      <w:r>
-        <w:rPr>
-          <w:i/>
-          <w:iCs/>
-        </w:rPr>
-        <w:t>Bloomberg</w:t>
-      </w:r>
-      <w:r>
-        <w:rPr/>
-        <w:t xml:space="preserve"> 1 May 2023; </w:t>
-      </w:r>
-      <w:r>
-        <w:rPr>
-          <w:i/>
-          <w:iCs/>
-        </w:rPr>
-        <w:t>Forbes</w:t>
-      </w:r>
-      <w:r>
-        <w:rPr/>
-        <w:t xml:space="preserve"> 2 May 2023; </w:t>
-      </w:r>
-      <w:r>
-        <w:rPr>
-          <w:i/>
-          <w:iCs/>
-        </w:rPr>
-        <w:t>Reuters</w:t>
-      </w:r>
-      <w:r>
-        <w:rPr/>
-        <w:t xml:space="preserve"> 2 May 2023. URL: https://www.bloomberg.com/news/articles/2023-05-02/samsung-bans-chatgpt-and-other-generative-ai-use-by-staff-after-leak · snapshotted 2026-05-18.</w:t>
+        <w:t>Magesh, V., Surani, F., Dahl, M., Suzgun, M., Manning, C. D., &amp; Ho, D. E. (2024). “Hallucination-Free? Assessing the Reliability of Leading AI Legal Research Tools.” Stanford RegLab + HAI, 30 May 2024. Preregistered evaluation of Westlaw AI-Assisted Research, Lexis+ AI, and Thomson Reuters Ask Practical Law AI; 17 to 33 per cent hallucination across all three despite vendor “hallucination-free” marketing. URL: https://reglab.stanford.edu/publications/hallucinating-law/ · snapshotted 2026-05-18.</w:t>
+      </w:r>
+    </w:p>
+  </w:footnote>
+  <w:footnote w:id="40">
+    <w:p>
+      <w:pPr>
+        <w:pStyle w:val="FootnoteText"/>
+      </w:pPr>
+      <w:r>
+        <w:rPr>
+          <w:rStyle w:val="FootnoteCharacters"/>
+        </w:rPr>
+        <w:footnoteRef/>
+      </w:r>
+      <w:r>
+        <w:rPr/>
+        <w:t xml:space="preserve"> </w:t>
+      </w:r>
+      <w:r>
+        <w:rPr/>
+        <w:t xml:space="preserve">As cited above: Jaźwińska, K., &amp;amp; Chandrasekar, A. (2025). “AI Search Has A Citation Problem.” Tow Center for Digital Journalism, 6 March 2025. Eight consumer AI…</w:t>
       </w:r>
     </w:p>
   </w:footnote>
@@ -10486,29 +10651,40 @@
       </w:r>
       <w:r>
         <w:rPr/>
-        <w:t xml:space="preserve">Terwilliger, T. C., </w:t>
+        <w:t xml:space="preserve">Samsung Electronics ban on consumer generative AI in the workplace, May 2023, following three confidential-data leaks (semiconductor source code, equipment defect-detection algorithms, transcribed internal meeting) inside 20 days. Coverage at </w:t>
       </w:r>
       <w:r>
         <w:rPr>
           <w:i/>
           <w:iCs/>
         </w:rPr>
-        <w:t>et al.</w:t>
-      </w:r>
-      <w:r>
-        <w:rPr/>
-        <w:t xml:space="preserve"> (2024). “AlphaFold predictions are valuable hypotheses and accelerate but do not replace experimental structure determination.” </w:t>
+        <w:t>Bloomberg</w:t>
+      </w:r>
+      <w:r>
+        <w:rPr/>
+        <w:t xml:space="preserve"> 1 May 2023; </w:t>
       </w:r>
       <w:r>
         <w:rPr>
           <w:i/>
           <w:iCs/>
         </w:rPr>
-        <w:t>Nature Methods</w:t>
-      </w:r>
-      <w:r>
-        <w:rPr/>
-        <w:t>, 21(1):110-116. DOI: 10.1038/s41592-023-02087-4. Per-Cα error rates by pLDDT confidence band: ~10 per cent in error by over 2 Å at pLDDT over 90; 22 per cent at 80-90; 33 per cent at 70-80; 77 per cent at under 70. URL: https://www.nature.com/articles/s41592-023-02087-4 · snapshotted 2026-05-18.</w:t>
+        <w:t>Forbes</w:t>
+      </w:r>
+      <w:r>
+        <w:rPr/>
+        <w:t xml:space="preserve"> 2 May 2023; </w:t>
+      </w:r>
+      <w:r>
+        <w:rPr>
+          <w:i/>
+          <w:iCs/>
+        </w:rPr>
+        <w:t>Reuters</w:t>
+      </w:r>
+      <w:r>
+        <w:rPr/>
+        <w:t xml:space="preserve"> 2 May 2023. URL: https://www.bloomberg.com/news/articles/2023-05-02/samsung-bans-chatgpt-and-other-generative-ai-use-by-staff-after-leak · snapshotted 2026-05-18.</w:t>
       </w:r>
     </w:p>
   </w:footnote>
@@ -10534,127 +10710,29 @@
       </w:r>
       <w:r>
         <w:rPr/>
-        <w:t xml:space="preserve">Synthesised from the reproducibility-crisis intersection dossier; see </w:t>
-      </w:r>
-      <w:r>
-        <w:rPr>
-          <w:rStyle w:val="VerbatimChar"/>
-        </w:rPr>
-        <w:t>research/dossier_07_reproducibility_intersection.md</w:t>
-      </w:r>
-      <w:r>
-        <w:rPr/>
-        <w:t xml:space="preserve">. The pre-AI anchor draws on Ioannidis (2005, </w:t>
+        <w:t xml:space="preserve">Terwilliger, T. C., </w:t>
       </w:r>
       <w:r>
         <w:rPr>
           <w:i/>
           <w:iCs/>
         </w:rPr>
-        <w:t>PLOS Medicine</w:t>
-      </w:r>
-      <w:r>
-        <w:rPr/>
-        <w:t xml:space="preserve">), Open Science Collaboration (2015, </w:t>
+        <w:t>et al.</w:t>
+      </w:r>
+      <w:r>
+        <w:rPr/>
+        <w:t xml:space="preserve"> (2024). “AlphaFold predictions are valuable hypotheses and accelerate but do not replace experimental structure determination.” </w:t>
       </w:r>
       <w:r>
         <w:rPr>
           <w:i/>
           <w:iCs/>
         </w:rPr>
-        <w:t>Science</w:t>
-      </w:r>
-      <w:r>
-        <w:rPr/>
-        <w:t xml:space="preserve"> 349:aac4716), Begley and Ellis (2012, </w:t>
-      </w:r>
-      <w:r>
-        <w:rPr>
-          <w:i/>
-          <w:iCs/>
-        </w:rPr>
-        <w:t>Nature</w:t>
-      </w:r>
-      <w:r>
-        <w:rPr/>
-        <w:t xml:space="preserve"> 483:531-533), Errington </w:t>
-      </w:r>
-      <w:r>
-        <w:rPr>
-          <w:i/>
-          <w:iCs/>
-        </w:rPr>
-        <w:t>et al.</w:t>
-      </w:r>
-      <w:r>
-        <w:rPr/>
-        <w:t xml:space="preserve"> (2021, </w:t>
-      </w:r>
-      <w:r>
-        <w:rPr>
-          <w:i/>
-          <w:iCs/>
-        </w:rPr>
-        <w:t>eLife</w:t>
-      </w:r>
-      <w:r>
-        <w:rPr/>
-        <w:t xml:space="preserve">), Camerer </w:t>
-      </w:r>
-      <w:r>
-        <w:rPr>
-          <w:i/>
-          <w:iCs/>
-        </w:rPr>
-        <w:t>et al.</w:t>
-      </w:r>
-      <w:r>
-        <w:rPr/>
-        <w:t xml:space="preserve"> (2018, </w:t>
-      </w:r>
-      <w:r>
-        <w:rPr>
-          <w:i/>
-          <w:iCs/>
-        </w:rPr>
-        <w:t>Nature Human Behaviour</w:t>
-      </w:r>
-      <w:r>
-        <w:rPr/>
-        <w:t xml:space="preserve"> 2:637-644), Many Labs 1-3, Voelkl </w:t>
-      </w:r>
-      <w:r>
-        <w:rPr>
-          <w:i/>
-          <w:iCs/>
-        </w:rPr>
-        <w:t>et al.</w:t>
-      </w:r>
-      <w:r>
-        <w:rPr/>
-        <w:t xml:space="preserve"> (2018, </w:t>
-      </w:r>
-      <w:r>
-        <w:rPr>
-          <w:i/>
-          <w:iCs/>
-        </w:rPr>
-        <w:t>PLOS Biology</w:t>
-      </w:r>
-      <w:r>
-        <w:rPr/>
-        <w:t xml:space="preserve">), and Bouter / Gopalakrishna (2022, </w:t>
-      </w:r>
-      <w:r>
-        <w:rPr>
-          <w:i/>
-          <w:iCs/>
-        </w:rPr>
-        <w:t>PLOS ONE</w:t>
-      </w:r>
-      <w:r>
-        <w:rPr/>
-        <w:t>). The AI intersection draws on the multiplier-side §7a-§7i and the solver-side §7j-§7n.</w:t>
+        <w:t>Nature Methods</w:t>
+      </w:r>
+      <w:r>
+        <w:rPr/>
+        <w:t>, 21(1):110-116. DOI: 10.1038/s41592-023-02087-4. Per-Cα error rates by pLDDT confidence band: ~10 per cent in error by over 2 Å at pLDDT over 90; 22 per cent at 80-90; 33 per cent at 70-80; 77 per cent at under 70. URL: https://www.nature.com/articles/s41592-023-02087-4 · snapshotted 2026-05-18.</w:t>
       </w:r>
     </w:p>
   </w:footnote>
@@ -10680,7 +10758,127 @@
       </w:r>
       <w:r>
         <w:rPr/>
-        <w:t>European Data Protection Board, Opinion 28/2024 on certain data protection aspects related to the processing of personal data in the context of AI models, 17 December 2024. URL: https://www.edpb.europa.eu/system/files/2024-12/edpb_opinion_202428_ai-models_en.pdf · snapshotted 2026-05-18.</w:t>
+        <w:t xml:space="preserve">Synthesised from the reproducibility-crisis intersection dossier; see </w:t>
+      </w:r>
+      <w:r>
+        <w:rPr>
+          <w:rStyle w:val="VerbatimChar"/>
+        </w:rPr>
+        <w:t>research/dossier_07_reproducibility_intersection.md</w:t>
+      </w:r>
+      <w:r>
+        <w:rPr/>
+        <w:t xml:space="preserve">. The pre-AI anchor draws on Ioannidis (2005, </w:t>
+      </w:r>
+      <w:r>
+        <w:rPr>
+          <w:i/>
+          <w:iCs/>
+        </w:rPr>
+        <w:t>PLOS Medicine</w:t>
+      </w:r>
+      <w:r>
+        <w:rPr/>
+        <w:t xml:space="preserve">), Open Science Collaboration (2015, </w:t>
+      </w:r>
+      <w:r>
+        <w:rPr>
+          <w:i/>
+          <w:iCs/>
+        </w:rPr>
+        <w:t>Science</w:t>
+      </w:r>
+      <w:r>
+        <w:rPr/>
+        <w:t xml:space="preserve"> 349:aac4716), Begley and Ellis (2012, </w:t>
+      </w:r>
+      <w:r>
+        <w:rPr>
+          <w:i/>
+          <w:iCs/>
+        </w:rPr>
+        <w:t>Nature</w:t>
+      </w:r>
+      <w:r>
+        <w:rPr/>
+        <w:t xml:space="preserve"> 483:531-533), Errington </w:t>
+      </w:r>
+      <w:r>
+        <w:rPr>
+          <w:i/>
+          <w:iCs/>
+        </w:rPr>
+        <w:t>et al.</w:t>
+      </w:r>
+      <w:r>
+        <w:rPr/>
+        <w:t xml:space="preserve"> (2021, </w:t>
+      </w:r>
+      <w:r>
+        <w:rPr>
+          <w:i/>
+          <w:iCs/>
+        </w:rPr>
+        <w:t>eLife</w:t>
+      </w:r>
+      <w:r>
+        <w:rPr/>
+        <w:t xml:space="preserve">), Camerer </w:t>
+      </w:r>
+      <w:r>
+        <w:rPr>
+          <w:i/>
+          <w:iCs/>
+        </w:rPr>
+        <w:t>et al.</w:t>
+      </w:r>
+      <w:r>
+        <w:rPr/>
+        <w:t xml:space="preserve"> (2018, </w:t>
+      </w:r>
+      <w:r>
+        <w:rPr>
+          <w:i/>
+          <w:iCs/>
+        </w:rPr>
+        <w:t>Nature Human Behaviour</w:t>
+      </w:r>
+      <w:r>
+        <w:rPr/>
+        <w:t xml:space="preserve"> 2:637-644), Many Labs 1-3, Voelkl </w:t>
+      </w:r>
+      <w:r>
+        <w:rPr>
+          <w:i/>
+          <w:iCs/>
+        </w:rPr>
+        <w:t>et al.</w:t>
+      </w:r>
+      <w:r>
+        <w:rPr/>
+        <w:t xml:space="preserve"> (2018, </w:t>
+      </w:r>
+      <w:r>
+        <w:rPr>
+          <w:i/>
+          <w:iCs/>
+        </w:rPr>
+        <w:t>PLOS Biology</w:t>
+      </w:r>
+      <w:r>
+        <w:rPr/>
+        <w:t xml:space="preserve">), and Bouter / Gopalakrishna (2022, </w:t>
+      </w:r>
+      <w:r>
+        <w:rPr>
+          <w:i/>
+          <w:iCs/>
+        </w:rPr>
+        <w:t>PLOS ONE</w:t>
+      </w:r>
+      <w:r>
+        <w:rPr/>
+        <w:t>). The AI intersection draws on the multiplier-side §7a-§7i and the solver-side §7j-§7n.</w:t>
       </w:r>
     </w:p>
   </w:footnote>
@@ -10706,7 +10904,7 @@
       </w:r>
       <w:r>
         <w:rPr/>
-        <w:t>Commission Nationale de l’Informatique et des Libertés (CNIL). “AI system development: CNIL’s recommendations to comply with the GDPR.” 19 June 2025. URL: https://www.cnil.fr/en/ai-system-development-cnils-recommendations-to-comply-gdpr · snapshotted 2026-05-18.</w:t>
+        <w:t>European Data Protection Board, Opinion 28/2024 on certain data protection aspects related to the processing of personal data in the context of AI models, 17 December 2024. URL: https://www.edpb.europa.eu/system/files/2024-12/edpb_opinion_202428_ai-models_en.pdf · snapshotted 2026-05-18.</w:t>
       </w:r>
     </w:p>
   </w:footnote>
@@ -10732,18 +10930,11 @@
       </w:r>
       <w:r>
         <w:rPr/>
-        <w:t>Regulation (EU) 2024/1689 of the European Parliament and of the Council of 13 June 2024 laying down harmonised rules on artificial intelligence (AI Act). Articles 2(6), 2(8), 6, 27; Annex III §3. URL: https://eur-lex.europa.eu/eli/reg/2024/1689/oj · snapshotted 2026-05-18. Article 27 Fundamental Rights Impact Assessment obligation for high-risk AI systems applies from 2 August 2026.</w:t>
+        <w:t>Commission Nationale de l’Informatique et des Libertés (CNIL). “AI system development: CNIL’s recommendations to comply with the GDPR.” 19 June 2025. URL: https://www.cnil.fr/en/ai-system-development-cnils-recommendations-to-comply-gdpr · snapshotted 2026-05-18.</w:t>
       </w:r>
     </w:p>
   </w:footnote>
   <w:footnote w:id="46">
-    <w:p>
-      <w:r>
-        <w:t xml:space="preserve">Repeated source: Synthesised across the thirteen-entry competency-frameworks dossier covering UNESCO AI...</w:t>
-      </w:r>
-    </w:p>
-  </w:footnote>
-  <w:footnote w:id="47">
     <w:p>
       <w:pPr>
         <w:pStyle w:val="FootnoteText"/>
@@ -10765,25 +10956,32 @@
       </w:r>
       <w:r>
         <w:rPr/>
-        <w:t>Russell Group. “Principles on the use of generative AI tools in education.” 3 July 2023. URL: https://www.russellgroup.ac.uk/policy/policy-briefings/principles-use-generative-ai-tools-education · snapshotted 2026-05-18.</w:t>
+        <w:t>Regulation (EU) 2024/1689 of the European Parliament and of the Council of 13 June 2024 laying down harmonised rules on artificial intelligence (AI Act). Articles 2(6), 2(8), 6, 27; Annex III §3. URL: https://eur-lex.europa.eu/eli/reg/2024/1689/oj · snapshotted 2026-05-18. Article 27 Fundamental Rights Impact Assessment obligation for high-risk AI systems applies from 2 August 2026.</w:t>
+      </w:r>
+    </w:p>
+  </w:footnote>
+  <w:footnote w:id="47">
+    <w:p>
+      <w:pPr>
+        <w:pStyle w:val="FootnoteText"/>
+      </w:pPr>
+      <w:r>
+        <w:rPr>
+          <w:rStyle w:val="FootnoteCharacters"/>
+        </w:rPr>
+        <w:footnoteRef/>
+      </w:r>
+      <w:r>
+        <w:rPr/>
+        <w:t xml:space="preserve"> </w:t>
+      </w:r>
+      <w:r>
+        <w:rPr/>
+        <w:t xml:space="preserve">As cited above: Synthesised across the thirteen-entry competency-frameworks dossier covering UNESCO AI Competency Frameworks for Students and Teachers, the OECD-EC…</w:t>
       </w:r>
     </w:p>
   </w:footnote>
   <w:footnote w:id="48">
-    <w:p>
-      <w:r>
-        <w:t xml:space="preserve">Repeated source: Synthesised from the reproducibility-crisis intersection dossier; see research/dossier_...</w:t>
-      </w:r>
-    </w:p>
-  </w:footnote>
-  <w:footnote w:id="49">
-    <w:p>
-      <w:r>
-        <w:t xml:space="preserve">Repeated source: Walters, W. H., &amp;amp; Wilder, E. I. (2023). “Fabrication and errors in the bibliographi...</w:t>
-      </w:r>
-    </w:p>
-  </w:footnote>
-  <w:footnote w:id="50">
     <w:p>
       <w:pPr>
         <w:pStyle w:val="FootnoteText"/>
@@ -10805,29 +11003,49 @@
       </w:r>
       <w:r>
         <w:rPr/>
-        <w:t xml:space="preserve">Chelli, M., </w:t>
-      </w:r>
-      <w:r>
-        <w:rPr>
-          <w:i/>
-          <w:iCs/>
-        </w:rPr>
-        <w:t>et al.</w:t>
-      </w:r>
-      <w:r>
-        <w:rPr/>
-        <w:t xml:space="preserve"> (2024). “Hallucination Rates and Reference Accuracy of ChatGPT and Bard for Systematic Reviews: Comparative Analysis.” </w:t>
-      </w:r>
-      <w:r>
-        <w:rPr>
-          <w:i/>
-          <w:iCs/>
-        </w:rPr>
-        <w:t>Journal of Medical Internet Research</w:t>
-      </w:r>
-      <w:r>
-        <w:rPr/>
-        <w:t>, 26:e53164. DOI: 10.2196/53164. URL: https://www.jmir.org/2024/1/e53164 · snapshotted 2026-05-18.</w:t>
+        <w:t>Russell Group. “Principles on the use of generative AI tools in education.” 3 July 2023. URL: https://www.russellgroup.ac.uk/policy/policy-briefings/principles-use-generative-ai-tools-education · snapshotted 2026-05-18.</w:t>
+      </w:r>
+    </w:p>
+  </w:footnote>
+  <w:footnote w:id="49">
+    <w:p>
+      <w:pPr>
+        <w:pStyle w:val="FootnoteText"/>
+      </w:pPr>
+      <w:r>
+        <w:rPr>
+          <w:rStyle w:val="FootnoteCharacters"/>
+        </w:rPr>
+        <w:footnoteRef/>
+      </w:r>
+      <w:r>
+        <w:rPr/>
+        <w:t xml:space="preserve"> </w:t>
+      </w:r>
+      <w:r>
+        <w:rPr/>
+        <w:t xml:space="preserve">As cited above: Synthesised from the reproducibility-crisis intersection dossier; see research/dossier_07_reproducibility_intersection.md. The pre-AI anchor draws on…</w:t>
+      </w:r>
+    </w:p>
+  </w:footnote>
+  <w:footnote w:id="50">
+    <w:p>
+      <w:pPr>
+        <w:pStyle w:val="FootnoteText"/>
+      </w:pPr>
+      <w:r>
+        <w:rPr>
+          <w:rStyle w:val="FootnoteCharacters"/>
+        </w:rPr>
+        <w:footnoteRef/>
+      </w:r>
+      <w:r>
+        <w:rPr/>
+        <w:t xml:space="preserve"> </w:t>
+      </w:r>
+      <w:r>
+        <w:rPr/>
+        <w:t xml:space="preserve">As cited above: Walters, W. H., &amp;amp; Wilder, E. I. (2023). “Fabrication and errors in the bibliographic citations generated by ChatGPT.” Scientific Reports…</w:t>
       </w:r>
     </w:p>
   </w:footnote>
@@ -10852,26 +11070,34 @@
         <w:t xml:space="preserve"> </w:t>
       </w:r>
       <w:r>
+        <w:rPr/>
+        <w:t xml:space="preserve">Chelli, M., </w:t>
+      </w:r>
+      <w:r>
         <w:rPr>
           <w:i/>
           <w:iCs/>
         </w:rPr>
-        <w:t>Mata v. Avianca, Inc.</w:t>
-      </w:r>
-      <w:r>
-        <w:rPr/>
-        <w:t>, 678 F. Supp. 3d 443 (S.D.N.Y. 2023), Docket No. 1:22-cv-01461. Judge P. Kevin Castel, Rule 11 sanction of $5,000 against attorneys for the submission of a brief containing six fictitious case citations generated by ChatGPT, 22 June 2023. URL: https://law.justia.com/cases/federal/district-courts/new-york/nysdce/1:2022cv01461/575368/54/ · snapshotted 2026-05-18.</w:t>
+        <w:t>et al.</w:t>
+      </w:r>
+      <w:r>
+        <w:rPr/>
+        <w:t xml:space="preserve"> (2024). “Hallucination Rates and Reference Accuracy of ChatGPT and Bard for Systematic Reviews: Comparative Analysis.” </w:t>
+      </w:r>
+      <w:r>
+        <w:rPr>
+          <w:i/>
+          <w:iCs/>
+        </w:rPr>
+        <w:t>Journal of Medical Internet Research</w:t>
+      </w:r>
+      <w:r>
+        <w:rPr/>
+        <w:t>, 26:e53164. DOI: 10.2196/53164. URL: https://www.jmir.org/2024/1/e53164 · snapshotted 2026-05-18.</w:t>
       </w:r>
     </w:p>
   </w:footnote>
   <w:footnote w:id="52">
-    <w:p>
-      <w:r>
-        <w:t xml:space="preserve">Repeated source: Synthesised from the reproducibility-crisis intersection dossier; see research/dossier_...</w:t>
-      </w:r>
-    </w:p>
-  </w:footnote>
-  <w:footnote w:id="53">
     <w:p>
       <w:pPr>
         <w:pStyle w:val="FootnoteText"/>
@@ -10889,11 +11115,39 @@
       </w:r>
       <w:r>
         <w:rPr/>
-        <w:t xml:space="preserve"> “</w:t>
-      </w:r>
-      <w:r>
-        <w:rPr/>
-        <w:t>Large Language Model Hacking: Quantifying the Hidden Risks of Using LLMs.” arXiv 2509.08825. Systematic analysis of 13 million LLM-generated labels across 18 LLMs and multiple hypothesis-testing tasks finding “LLM hacking occurs in 31-50 per cent of cases even with highly capable models.” URL: https://arxiv.org/pdf/2509.08825 · snapshotted 2026-05-18.</w:t>
+        <w:t xml:space="preserve"> </w:t>
+      </w:r>
+      <w:r>
+        <w:rPr>
+          <w:i/>
+          <w:iCs/>
+        </w:rPr>
+        <w:t>Mata v. Avianca, Inc.</w:t>
+      </w:r>
+      <w:r>
+        <w:rPr/>
+        <w:t>, 678 F. Supp. 3d 443 (S.D.N.Y. 2023), Docket No. 1:22-cv-01461. Judge P. Kevin Castel, Rule 11 sanction of $5,000 against attorneys for the submission of a brief containing six fictitious case citations generated by ChatGPT, 22 June 2023. URL: https://law.justia.com/cases/federal/district-courts/new-york/nysdce/1:2022cv01461/575368/54/ · snapshotted 2026-05-18.</w:t>
+      </w:r>
+    </w:p>
+  </w:footnote>
+  <w:footnote w:id="53">
+    <w:p>
+      <w:pPr>
+        <w:pStyle w:val="FootnoteText"/>
+      </w:pPr>
+      <w:r>
+        <w:rPr>
+          <w:rStyle w:val="FootnoteCharacters"/>
+        </w:rPr>
+        <w:footnoteRef/>
+      </w:r>
+      <w:r>
+        <w:rPr/>
+        <w:t xml:space="preserve"> </w:t>
+      </w:r>
+      <w:r>
+        <w:rPr/>
+        <w:t xml:space="preserve">As cited above: Synthesised from the reproducibility-crisis intersection dossier; see research/dossier_07_reproducibility_intersection.md. The pre-AI anchor draws on…</w:t>
       </w:r>
     </w:p>
   </w:footnote>
@@ -10915,40 +11169,15 @@
       </w:r>
       <w:r>
         <w:rPr/>
-        <w:t xml:space="preserve"> </w:t>
-      </w:r>
-      <w:r>
-        <w:rPr/>
-        <w:t xml:space="preserve">Zhang, </w:t>
-      </w:r>
-      <w:r>
-        <w:rPr>
-          <w:i/>
-          <w:iCs/>
-        </w:rPr>
-        <w:t>et al.</w:t>
-      </w:r>
-      <w:r>
-        <w:rPr/>
-        <w:t xml:space="preserve"> (2025). “Stop Overvaluing Multi-Agent Debate: A Systematic Re-examination.” arXiv 2502.08788. Five debate methods, nine benchmarks, four foundational models; multi-agent debate “often fail[s] to outperform simple single-agent baselines such as Chain-of-Thought and Self-Consistency.” Model heterogeneity identified as the “universal antidote.” URL: https://arxiv.org/abs/2502.08788 · snapshotted 2026-05-18.</w:t>
+        <w:t xml:space="preserve"> “</w:t>
+      </w:r>
+      <w:r>
+        <w:rPr/>
+        <w:t>Large Language Model Hacking: Quantifying the Hidden Risks of Using LLMs.” arXiv 2509.08825. Systematic analysis of 13 million LLM-generated labels across 18 LLMs and multiple hypothesis-testing tasks finding “LLM hacking occurs in 31-50 per cent of cases even with highly capable models.” URL: https://arxiv.org/pdf/2509.08825 · snapshotted 2026-05-18.</w:t>
       </w:r>
     </w:p>
   </w:footnote>
   <w:footnote w:id="55">
-    <w:p>
-      <w:r>
-        <w:t xml:space="preserve">Repeated source: Huang, J., et al. (2024). “Large Language Models Cannot Self-Correct Reasoning Yet.” Tr...</w:t>
-      </w:r>
-    </w:p>
-  </w:footnote>
-  <w:footnote w:id="56">
-    <w:p>
-      <w:r>
-        <w:t xml:space="preserve">Repeated source: Wynn, S., Satija, T., &amp;amp; Hadfield, G. (2025). “Talk Isn’t Always Cheap: Understandin...</w:t>
-      </w:r>
-    </w:p>
-  </w:footnote>
-  <w:footnote w:id="57">
     <w:p>
       <w:pPr>
         <w:pStyle w:val="FootnoteText"/>
@@ -10970,7 +11199,60 @@
       </w:r>
       <w:r>
         <w:rPr/>
-        <w:t>OWASP Foundation. “OWASP Top 10 for Large Language Model Applications 2025.” Open Worldwide Application Security Project, 12 March 2025. URL: https://owasp.org/www-project-top-10-for-large-language-model-applications/ · snapshotted 2026-05-18.</w:t>
+        <w:t xml:space="preserve">Zhang, </w:t>
+      </w:r>
+      <w:r>
+        <w:rPr>
+          <w:i/>
+          <w:iCs/>
+        </w:rPr>
+        <w:t>et al.</w:t>
+      </w:r>
+      <w:r>
+        <w:rPr/>
+        <w:t xml:space="preserve"> (2025). “Stop Overvaluing Multi-Agent Debate: A Systematic Re-examination.” arXiv 2502.08788. Five debate methods, nine benchmarks, four foundational models; multi-agent debate “often fail[s] to outperform simple single-agent baselines such as Chain-of-Thought and Self-Consistency.” Model heterogeneity identified as the “universal antidote.” URL: https://arxiv.org/abs/2502.08788 · snapshotted 2026-05-18.</w:t>
+      </w:r>
+    </w:p>
+  </w:footnote>
+  <w:footnote w:id="56">
+    <w:p>
+      <w:pPr>
+        <w:pStyle w:val="FootnoteText"/>
+      </w:pPr>
+      <w:r>
+        <w:rPr>
+          <w:rStyle w:val="FootnoteCharacters"/>
+        </w:rPr>
+        <w:footnoteRef/>
+      </w:r>
+      <w:r>
+        <w:rPr/>
+        <w:t xml:space="preserve"> </w:t>
+      </w:r>
+      <w:r>
+        <w:rPr/>
+        <w:t xml:space="preserve">As cited above: Huang, J., et al. (2024). “Large Language Models Cannot Self-Correct Reasoning Yet.” Transactions of the Association for Computational Linguistics…</w:t>
+      </w:r>
+    </w:p>
+  </w:footnote>
+  <w:footnote w:id="57">
+    <w:p>
+      <w:pPr>
+        <w:pStyle w:val="FootnoteText"/>
+      </w:pPr>
+      <w:r>
+        <w:rPr>
+          <w:rStyle w:val="FootnoteCharacters"/>
+        </w:rPr>
+        <w:footnoteRef/>
+      </w:r>
+      <w:r>
+        <w:rPr/>
+        <w:t xml:space="preserve"> </w:t>
+      </w:r>
+      <w:r>
+        <w:rPr/>
+        <w:t xml:space="preserve">As cited above: Wynn, S., Satija, T., &amp;amp; Hadfield, G. (2025). “Talk Isn’t Always Cheap: Understanding Failure Modes in Multi-Agent Debate.” arXiv 2509.05396…</w:t>
       </w:r>
     </w:p>
   </w:footnote>
@@ -10996,18 +11278,11 @@
       </w:r>
       <w:r>
         <w:rPr/>
-        <w:t>National Institute of Standards and Technology. “Artificial Intelligence Risk Management Framework: Generative AI Profile” (NIST AI 600-1). 26 July 2024. URL: https://www.nist.gov/itl/ai-risk-management-framework · snapshotted 2026-05-18.</w:t>
+        <w:t>OWASP Foundation. “OWASP Top 10 for Large Language Model Applications 2025.” Open Worldwide Application Security Project, 12 March 2025. URL: https://owasp.org/www-project-top-10-for-large-language-model-applications/ · snapshotted 2026-05-18.</w:t>
       </w:r>
     </w:p>
   </w:footnote>
   <w:footnote w:id="59">
-    <w:p>
-      <w:r>
-        <w:t xml:space="preserve">Repeated source: Regulation (EU) 2024/1689 of the European Parliament and of the Council of 13 June 2024...</w:t>
-      </w:r>
-    </w:p>
-  </w:footnote>
-  <w:footnote w:id="60">
     <w:p>
       <w:pPr>
         <w:pStyle w:val="FootnoteText"/>
@@ -11029,18 +11304,32 @@
       </w:r>
       <w:r>
         <w:rPr/>
-        <w:t>Privacy and Other Legislation Amendment Act 2024 (Cth), Royal Assent 10 December 2024. Automated-decision-making transparency obligations under amended Privacy Act 1988 (Cth) commence 10 December 2026. URL: https://www.legislation.gov.au/C2024A00133/asmade · snapshotted 2026-05-18.</w:t>
+        <w:t>National Institute of Standards and Technology. “Artificial Intelligence Risk Management Framework: Generative AI Profile” (NIST AI 600-1). 26 July 2024. URL: https://www.nist.gov/itl/ai-risk-management-framework · snapshotted 2026-05-18.</w:t>
+      </w:r>
+    </w:p>
+  </w:footnote>
+  <w:footnote w:id="60">
+    <w:p>
+      <w:pPr>
+        <w:pStyle w:val="FootnoteText"/>
+      </w:pPr>
+      <w:r>
+        <w:rPr>
+          <w:rStyle w:val="FootnoteCharacters"/>
+        </w:rPr>
+        <w:footnoteRef/>
+      </w:r>
+      <w:r>
+        <w:rPr/>
+        <w:t xml:space="preserve"> </w:t>
+      </w:r>
+      <w:r>
+        <w:rPr/>
+        <w:t xml:space="preserve">As cited above: Regulation (EU) 2024/1689 of the European Parliament and of the Council of 13 June 2024 laying down harmonised rules on artificial intelligence (AI…</w:t>
       </w:r>
     </w:p>
   </w:footnote>
   <w:footnote w:id="61">
-    <w:p>
-      <w:r>
-        <w:t xml:space="preserve">Repeated source: Synthesised across the fourteen-entry national-funder dossier; see research/dossier_01_...</w:t>
-      </w:r>
-    </w:p>
-  </w:footnote>
-  <w:footnote w:id="62">
     <w:p>
       <w:pPr>
         <w:pStyle w:val="FootnoteText"/>
@@ -11062,7 +11351,28 @@
       </w:r>
       <w:r>
         <w:rPr/>
-        <w:t>National Institutes of Health, “Apply Responsibly: Policy on AI Use in NIH Research Applications and Limiting Submissions Per PI” (NOT-OD-25-132), mid-2025. URL: https://grants.nih.gov/news-events/nih-extramural-nexus-news/2025/07/apply-responsibly-policy-on-ai-use-in-nih-research-applications-and-limiting-submissions-per-pi · snapshotted 2026-05-18.</w:t>
+        <w:t>Privacy and Other Legislation Amendment Act 2024 (Cth), Royal Assent 10 December 2024. Automated-decision-making transparency obligations under amended Privacy Act 1988 (Cth) commence 10 December 2026. URL: https://www.legislation.gov.au/C2024A00133/asmade · snapshotted 2026-05-18.</w:t>
+      </w:r>
+    </w:p>
+  </w:footnote>
+  <w:footnote w:id="62">
+    <w:p>
+      <w:pPr>
+        <w:pStyle w:val="FootnoteText"/>
+      </w:pPr>
+      <w:r>
+        <w:rPr>
+          <w:rStyle w:val="FootnoteCharacters"/>
+        </w:rPr>
+        <w:footnoteRef/>
+      </w:r>
+      <w:r>
+        <w:rPr/>
+        <w:t xml:space="preserve"> </w:t>
+      </w:r>
+      <w:r>
+        <w:rPr/>
+        <w:t xml:space="preserve">As cited above: Synthesised across the fourteen-entry national-funder dossier; see research/dossier_01_national_funders.md.</w:t>
       </w:r>
     </w:p>
   </w:footnote>
@@ -11088,7 +11398,7 @@
       </w:r>
       <w:r>
         <w:rPr/>
-        <w:t>Swedish Research Council (Vetenskapsrådet), “Guidelines for the use of AI tools.” Updated 28 August 2024. URL: https://www.vr.se/english/applying-for-funding/applying-for-a-grant/guidelines-for-the-use-of-ai-tools.html · snapshotted 2026-05-18.</w:t>
+        <w:t>National Institutes of Health, “Apply Responsibly: Policy on AI Use in NIH Research Applications and Limiting Submissions Per PI” (NOT-OD-25-132), mid-2025. URL: https://grants.nih.gov/news-events/nih-extramural-nexus-news/2025/07/apply-responsibly-policy-on-ai-use-in-nih-research-applications-and-limiting-submissions-per-pi · snapshotted 2026-05-18.</w:t>
       </w:r>
     </w:p>
   </w:footnote>
@@ -11114,147 +11424,453 @@
       </w:r>
       <w:r>
         <w:rPr/>
-        <w:t>UK Research and Innovation, “UKRI AI Research and Innovation Strategic Framework.” 19 February 2026. URL: https://www.ukri.org/publications/ukri-artificial-intelligence-research-and-innovation-strategic-framework/ukri-ai-research-and-innovation-strategic-framework/ · snapshotted 2026-05-18.</w:t>
+        <w:t>Swedish Research Council (Vetenskapsrådet), “Guidelines for the use of AI tools.” Updated 28 August 2024. URL: https://www.vr.se/english/applying-for-funding/applying-for-a-grant/guidelines-for-the-use-of-ai-tools.html · snapshotted 2026-05-18.</w:t>
       </w:r>
     </w:p>
   </w:footnote>
   <w:footnote w:id="65">
     <w:p>
-      <w:r>
-        <w:t xml:space="preserve">Repeated source: Synthesised across the fourteen-entry national-funder dossier; see research/dossier_01_...</w:t>
+      <w:pPr>
+        <w:pStyle w:val="FootnoteText"/>
+        <w:widowControl/>
+        <w:bidi w:val="0"/>
+        <w:spacing w:lineRule="auto" w:line="312" w:before="0" w:after="80"/>
+        <w:jc w:val="start"/>
+        <w:rPr/>
+      </w:pPr>
+      <w:r>
+        <w:rPr>
+          <w:rStyle w:val="FootnoteCharacters"/>
+        </w:rPr>
+        <w:footnoteRef/>
+      </w:r>
+      <w:r>
+        <w:rPr/>
+        <w:t xml:space="preserve"> </w:t>
+      </w:r>
+      <w:r>
+        <w:rPr/>
+        <w:t>UK Research and Innovation, “UKRI AI Research and Innovation Strategic Framework.” 19 February 2026. URL: https://www.ukri.org/publications/ukri-artificial-intelligence-research-and-innovation-strategic-framework/ukri-ai-research-and-innovation-strategic-framework/ · snapshotted 2026-05-18.</w:t>
       </w:r>
     </w:p>
   </w:footnote>
   <w:footnote w:id="66">
     <w:p>
-      <w:r>
-        <w:t xml:space="preserve">Repeated source: Thirty-eight-university sample with class breakdown A=4, B=11, C=17, D=6 (Total 38) per...</w:t>
+      <w:pPr>
+        <w:pStyle w:val="FootnoteText"/>
+      </w:pPr>
+      <w:r>
+        <w:rPr>
+          <w:rStyle w:val="FootnoteCharacters"/>
+        </w:rPr>
+        <w:footnoteRef/>
+      </w:r>
+      <w:r>
+        <w:rPr/>
+        <w:t xml:space="preserve"> </w:t>
+      </w:r>
+      <w:r>
+        <w:rPr/>
+        <w:t xml:space="preserve">As cited above: Synthesised across the fourteen-entry national-funder dossier; see research/dossier_01_national_funders.md.</w:t>
       </w:r>
     </w:p>
   </w:footnote>
   <w:footnote w:id="67">
     <w:p>
-      <w:r>
-        <w:t xml:space="preserve">Repeated source: Class D institutional documents: - UCL Doctoral School, “Transparency on Authorship and...</w:t>
+      <w:pPr>
+        <w:pStyle w:val="FootnoteText"/>
+      </w:pPr>
+      <w:r>
+        <w:rPr>
+          <w:rStyle w:val="FootnoteCharacters"/>
+        </w:rPr>
+        <w:footnoteRef/>
+      </w:r>
+      <w:r>
+        <w:rPr/>
+        <w:t xml:space="preserve"> </w:t>
+      </w:r>
+      <w:r>
+        <w:rPr/>
+        <w:t xml:space="preserve">As cited above: Thirty-eight-university sample; class distribution A=4, B=11, C=17, D=6 (38 total), from the per-institution policy classifications in the…</w:t>
       </w:r>
     </w:p>
   </w:footnote>
   <w:footnote w:id="68">
     <w:p>
-      <w:r>
-        <w:t xml:space="preserve">Repeated source: Class D institutional documents: - UCL Doctoral School, “Transparency on Authorship and...</w:t>
+      <w:pPr>
+        <w:pStyle w:val="FootnoteText"/>
+      </w:pPr>
+      <w:r>
+        <w:rPr>
+          <w:rStyle w:val="FootnoteCharacters"/>
+        </w:rPr>
+        <w:footnoteRef/>
+      </w:r>
+      <w:r>
+        <w:rPr/>
+        <w:t xml:space="preserve"> </w:t>
+      </w:r>
+      <w:r>
+        <w:rPr/>
+        <w:t xml:space="preserve">As cited above: Class D institutional documents: - UCL Doctoral School, “Transparency on Authorship and Generative AI in Doctoral Research.” URL…</w:t>
       </w:r>
     </w:p>
   </w:footnote>
   <w:footnote w:id="69">
     <w:p>
-      <w:r>
-        <w:t xml:space="preserve">Repeated source: Synthesised across the eighteen-entry publisher dossier; see research/dossier_04_publis...</w:t>
+      <w:pPr>
+        <w:pStyle w:val="FootnoteText"/>
+      </w:pPr>
+      <w:r>
+        <w:rPr>
+          <w:rStyle w:val="FootnoteCharacters"/>
+        </w:rPr>
+        <w:footnoteRef/>
+      </w:r>
+      <w:r>
+        <w:rPr/>
+        <w:t xml:space="preserve"> </w:t>
+      </w:r>
+      <w:r>
+        <w:rPr/>
+        <w:t xml:space="preserve">As cited above: Class D institutional documents: - UCL Doctoral School, “Transparency on Authorship and Generative AI in Doctoral Research.” URL…</w:t>
       </w:r>
     </w:p>
   </w:footnote>
   <w:footnote w:id="70">
     <w:p>
-      <w:r>
-        <w:t xml:space="preserve">Repeated source: Synthesised across the eighteen-entry publisher dossier; see research/dossier_04_publis...</w:t>
+      <w:pPr>
+        <w:pStyle w:val="FootnoteText"/>
+      </w:pPr>
+      <w:r>
+        <w:rPr>
+          <w:rStyle w:val="FootnoteCharacters"/>
+        </w:rPr>
+        <w:footnoteRef/>
+      </w:r>
+      <w:r>
+        <w:rPr/>
+        <w:t xml:space="preserve"> </w:t>
+      </w:r>
+      <w:r>
+        <w:rPr/>
+        <w:t xml:space="preserve">As cited above: Synthesised across the eighteen-entry publisher-policy dossier (research/dossier_04_publisher_policies.md).</w:t>
       </w:r>
     </w:p>
   </w:footnote>
   <w:footnote w:id="71">
     <w:p>
-      <w:r>
-        <w:t xml:space="preserve">Repeated source: BMJ Author Hub, “AI policy and submission form disclosure,” April 2024; 2025 Peer Revie...</w:t>
+      <w:pPr>
+        <w:pStyle w:val="FootnoteText"/>
+      </w:pPr>
+      <w:r>
+        <w:rPr>
+          <w:rStyle w:val="FootnoteCharacters"/>
+        </w:rPr>
+        <w:footnoteRef/>
+      </w:r>
+      <w:r>
+        <w:rPr/>
+        <w:t xml:space="preserve"> </w:t>
+      </w:r>
+      <w:r>
+        <w:rPr/>
+        <w:t xml:space="preserve">As cited above: Synthesised across the eighteen-entry publisher-policy dossier (research/dossier_04_publisher_policies.md).</w:t>
       </w:r>
     </w:p>
   </w:footnote>
   <w:footnote w:id="72">
     <w:p>
-      <w:r>
-        <w:t xml:space="preserve">Repeated source: Synthesised across the thirteen-entry competency-frameworks dossier covering UNESCO AI...</w:t>
+      <w:pPr>
+        <w:pStyle w:val="FootnoteText"/>
+      </w:pPr>
+      <w:r>
+        <w:rPr>
+          <w:rStyle w:val="FootnoteCharacters"/>
+        </w:rPr>
+        <w:footnoteRef/>
+      </w:r>
+      <w:r>
+        <w:rPr/>
+        <w:t xml:space="preserve"> </w:t>
+      </w:r>
+      <w:r>
+        <w:rPr/>
+        <w:t xml:space="preserve">As cited above: BMJ Author Hub, “AI policy and submission form disclosure,” April 2024; 2025 Peer Review Congress disclosure-rate report. URL…</w:t>
       </w:r>
     </w:p>
   </w:footnote>
   <w:footnote w:id="73">
     <w:p>
-      <w:r>
-        <w:t xml:space="preserve">Repeated source: Synthesised across the thirteen-entry competency-frameworks dossier covering UNESCO AI...</w:t>
+      <w:pPr>
+        <w:pStyle w:val="FootnoteText"/>
+      </w:pPr>
+      <w:r>
+        <w:rPr>
+          <w:rStyle w:val="FootnoteCharacters"/>
+        </w:rPr>
+        <w:footnoteRef/>
+      </w:r>
+      <w:r>
+        <w:rPr/>
+        <w:t xml:space="preserve"> </w:t>
+      </w:r>
+      <w:r>
+        <w:rPr/>
+        <w:t xml:space="preserve">As cited above: Synthesised across the thirteen-entry competency-frameworks dossier covering UNESCO AI Competency Frameworks for Students and Teachers, the OECD-EC…</w:t>
       </w:r>
     </w:p>
   </w:footnote>
   <w:footnote w:id="74">
     <w:p>
-      <w:r>
-        <w:t xml:space="preserve">Repeated source: UK Research and Innovation, “UKRI AI Research and Innovation Strategic Framework.” 19 F...</w:t>
+      <w:pPr>
+        <w:pStyle w:val="FootnoteText"/>
+      </w:pPr>
+      <w:r>
+        <w:rPr>
+          <w:rStyle w:val="FootnoteCharacters"/>
+        </w:rPr>
+        <w:footnoteRef/>
+      </w:r>
+      <w:r>
+        <w:rPr/>
+        <w:t xml:space="preserve"> </w:t>
+      </w:r>
+      <w:r>
+        <w:rPr/>
+        <w:t xml:space="preserve">As cited above: Synthesised across the thirteen-entry competency-frameworks dossier covering UNESCO AI Competency Frameworks for Students and Teachers, the OECD-EC…</w:t>
       </w:r>
     </w:p>
   </w:footnote>
   <w:footnote w:id="75">
     <w:p>
-      <w:r>
-        <w:t xml:space="preserve">Repeated source: National Institutes of Health, “Apply Responsibly: Policy on AI Use in NIH Research App...</w:t>
+      <w:pPr>
+        <w:pStyle w:val="FootnoteText"/>
+      </w:pPr>
+      <w:r>
+        <w:rPr>
+          <w:rStyle w:val="FootnoteCharacters"/>
+        </w:rPr>
+        <w:footnoteRef/>
+      </w:r>
+      <w:r>
+        <w:rPr/>
+        <w:t xml:space="preserve"> </w:t>
+      </w:r>
+      <w:r>
+        <w:rPr/>
+        <w:t xml:space="preserve">As cited above: UK Research and Innovation, “UKRI AI Research and Innovation Strategic Framework.” 19 February 2026. URL…</w:t>
       </w:r>
     </w:p>
   </w:footnote>
   <w:footnote w:id="76">
     <w:p>
-      <w:r>
-        <w:t xml:space="preserve">Repeated source: ARC / NHMRC, joint policy on the use of generative AI in grant applications and assessm...</w:t>
+      <w:pPr>
+        <w:pStyle w:val="FootnoteText"/>
+      </w:pPr>
+      <w:r>
+        <w:rPr>
+          <w:rStyle w:val="FootnoteCharacters"/>
+        </w:rPr>
+        <w:footnoteRef/>
+      </w:r>
+      <w:r>
+        <w:rPr/>
+        <w:t xml:space="preserve"> </w:t>
+      </w:r>
+      <w:r>
+        <w:rPr/>
+        <w:t xml:space="preserve">As cited above: National Institutes of Health, “Apply Responsibly: Policy on AI Use in NIH Research Applications and Limiting Submissions Per PI” (NOT-OD-25-132)…</w:t>
       </w:r>
     </w:p>
   </w:footnote>
   <w:footnote w:id="77">
     <w:p>
-      <w:r>
-        <w:t xml:space="preserve">Repeated source: Deutsche Forschungsgemeinschaft, Executive Committee statement on the use of generative...</w:t>
+      <w:pPr>
+        <w:pStyle w:val="FootnoteText"/>
+      </w:pPr>
+      <w:r>
+        <w:rPr>
+          <w:rStyle w:val="FootnoteCharacters"/>
+        </w:rPr>
+        <w:footnoteRef/>
+      </w:r>
+      <w:r>
+        <w:rPr/>
+        <w:t xml:space="preserve"> </w:t>
+      </w:r>
+      <w:r>
+        <w:rPr/>
+        <w:t xml:space="preserve">As cited above: ARC / NHMRC, joint policy on the use of generative AI in grant applications and assessment, effective 28 April 2026. URLs…</w:t>
       </w:r>
     </w:p>
   </w:footnote>
   <w:footnote w:id="78">
     <w:p>
-      <w:r>
-        <w:t xml:space="preserve">Repeated source: Synthesised across the fourteen-entry national-funder dossier; see research/dossier_01_...</w:t>
+      <w:pPr>
+        <w:pStyle w:val="FootnoteText"/>
+      </w:pPr>
+      <w:r>
+        <w:rPr>
+          <w:rStyle w:val="FootnoteCharacters"/>
+        </w:rPr>
+        <w:footnoteRef/>
+      </w:r>
+      <w:r>
+        <w:rPr/>
+        <w:t xml:space="preserve"> </w:t>
+      </w:r>
+      <w:r>
+        <w:rPr/>
+        <w:t xml:space="preserve">As cited above: Deutsche Forschungsgemeinschaft, Executive Committee statement on the use of generative models in research, 21 September 2023. URL…</w:t>
       </w:r>
     </w:p>
   </w:footnote>
   <w:footnote w:id="79">
     <w:p>
-      <w:r>
-        <w:t xml:space="preserve">Repeated source: European Data Protection Board, Opinion 28/2024 on certain data protection aspects rela...</w:t>
+      <w:pPr>
+        <w:pStyle w:val="FootnoteText"/>
+      </w:pPr>
+      <w:r>
+        <w:rPr>
+          <w:rStyle w:val="FootnoteCharacters"/>
+        </w:rPr>
+        <w:footnoteRef/>
+      </w:r>
+      <w:r>
+        <w:rPr/>
+        <w:t xml:space="preserve"> </w:t>
+      </w:r>
+      <w:r>
+        <w:rPr/>
+        <w:t xml:space="preserve">As cited above: Synthesised across the fourteen-entry national-funder dossier; see research/dossier_01_national_funders.md.</w:t>
       </w:r>
     </w:p>
   </w:footnote>
   <w:footnote w:id="80">
     <w:p>
-      <w:r>
-        <w:t xml:space="preserve">Repeated source: Commission Nationale de l’Informatique et des Libertés (CNIL). “AI system development:...</w:t>
+      <w:pPr>
+        <w:pStyle w:val="FootnoteText"/>
+      </w:pPr>
+      <w:r>
+        <w:rPr>
+          <w:rStyle w:val="FootnoteCharacters"/>
+        </w:rPr>
+        <w:footnoteRef/>
+      </w:r>
+      <w:r>
+        <w:rPr/>
+        <w:t xml:space="preserve"> </w:t>
+      </w:r>
+      <w:r>
+        <w:rPr/>
+        <w:t xml:space="preserve">As cited above: European Data Protection Board, Opinion 28/2024 on certain data protection aspects related to the processing of personal data in the context of AI…</w:t>
       </w:r>
     </w:p>
   </w:footnote>
   <w:footnote w:id="81">
     <w:p>
-      <w:r>
-        <w:t xml:space="preserve">Repeated source: Regulation (EU) 2024/1689 of the European Parliament and of the Council of 13 June 2024...</w:t>
+      <w:pPr>
+        <w:pStyle w:val="FootnoteText"/>
+      </w:pPr>
+      <w:r>
+        <w:rPr>
+          <w:rStyle w:val="FootnoteCharacters"/>
+        </w:rPr>
+        <w:footnoteRef/>
+      </w:r>
+      <w:r>
+        <w:rPr/>
+        <w:t xml:space="preserve"> </w:t>
+      </w:r>
+      <w:r>
+        <w:rPr/>
+        <w:t xml:space="preserve">As cited above: Commission Nationale de l’Informatique et des Libertés (CNIL). “AI system development: CNIL’s recommendations to comply with the GDPR.” 19 June 2025…</w:t>
       </w:r>
     </w:p>
   </w:footnote>
   <w:footnote w:id="82">
     <w:p>
-      <w:r>
-        <w:t xml:space="preserve">Repeated source: Synthesised across the fourteen-entry national-funder dossier; see research/dossier_01_...</w:t>
+      <w:pPr>
+        <w:pStyle w:val="FootnoteText"/>
+      </w:pPr>
+      <w:r>
+        <w:rPr>
+          <w:rStyle w:val="FootnoteCharacters"/>
+        </w:rPr>
+        <w:footnoteRef/>
+      </w:r>
+      <w:r>
+        <w:rPr/>
+        <w:t xml:space="preserve"> </w:t>
+      </w:r>
+      <w:r>
+        <w:rPr/>
+        <w:t xml:space="preserve">As cited above: Regulation (EU) 2024/1689 of the European Parliament and of the Council of 13 June 2024 laying down harmonised rules on artificial intelligence (AI…</w:t>
       </w:r>
     </w:p>
   </w:footnote>
   <w:footnote w:id="83">
     <w:p>
-      <w:r>
-        <w:t xml:space="preserve">Repeated source: Synthesised across the fourteen-entry national-funder dossier; see research/dossier_01_...</w:t>
+      <w:pPr>
+        <w:pStyle w:val="FootnoteText"/>
+      </w:pPr>
+      <w:r>
+        <w:rPr>
+          <w:rStyle w:val="FootnoteCharacters"/>
+        </w:rPr>
+        <w:footnoteRef/>
+      </w:r>
+      <w:r>
+        <w:rPr/>
+        <w:t xml:space="preserve"> </w:t>
+      </w:r>
+      <w:r>
+        <w:rPr/>
+        <w:t xml:space="preserve">As cited above: Synthesised across the fourteen-entry national-funder dossier; see research/dossier_01_national_funders.md.</w:t>
       </w:r>
     </w:p>
   </w:footnote>
   <w:footnote w:id="84">
     <w:p>
-      <w:r>
-        <w:t xml:space="preserve">Repeated source: Synthesised across the fourteen-entry national-funder dossier; see research/dossier_01_...</w:t>
+      <w:pPr>
+        <w:pStyle w:val="FootnoteText"/>
+      </w:pPr>
+      <w:r>
+        <w:rPr>
+          <w:rStyle w:val="FootnoteCharacters"/>
+        </w:rPr>
+        <w:footnoteRef/>
+      </w:r>
+      <w:r>
+        <w:rPr/>
+        <w:t xml:space="preserve"> </w:t>
+      </w:r>
+      <w:r>
+        <w:rPr/>
+        <w:t xml:space="preserve">As cited above: Synthesised across the fourteen-entry national-funder dossier; see research/dossier_01_national_funders.md.</w:t>
+      </w:r>
+    </w:p>
+  </w:footnote>
+  <w:footnote w:id="85">
+    <w:p>
+      <w:pPr>
+        <w:pStyle w:val="FootnoteText"/>
+      </w:pPr>
+      <w:r>
+        <w:rPr>
+          <w:rStyle w:val="FootnoteCharacters"/>
+        </w:rPr>
+        <w:footnoteRef/>
+      </w:r>
+      <w:r>
+        <w:rPr/>
+        <w:t xml:space="preserve"> </w:t>
+      </w:r>
+      <w:r>
+        <w:rPr/>
+        <w:t xml:space="preserve">As cited above: Synthesised across the fourteen-entry national-funder dossier; see research/dossier_01_national_funders.md.</w:t>
       </w:r>
     </w:p>
   </w:footnote>
@@ -15456,7 +16072,7 @@
       <w:rFonts w:ascii="Source Serif 4" w:hAnsi="Source Serif 4" w:eastAsia="ＭＳ 明朝" w:cs=""/>
       <w:color w:val="212529"/>
       <w:kern w:val="0"/>
-      <w:sz w:val="22"/>
+      <w:sz w:val="24"/>
       <w:szCs w:val="22"/>
       <w:lang w:val="en-US" w:eastAsia="en-US" w:bidi="ar-SA"/>
     </w:rPr>
@@ -15474,7 +16090,7 @@
       <w:rFonts w:ascii="Source Serif 4" w:hAnsi="Source Serif 4" w:eastAsia="ＭＳ 明朝" w:cs=""/>
       <w:color w:val="212529"/>
       <w:kern w:val="0"/>
-      <w:sz w:val="22"/>
+      <w:sz w:val="24"/>
       <w:szCs w:val="22"/>
       <w:lang w:val="en-US" w:eastAsia="en-US" w:bidi="ar-SA"/>
     </w:rPr>
@@ -15493,7 +16109,7 @@
       <w:i/>
       <w:color w:val="212529"/>
       <w:kern w:val="0"/>
-      <w:sz w:val="22"/>
+      <w:sz w:val="24"/>
       <w:szCs w:val="22"/>
       <w:lang w:val="en-US" w:eastAsia="en-US" w:bidi="ar-SA"/>
     </w:rPr>

</xml_diff>

<commit_message>
rebuild: PDF superscript line-gaps + heading/colophon type sizes (engine v0.22.46)
Rebuilds final/ + docs/ with general-repo v0.22.46: PDF citation superscripts no
longer expand the line box (even line spacing) and stay clickable; PDF heading
sizes match the DOCX (14pt major headings, 12pt homogeneous body + sub-headings);
the colophon is 10pt fine print in both the PDF and the DOCX.

Co-Authored-By: Claude Opus 4.8 (1M context) <noreply@anthropic.com>
</commit_message>
<xml_diff>
--- a/docs/Instats - Responsible AI in Academic Research.docx
+++ b/docs/Instats - Responsible AI in Academic Research.docx
@@ -126,7 +126,7 @@
     </w:p>
     <w:p>
       <w:pPr>
-        <w:pStyle w:val="BodyText"/>
+        <w:pStyle w:val="InstatsColophon"/>
         <w:rPr/>
       </w:pPr>
       <w:r>
@@ -178,7 +178,7 @@
     </w:p>
     <w:p>
       <w:pPr>
-        <w:pStyle w:val="BodyText"/>
+        <w:pStyle w:val="InstatsColophon"/>
         <w:rPr/>
       </w:pPr>
       <w:r>
@@ -287,7 +287,7 @@
     </w:p>
     <w:p>
       <w:pPr>
-        <w:pStyle w:val="BodyText"/>
+        <w:pStyle w:val="InstatsColophon"/>
         <w:rPr/>
       </w:pPr>
       <w:r>
@@ -16034,6 +16034,23 @@
       <w:lang w:val="en-US" w:eastAsia="en-US" w:bidi="ar-SA"/>
     </w:rPr>
   </w:style>
+  <w:style w:type="paragraph" w:styleId="InstatsColophon" w:customStyle="1">
+    <w:name w:val="InstatsColophon"/>
+    <w:basedOn w:val="Normal"/>
+    <w:qFormat/>
+    <w:pPr>
+      <w:pBdr>
+        <w:left w:val="single" w:sz="24" w:space="10" w:color="3092B1"/>
+      </w:pBdr>
+      <w:spacing w:lineRule="auto" w:line="336" w:before="80" w:after="160"/>
+      <w:ind w:start="283"/>
+    </w:pPr>
+    <w:rPr>
+      <w:rFonts w:ascii="Inter" w:hAnsi="Inter"/>
+      <w:color w:val="495057"/>
+      <w:sz w:val="20"/>
+    </w:rPr>
+  </w:style>
   <w:style w:type="paragraph" w:styleId="InstatsExecBand" w:customStyle="1">
     <w:name w:val="InstatsExecBand"/>
     <w:basedOn w:val="Normal"/>

</xml_diff>

<commit_message>
report: reword §2.2 heading + fix its TOC link
Reword the §2.2 heading to "Responsible use across the four AI-use modes"
(folds the four-modes signpost into the title without a parenthetical,
consistent with the other dimension headings). Update the manual TOC entry's
text and anchor to match — restoring the §2.2 TOC link, which broke when the
earlier parenthetical changed the heading's auto-id but not the hardcoded TOC
href. Lead-author's updated report.docx (table colour + row/bottom lines +
matching heading/TOC) used verbatim; docs/ Pages site regenerated.

Co-Authored-By: Claude Opus 4.8 (1M context) <noreply@anthropic.com>
</commit_message>
<xml_diff>
--- a/docs/Instats - Responsible AI in Academic Research.docx
+++ b/docs/Instats - Responsible AI in Academic Research.docx
@@ -730,7 +730,25 @@
           <w:rPr>
             <w:rStyle w:val="Hyperlink1"/>
           </w:rPr>
-          <w:t>2.2   Dimension 2 — Responsible use in practice</w:t>
+          <w:t xml:space="preserve">2.2   Dimension 2 — </w:t>
+        </w:r>
+        <w:r>
+          <w:rPr>
+            <w:rStyle w:val="Hyperlink1"/>
+          </w:rPr>
+          <w:t xml:space="preserve">Responsible use across the four AI-use </w:t>
+        </w:r>
+        <w:r>
+          <w:rPr>
+            <w:rStyle w:val="Hyperlink1"/>
+          </w:rPr>
+          <w:t>m</w:t>
+        </w:r>
+        <w:r>
+          <w:rPr>
+            <w:rStyle w:val="Hyperlink1"/>
+          </w:rPr>
+          <w:t>odes</w:t>
         </w:r>
       </w:hyperlink>
     </w:p>
@@ -2789,13 +2807,10 @@
       </w:pPr>
       <w:bookmarkStart w:id="23" w:name="dimension-2-responsible-use-in-practice"/>
       <w:r>
-        <w:t>2.2 Dimension 2 — Responsible use in practice</w:t>
-      </w:r>
-      <w:r>
-        <w:t xml:space="preserve"> (</w:t>
-      </w:r>
-      <w:r>
-        <w:t>four AI-use modes)</w:t>
+        <w:t xml:space="preserve">2.2 Dimension 2 — </w:t>
+      </w:r>
+      <w:r>
+        <w:t>Responsible use across the four AI-use modes</w:t>
       </w:r>
     </w:p>
     <w:p>

</xml_diff>